<commit_message>
Add a priori Sample size and power subsection to Methods
Documents the pre-specified power analysis from the 5/17/2026 protocol email
to the study team: 800-call budget, rural-vs-urban wait as primary contrast,
empirically-anchored assumptions (phi=1.7, ICC=0.08 from 273 pooled rural ENT
observations across two prior series), >99% power for the 8-day gap, ~6-day MDE
at 90% power, 20% non-response buffer -> ~98%, natural 15% rural -> 83%. Notes
that the realized dispersion (phi=6.22) exceeded plan and points to Limitations
for the achieved-power reconciliation. Adds two placeholder bib keys
(Corbisiero, Saeedi) for the anchoring studies to complete before submission.

Co-Authored-By: Claude Opus 4.8 (1M context) <noreply@anthropic.com>
</commit_message>
<xml_diff>
--- a/manuscript_output/manuscript_mystery_caller.docx
+++ b/manuscript_output/manuscript_mystery_caller.docx
@@ -282,7 +282,7 @@
       </w:r>
     </w:p>
     <w:bookmarkEnd w:id="21"/>
-    <w:bookmarkStart w:id="26" w:name="methods"/>
+    <w:bookmarkStart w:id="27" w:name="methods"/>
     <w:p>
       <w:pPr>
         <w:pStyle w:val="Heading2"/>
@@ -624,8 +624,82 @@
       </w:r>
     </w:p>
     <w:bookmarkEnd w:id="25"/>
+    <w:bookmarkStart w:id="26" w:name="sample-size-and-power"/>
+    <w:p>
+      <w:pPr>
+        <w:pStyle w:val="Heading3"/>
+      </w:pPr>
+      <w:r>
+        <w:t xml:space="preserve">Sample size and power</w:t>
+      </w:r>
+    </w:p>
+    <w:p>
+      <w:pPr>
+        <w:pStyle w:val="FirstParagraph"/>
+      </w:pPr>
+      <w:r>
+        <w:t xml:space="preserve">The sample size was fixed</w:t>
+      </w:r>
+      <w:r>
+        <w:t xml:space="preserve"> </w:t>
+      </w:r>
+      <w:r>
+        <w:rPr>
+          <w:i/>
+          <w:iCs/>
+        </w:rPr>
+        <w:t xml:space="preserve">a priori</w:t>
+      </w:r>
+      <w:r>
+        <w:t xml:space="preserve"> </w:t>
+      </w:r>
+      <w:r>
+        <w:t xml:space="preserve">by a call budget of 800, with the rural-versus-urban difference in business-day wait time as the primary contrast. The power analysis was pre-specified before data collection and implemented in a purpose-built simulation application. Its assumptions were anchored to empirical data rather than convention: the expected rural wait penalty, the negative binomial dispersion (φ = 1.7), and the state-level intraclass correlation (ICC = 0.08) were estimated by pooling 273 rural otolaryngology observations from two published access series</w:t>
+      </w:r>
+      <w:hyperlink w:anchor="ref-PLACEHOLDER_corbisiero">
+        <w:r>
+          <w:rPr>
+            <w:rStyle w:val="Hyperlink"/>
+            <w:vertAlign w:val="superscript"/>
+          </w:rPr>
+          <w:t xml:space="preserve">9</w:t>
+        </w:r>
+      </w:hyperlink>
+      <w:r>
+        <w:rPr>
+          <w:vertAlign w:val="superscript"/>
+        </w:rPr>
+        <w:t xml:space="preserve">,</w:t>
+      </w:r>
+      <w:hyperlink w:anchor="ref-PLACEHOLDER_saeedi">
+        <w:r>
+          <w:rPr>
+            <w:rStyle w:val="Hyperlink"/>
+            <w:vertAlign w:val="superscript"/>
+          </w:rPr>
+          <w:t xml:space="preserve">10</w:t>
+        </w:r>
+      </w:hyperlink>
+      <w:r>
+        <w:t xml:space="preserve">. Under these assumptions and a two-sided α = 0.05, an 800-call budget provided greater than 99% power to detect the anticipated eight-business-day rural–urban gap; the minimum detectable difference at 90% power was approximately six business days. The design was robust to two realistic threats: after a 20% non-response buffer (analyzable n ≈ 640) power remained near 98%, and although a balanced 50/50 rural/urban allocation was optimal, sampling at the natural rural prevalence (~15%) still yielded 83% power. A balanced urban/rural allocation was therefore targeted. The realized dispersion (φ = 6.22) substantially exceeded the planned value, reducing achieved power relative to plan; the resulting reconciliation is reported in the</w:t>
+      </w:r>
+      <w:r>
+        <w:t xml:space="preserve"> </w:t>
+      </w:r>
+      <w:r>
+        <w:rPr>
+          <w:i/>
+          <w:iCs/>
+        </w:rPr>
+        <w:t xml:space="preserve">Limitations</w:t>
+      </w:r>
+      <w:r>
+        <w:t xml:space="preserve">.</w:t>
+      </w:r>
+    </w:p>
     <w:bookmarkEnd w:id="26"/>
-    <w:bookmarkStart w:id="31" w:name="results"/>
+    <w:bookmarkEnd w:id="27"/>
+    <w:bookmarkStart w:id="32" w:name="results"/>
     <w:p>
       <w:pPr>
         <w:pStyle w:val="Heading2"/>
@@ -634,7 +708,7 @@
         <w:t xml:space="preserve">Results</w:t>
       </w:r>
     </w:p>
-    <w:bookmarkStart w:id="27" w:name="sample-and-attrition"/>
+    <w:bookmarkStart w:id="28" w:name="sample-and-attrition"/>
     <w:p>
       <w:pPr>
         <w:pStyle w:val="Heading3"/>
@@ -7910,8 +7984,8 @@
         </w:tc>
       </w:tr>
     </w:tbl>
-    <w:bookmarkEnd w:id="27"/>
-    <w:bookmarkStart w:id="28" w:name="access-to-appointments"/>
+    <w:bookmarkEnd w:id="28"/>
+    <w:bookmarkStart w:id="29" w:name="access-to-appointments"/>
     <w:p>
       <w:pPr>
         <w:pStyle w:val="Heading3"/>
@@ -7938,8 +8012,8 @@
         <w:t xml:space="preserve">).</w:t>
       </w:r>
     </w:p>
-    <w:bookmarkEnd w:id="28"/>
-    <w:bookmarkStart w:id="29" w:name="timeliness-of-appointments"/>
+    <w:bookmarkEnd w:id="29"/>
+    <w:bookmarkStart w:id="30" w:name="timeliness-of-appointments"/>
     <w:p>
       <w:pPr>
         <w:pStyle w:val="Heading3"/>
@@ -12383,8 +12457,8 @@
         </w:tc>
       </w:tr>
     </w:tbl>
-    <w:bookmarkEnd w:id="29"/>
-    <w:bookmarkStart w:id="30" w:name="robustness-and-missing-data"/>
+    <w:bookmarkEnd w:id="30"/>
+    <w:bookmarkStart w:id="31" w:name="robustness-and-missing-data"/>
     <w:p>
       <w:pPr>
         <w:pStyle w:val="Heading3"/>
@@ -12401,9 +12475,9 @@
         <w:t xml:space="preserve">Under Tukey-adjusted pairwise comparison no subspecialty pair reached significance, and the subspecialty effect did not vary by rurality or supply (interaction likelihood-ratio tests, both non-significant). In a metropolitan sensitivity model, greater hospital-market concentration was associated with a borderline increase in wait time (HHI IRR 1.20 per SD; p = 0.058). Call incompleteness was unrelated to practice geography, supporting a missing-at-random mechanism with respect to location (Supplement).</w:t>
       </w:r>
     </w:p>
-    <w:bookmarkEnd w:id="30"/>
     <w:bookmarkEnd w:id="31"/>
-    <w:bookmarkStart w:id="32" w:name="discussion"/>
+    <w:bookmarkEnd w:id="32"/>
+    <w:bookmarkStart w:id="33" w:name="discussion"/>
     <w:p>
       <w:pPr>
         <w:pStyle w:val="Heading2"/>
@@ -12612,8 +12686,8 @@
         <w:t xml:space="preserve">In a national mystery-caller study, new-patient otolaryngology access was driven by the requested subspecialty rather than by local supply, insurance generosity, or social vulnerability, and the availability and timeliness of care diverged by subspecialty. Efforts to improve access should account for subspecialty-specific bottlenecks and should measure both whether patients can get in and how long they wait.</w:t>
       </w:r>
     </w:p>
-    <w:bookmarkEnd w:id="32"/>
-    <w:bookmarkStart w:id="39" w:name="figures"/>
+    <w:bookmarkEnd w:id="33"/>
+    <w:bookmarkStart w:id="40" w:name="figures"/>
     <w:p>
       <w:pPr>
         <w:pStyle w:val="Heading2"/>
@@ -12675,18 +12749,18 @@
           <wp:inline>
             <wp:extent cx="5334000" cy="6519333"/>
             <wp:effectExtent b="0" l="0" r="0" t="0"/>
-            <wp:docPr descr="Figure 1. Participant flow from calls placed to the two analytic samples." title="" id="34" name="Picture"/>
+            <wp:docPr descr="Figure 1. Participant flow from calls placed to the two analytic samples." title="" id="35" name="Picture"/>
             <a:graphic>
               <a:graphicData uri="http://schemas.openxmlformats.org/drawingml/2006/picture">
                 <pic:pic>
                   <pic:nvPicPr>
-                    <pic:cNvPr descr="model_output/strobe_flow_mysterycall.png" id="35" name="Picture"/>
+                    <pic:cNvPr descr="model_output/strobe_flow_mysterycall.png" id="36" name="Picture"/>
                     <pic:cNvPicPr>
                       <a:picLocks noChangeArrowheads="1" noChangeAspect="1"/>
                     </pic:cNvPicPr>
                   </pic:nvPicPr>
                   <pic:blipFill>
-                    <a:blip r:embed="rId33"/>
+                    <a:blip r:embed="rId34"/>
                     <a:stretch>
                       <a:fillRect/>
                     </a:stretch>
@@ -12742,18 +12816,18 @@
           <wp:inline>
             <wp:extent cx="5334000" cy="3200400"/>
             <wp:effectExtent b="0" l="0" r="0" t="0"/>
-            <wp:docPr descr="Figure 2. Adjusted access and timeliness effects." title="" id="37" name="Picture"/>
+            <wp:docPr descr="Figure 2. Adjusted access and timeliness effects." title="" id="38" name="Picture"/>
             <a:graphic>
               <a:graphicData uri="http://schemas.openxmlformats.org/drawingml/2006/picture">
                 <pic:pic>
                   <pic:nvPicPr>
-                    <pic:cNvPr descr="model_output/forest_access_timeliness.png" id="38" name="Picture"/>
+                    <pic:cNvPr descr="model_output/forest_access_timeliness.png" id="39" name="Picture"/>
                     <pic:cNvPicPr>
                       <a:picLocks noChangeArrowheads="1" noChangeAspect="1"/>
                     </pic:cNvPicPr>
                   </pic:nvPicPr>
                   <pic:blipFill>
-                    <a:blip r:embed="rId36"/>
+                    <a:blip r:embed="rId37"/>
                     <a:stretch>
                       <a:fillRect/>
                     </a:stretch>
@@ -12793,8 +12867,8 @@
         <w:br w:type="page"/>
       </w:r>
     </w:p>
-    <w:bookmarkEnd w:id="39"/>
-    <w:bookmarkStart w:id="60" w:name="supplementary-material"/>
+    <w:bookmarkEnd w:id="40"/>
+    <w:bookmarkStart w:id="61" w:name="supplementary-material"/>
     <w:p>
       <w:pPr>
         <w:pStyle w:val="Heading1"/>
@@ -12803,7 +12877,7 @@
         <w:t xml:space="preserve">Supplementary Material</w:t>
       </w:r>
     </w:p>
-    <w:bookmarkStart w:id="40" w:name="supplementary-tables"/>
+    <w:bookmarkStart w:id="41" w:name="supplementary-tables"/>
     <w:p>
       <w:pPr>
         <w:pStyle w:val="Heading2"/>
@@ -20540,8 +20614,8 @@
         </w:tc>
       </w:tr>
     </w:tbl>
-    <w:bookmarkEnd w:id="40"/>
-    <w:bookmarkStart w:id="59" w:name="supplementary-figures"/>
+    <w:bookmarkEnd w:id="41"/>
+    <w:bookmarkStart w:id="60" w:name="supplementary-figures"/>
     <w:p>
       <w:pPr>
         <w:pStyle w:val="Heading2"/>
@@ -20571,18 +20645,18 @@
           <wp:inline>
             <wp:extent cx="5334000" cy="4148666"/>
             <wp:effectExtent b="0" l="0" r="0" t="0"/>
-            <wp:docPr descr="" title="" id="42" name="Picture"/>
+            <wp:docPr descr="" title="" id="43" name="Picture"/>
             <a:graphic>
               <a:graphicData uri="http://schemas.openxmlformats.org/drawingml/2006/picture">
                 <pic:pic>
                   <pic:nvPicPr>
-                    <pic:cNvPr descr="model_output/supp/figS1_km_time_to_appointment.png" id="43" name="Picture"/>
+                    <pic:cNvPr descr="model_output/supp/figS1_km_time_to_appointment.png" id="44" name="Picture"/>
                     <pic:cNvPicPr>
                       <a:picLocks noChangeArrowheads="1" noChangeAspect="1"/>
                     </pic:cNvPicPr>
                   </pic:nvPicPr>
                   <pic:blipFill>
-                    <a:blip r:embed="rId41"/>
+                    <a:blip r:embed="rId42"/>
                     <a:stretch>
                       <a:fillRect/>
                     </a:stretch>
@@ -20630,18 +20704,18 @@
           <wp:inline>
             <wp:extent cx="5334000" cy="3333750"/>
             <wp:effectExtent b="0" l="0" r="0" t="0"/>
-            <wp:docPr descr="" title="" id="45" name="Picture"/>
+            <wp:docPr descr="" title="" id="46" name="Picture"/>
             <a:graphic>
               <a:graphicData uri="http://schemas.openxmlformats.org/drawingml/2006/picture">
                 <pic:pic>
                   <pic:nvPicPr>
-                    <pic:cNvPr descr="model_output/supp/figS2_wait_distribution.png" id="46" name="Picture"/>
+                    <pic:cNvPr descr="model_output/supp/figS2_wait_distribution.png" id="47" name="Picture"/>
                     <pic:cNvPicPr>
                       <a:picLocks noChangeArrowheads="1" noChangeAspect="1"/>
                     </pic:cNvPicPr>
                   </pic:nvPicPr>
                   <pic:blipFill>
-                    <a:blip r:embed="rId44"/>
+                    <a:blip r:embed="rId45"/>
                     <a:stretch>
                       <a:fillRect/>
                     </a:stretch>
@@ -20689,18 +20763,18 @@
           <wp:inline>
             <wp:extent cx="5334000" cy="2667000"/>
             <wp:effectExtent b="0" l="0" r="0" t="0"/>
-            <wp:docPr descr="" title="" id="48" name="Picture"/>
+            <wp:docPr descr="" title="" id="49" name="Picture"/>
             <a:graphic>
               <a:graphicData uri="http://schemas.openxmlformats.org/drawingml/2006/picture">
                 <pic:pic>
                   <pic:nvPicPr>
-                    <pic:cNvPr descr="model_output/supp/figS3_nb_diagnostics.png" id="49" name="Picture"/>
+                    <pic:cNvPr descr="model_output/supp/figS3_nb_diagnostics.png" id="50" name="Picture"/>
                     <pic:cNvPicPr>
                       <a:picLocks noChangeArrowheads="1" noChangeAspect="1"/>
                     </pic:cNvPicPr>
                   </pic:nvPicPr>
                   <pic:blipFill>
-                    <a:blip r:embed="rId47"/>
+                    <a:blip r:embed="rId48"/>
                     <a:stretch>
                       <a:fillRect/>
                     </a:stretch>
@@ -20748,18 +20822,18 @@
           <wp:inline>
             <wp:extent cx="5334000" cy="3333750"/>
             <wp:effectExtent b="0" l="0" r="0" t="0"/>
-            <wp:docPr descr="" title="" id="51" name="Picture"/>
+            <wp:docPr descr="" title="" id="52" name="Picture"/>
             <a:graphic>
               <a:graphicData uri="http://schemas.openxmlformats.org/drawingml/2006/picture">
                 <pic:pic>
                   <pic:nvPicPr>
-                    <pic:cNvPr descr="model_output/supp/figS4_choropleth_offer_rate.png" id="52" name="Picture"/>
+                    <pic:cNvPr descr="model_output/supp/figS4_choropleth_offer_rate.png" id="53" name="Picture"/>
                     <pic:cNvPicPr>
                       <a:picLocks noChangeArrowheads="1" noChangeAspect="1"/>
                     </pic:cNvPicPr>
                   </pic:nvPicPr>
                   <pic:blipFill>
-                    <a:blip r:embed="rId50"/>
+                    <a:blip r:embed="rId51"/>
                     <a:stretch>
                       <a:fillRect/>
                     </a:stretch>
@@ -20807,18 +20881,18 @@
           <wp:inline>
             <wp:extent cx="5334000" cy="3333750"/>
             <wp:effectExtent b="0" l="0" r="0" t="0"/>
-            <wp:docPr descr="" title="" id="54" name="Picture"/>
+            <wp:docPr descr="" title="" id="55" name="Picture"/>
             <a:graphic>
               <a:graphicData uri="http://schemas.openxmlformats.org/drawingml/2006/picture">
                 <pic:pic>
                   <pic:nvPicPr>
-                    <pic:cNvPr descr="model_output/supp/figS4_choropleth_median_wait.png" id="55" name="Picture"/>
+                    <pic:cNvPr descr="model_output/supp/figS4_choropleth_median_wait.png" id="56" name="Picture"/>
                     <pic:cNvPicPr>
                       <a:picLocks noChangeArrowheads="1" noChangeAspect="1"/>
                     </pic:cNvPicPr>
                   </pic:nvPicPr>
                   <pic:blipFill>
-                    <a:blip r:embed="rId53"/>
+                    <a:blip r:embed="rId54"/>
                     <a:stretch>
                       <a:fillRect/>
                     </a:stretch>
@@ -20866,18 +20940,18 @@
           <wp:inline>
             <wp:extent cx="5334000" cy="3556000"/>
             <wp:effectExtent b="0" l="0" r="0" t="0"/>
-            <wp:docPr descr="" title="" id="57" name="Picture"/>
+            <wp:docPr descr="" title="" id="58" name="Picture"/>
             <a:graphic>
               <a:graphicData uri="http://schemas.openxmlformats.org/drawingml/2006/picture">
                 <pic:pic>
                   <pic:nvPicPr>
-                    <pic:cNvPr descr="model_output/supp/figS4b_offer_rate_by_state.png" id="58" name="Picture"/>
+                    <pic:cNvPr descr="model_output/supp/figS4b_offer_rate_by_state.png" id="59" name="Picture"/>
                     <pic:cNvPicPr>
                       <a:picLocks noChangeArrowheads="1" noChangeAspect="1"/>
                     </pic:cNvPicPr>
                   </pic:nvPicPr>
                   <pic:blipFill>
-                    <a:blip r:embed="rId56"/>
+                    <a:blip r:embed="rId57"/>
                     <a:stretch>
                       <a:fillRect/>
                     </a:stretch>
@@ -20943,9 +21017,9 @@
         <w:br w:type="page"/>
       </w:r>
     </w:p>
-    <w:bookmarkEnd w:id="59"/>
     <w:bookmarkEnd w:id="60"/>
-    <w:bookmarkStart w:id="74" w:name="references"/>
+    <w:bookmarkEnd w:id="61"/>
+    <w:bookmarkStart w:id="77" w:name="references"/>
     <w:p>
       <w:pPr>
         <w:pStyle w:val="Heading1"/>
@@ -20954,8 +21028,8 @@
         <w:t xml:space="preserve">References</w:t>
       </w:r>
     </w:p>
-    <w:bookmarkStart w:id="73" w:name="refs"/>
-    <w:bookmarkStart w:id="61" w:name="ref-PLACEHOLDER_access"/>
+    <w:bookmarkStart w:id="76" w:name="refs"/>
+    <w:bookmarkStart w:id="62" w:name="ref-PLACEHOLDER_access"/>
     <w:p>
       <w:pPr>
         <w:pStyle w:val="Bibliography"/>
@@ -20986,8 +21060,8 @@
         <w:t xml:space="preserve">. Published online 2020.</w:t>
       </w:r>
     </w:p>
-    <w:bookmarkEnd w:id="61"/>
-    <w:bookmarkStart w:id="62" w:name="ref-PLACEHOLDER_ent_supply"/>
+    <w:bookmarkEnd w:id="62"/>
+    <w:bookmarkStart w:id="63" w:name="ref-PLACEHOLDER_ent_supply"/>
     <w:p>
       <w:pPr>
         <w:pStyle w:val="Bibliography"/>
@@ -21018,8 +21092,8 @@
         <w:t xml:space="preserve">. Published online 2021.</w:t>
       </w:r>
     </w:p>
-    <w:bookmarkEnd w:id="62"/>
-    <w:bookmarkStart w:id="63" w:name="ref-kfffee"/>
+    <w:bookmarkEnd w:id="63"/>
+    <w:bookmarkStart w:id="64" w:name="ref-kfffee"/>
     <w:p>
       <w:pPr>
         <w:pStyle w:val="Bibliography"/>
@@ -21037,8 +21111,8 @@
         <w:t xml:space="preserve">Kaiser Family Foundation. Medicaid-to-medicare fee index. Published online 2024.</w:t>
       </w:r>
     </w:p>
-    <w:bookmarkEnd w:id="63"/>
-    <w:bookmarkStart w:id="64" w:name="ref-cdcsvi"/>
+    <w:bookmarkEnd w:id="64"/>
+    <w:bookmarkStart w:id="65" w:name="ref-cdcsvi"/>
     <w:p>
       <w:pPr>
         <w:pStyle w:val="Bibliography"/>
@@ -21068,8 +21142,8 @@
         <w:t xml:space="preserve">social vulnerability index (2022 database). Published online 2022.</w:t>
       </w:r>
     </w:p>
-    <w:bookmarkEnd w:id="64"/>
-    <w:bookmarkStart w:id="66" w:name="ref-emmeans"/>
+    <w:bookmarkEnd w:id="65"/>
+    <w:bookmarkStart w:id="67" w:name="ref-emmeans"/>
     <w:p>
       <w:pPr>
         <w:pStyle w:val="Bibliography"/>
@@ -21102,7 +21176,7 @@
       <w:r>
         <w:t xml:space="preserve"> </w:t>
       </w:r>
-      <w:hyperlink r:id="rId65">
+      <w:hyperlink r:id="rId66">
         <w:r>
           <w:rPr>
             <w:rStyle w:val="Hyperlink"/>
@@ -21111,8 +21185,8 @@
         </w:r>
       </w:hyperlink>
     </w:p>
-    <w:bookmarkEnd w:id="66"/>
-    <w:bookmarkStart w:id="68" w:name="ref-rcoreteam"/>
+    <w:bookmarkEnd w:id="67"/>
+    <w:bookmarkStart w:id="69" w:name="ref-rcoreteam"/>
     <w:p>
       <w:pPr>
         <w:pStyle w:val="Bibliography"/>
@@ -21145,7 +21219,7 @@
       <w:r>
         <w:t xml:space="preserve"> </w:t>
       </w:r>
-      <w:hyperlink r:id="rId67">
+      <w:hyperlink r:id="rId68">
         <w:r>
           <w:rPr>
             <w:rStyle w:val="Hyperlink"/>
@@ -21154,8 +21228,8 @@
         </w:r>
       </w:hyperlink>
     </w:p>
-    <w:bookmarkEnd w:id="68"/>
-    <w:bookmarkStart w:id="70" w:name="ref-glmmTMB"/>
+    <w:bookmarkEnd w:id="69"/>
+    <w:bookmarkStart w:id="71" w:name="ref-glmmTMB"/>
     <w:p>
       <w:pPr>
         <w:pStyle w:val="Bibliography"/>
@@ -21197,7 +21271,7 @@
       <w:r>
         <w:t xml:space="preserve">. 2017;9(2):378-400. doi:</w:t>
       </w:r>
-      <w:hyperlink r:id="rId69">
+      <w:hyperlink r:id="rId70">
         <w:r>
           <w:rPr>
             <w:rStyle w:val="Hyperlink"/>
@@ -21206,8 +21280,8 @@
         </w:r>
       </w:hyperlink>
     </w:p>
-    <w:bookmarkEnd w:id="70"/>
-    <w:bookmarkStart w:id="72" w:name="ref-strobe"/>
+    <w:bookmarkEnd w:id="71"/>
+    <w:bookmarkStart w:id="73" w:name="ref-strobe"/>
     <w:p>
       <w:pPr>
         <w:pStyle w:val="Bibliography"/>
@@ -21297,7 +21371,7 @@
       <w:r>
         <w:t xml:space="preserve">. 2007;147(8):573-577. doi:</w:t>
       </w:r>
-      <w:hyperlink r:id="rId71">
+      <w:hyperlink r:id="rId72">
         <w:r>
           <w:rPr>
             <w:rStyle w:val="Hyperlink"/>
@@ -21306,9 +21380,73 @@
         </w:r>
       </w:hyperlink>
     </w:p>
-    <w:bookmarkEnd w:id="72"/>
     <w:bookmarkEnd w:id="73"/>
+    <w:bookmarkStart w:id="74" w:name="ref-PLACEHOLDER_corbisiero"/>
+    <w:p>
+      <w:pPr>
+        <w:pStyle w:val="Bibliography"/>
+      </w:pPr>
+      <w:r>
+        <w:t xml:space="preserve">9.</w:t>
+      </w:r>
+      <w:r>
+        <w:t xml:space="preserve"> </w:t>
+      </w:r>
+      <w:r>
+        <w:t xml:space="preserve">	</w:t>
+      </w:r>
+      <w:r>
+        <w:t xml:space="preserve">M. Corbisiero, others. [PLACEHOLDER — complete citation] corbisiero et al., otolaryngology appointment access.</w:t>
+      </w:r>
+      <w:r>
+        <w:t xml:space="preserve"> </w:t>
+      </w:r>
+      <w:r>
+        <w:rPr>
+          <w:i/>
+          <w:iCs/>
+        </w:rPr>
+        <w:t xml:space="preserve">[Journal]</w:t>
+      </w:r>
+      <w:r>
+        <w:t xml:space="preserve">. Published online 2024.</w:t>
+      </w:r>
+    </w:p>
     <w:bookmarkEnd w:id="74"/>
+    <w:bookmarkStart w:id="75" w:name="ref-PLACEHOLDER_saeedi"/>
+    <w:p>
+      <w:pPr>
+        <w:pStyle w:val="Bibliography"/>
+      </w:pPr>
+      <w:r>
+        <w:t xml:space="preserve">10.</w:t>
+      </w:r>
+      <w:r>
+        <w:t xml:space="preserve"> </w:t>
+      </w:r>
+      <w:r>
+        <w:t xml:space="preserve">	</w:t>
+      </w:r>
+      <w:r>
+        <w:t xml:space="preserve">A. Saeedi, others. [PLACEHOLDER — complete citation] saeedi et al., rural otolaryngology access wait times.</w:t>
+      </w:r>
+      <w:r>
+        <w:t xml:space="preserve"> </w:t>
+      </w:r>
+      <w:r>
+        <w:rPr>
+          <w:i/>
+          <w:iCs/>
+        </w:rPr>
+        <w:t xml:space="preserve">[Journal]</w:t>
+      </w:r>
+      <w:r>
+        <w:t xml:space="preserve">. Published online [year].</w:t>
+      </w:r>
+    </w:p>
+    <w:bookmarkEnd w:id="75"/>
+    <w:bookmarkEnd w:id="76"/>
+    <w:bookmarkEnd w:id="77"/>
     <w:sectPr>
       <w:footnotePr>
         <w:numRestart w:val="eachSect"/>

</xml_diff>

<commit_message>
Complete Corbisiero 2024 and Saeedi 2025 power-anchor citations
Replace the placeholder bib stubs with full metadata and rename keys to
corbisiero2024 / saeedi2025:
- Corbisiero MF, Muffly TM, et al. Insurance Status and Access to Otolaryngology
  Care: National Mystery Caller Study in the United States. Otolaryngol Head Neck
  Surg. 2024;171(1):98-108. doi:10.1002/ohn.752
- Saeedi A, Muffly T, et al. Referral Conundrum: Wait Times for Subspecialists
  Versus Comprehensive Otolaryngologists in the United States. Cureus.
  2025;17(9):e91744. doi:10.7759/cureus.91744
Both are the authors' own prior series, the empirical source of the a priori
phi=1.7 and ICC=0.08 assumptions. Citations now resolve in the manuscript.

Co-Authored-By: Claude Opus 4.8 (1M context) <noreply@anthropic.com>
</commit_message>
<xml_diff>
--- a/manuscript_output/manuscript_mystery_caller.docx
+++ b/manuscript_output/manuscript_mystery_caller.docx
@@ -656,7 +656,7 @@
       <w:r>
         <w:t xml:space="preserve">by a call budget of 800, with the rural-versus-urban difference in business-day wait time as the primary contrast. The power analysis was pre-specified before data collection and implemented in a purpose-built simulation application. Its assumptions were anchored to empirical data rather than convention: the expected rural wait penalty, the negative binomial dispersion (φ = 1.7), and the state-level intraclass correlation (ICC = 0.08) were estimated by pooling 273 rural otolaryngology observations from two published access series</w:t>
       </w:r>
-      <w:hyperlink w:anchor="ref-PLACEHOLDER_corbisiero">
+      <w:hyperlink w:anchor="ref-corbisiero2024">
         <w:r>
           <w:rPr>
             <w:rStyle w:val="Hyperlink"/>
@@ -671,7 +671,7 @@
         </w:rPr>
         <w:t xml:space="preserve">,</w:t>
       </w:r>
-      <w:hyperlink w:anchor="ref-PLACEHOLDER_saeedi">
+      <w:hyperlink w:anchor="ref-saeedi2025">
         <w:r>
           <w:rPr>
             <w:rStyle w:val="Hyperlink"/>
@@ -21019,7 +21019,7 @@
     </w:p>
     <w:bookmarkEnd w:id="60"/>
     <w:bookmarkEnd w:id="61"/>
-    <w:bookmarkStart w:id="77" w:name="references"/>
+    <w:bookmarkStart w:id="79" w:name="references"/>
     <w:p>
       <w:pPr>
         <w:pStyle w:val="Heading1"/>
@@ -21028,7 +21028,7 @@
         <w:t xml:space="preserve">References</w:t>
       </w:r>
     </w:p>
-    <w:bookmarkStart w:id="76" w:name="refs"/>
+    <w:bookmarkStart w:id="78" w:name="refs"/>
     <w:bookmarkStart w:id="62" w:name="ref-PLACEHOLDER_access"/>
     <w:p>
       <w:pPr>
@@ -21381,7 +21381,7 @@
       </w:hyperlink>
     </w:p>
     <w:bookmarkEnd w:id="73"/>
-    <w:bookmarkStart w:id="74" w:name="ref-PLACEHOLDER_corbisiero"/>
+    <w:bookmarkStart w:id="75" w:name="ref-corbisiero2024"/>
     <w:p>
       <w:pPr>
         <w:pStyle w:val="Bibliography"/>
@@ -21396,7 +21396,7 @@
         <w:t xml:space="preserve">	</w:t>
       </w:r>
       <w:r>
-        <w:t xml:space="preserve">M. Corbisiero, others. [PLACEHOLDER — complete citation] corbisiero et al., otolaryngology appointment access.</w:t>
+        <w:t xml:space="preserve">Michaele Francesco Corbisiero, Tyler M. Muffly, Drew C. Gottman, Madeline Olson, Yasmine Hachicha, Elizabeth Garcia-Creighton, Natalie Gallego, Maryam Elsayed, Sophia Ahmed, Cristina Cabrera-Muffly. Insurance status and access to otolaryngology care: National mystery caller study in the united states.</w:t>
       </w:r>
       <w:r>
         <w:t xml:space="preserve"> </w:t>
@@ -21406,14 +21406,22 @@
           <w:i/>
           <w:iCs/>
         </w:rPr>
-        <w:t xml:space="preserve">[Journal]</w:t>
-      </w:r>
-      <w:r>
-        <w:t xml:space="preserve">. Published online 2024.</w:t>
-      </w:r>
+        <w:t xml:space="preserve">Otolaryngology–Head and Neck Surgery</w:t>
+      </w:r>
+      <w:r>
+        <w:t xml:space="preserve">. 2024;171(1):98-108. doi:</w:t>
+      </w:r>
+      <w:hyperlink r:id="rId74">
+        <w:r>
+          <w:rPr>
+            <w:rStyle w:val="Hyperlink"/>
+          </w:rPr>
+          <w:t xml:space="preserve">10.1002/ohn.752</w:t>
+        </w:r>
+      </w:hyperlink>
     </w:p>
-    <w:bookmarkEnd w:id="74"/>
-    <w:bookmarkStart w:id="75" w:name="ref-PLACEHOLDER_saeedi"/>
+    <w:bookmarkEnd w:id="75"/>
+    <w:bookmarkStart w:id="77" w:name="ref-saeedi2025"/>
     <w:p>
       <w:pPr>
         <w:pStyle w:val="Bibliography"/>
@@ -21428,7 +21436,7 @@
         <w:t xml:space="preserve">	</w:t>
       </w:r>
       <w:r>
-        <w:t xml:space="preserve">A. Saeedi, others. [PLACEHOLDER — complete citation] saeedi et al., rural otolaryngology access wait times.</w:t>
+        <w:t xml:space="preserve">Arman Saeedi, Tyler Muffly, Michaele Francesco Corbisiero, G. Burnet, J. Huang, B. D. Abell, E. Moore, A. Saatchi, A. Ai, B. Asare, L. Maly, Drew C. Gottman, Andrew J. Tompkins, Cristina Cabrera-Muffly. Referral conundrum: Wait times for subspecialists versus comprehensive otolaryngologists in the united states.</w:t>
       </w:r>
       <w:r>
         <w:t xml:space="preserve"> </w:t>
@@ -21438,15 +21446,23 @@
           <w:i/>
           <w:iCs/>
         </w:rPr>
-        <w:t xml:space="preserve">[Journal]</w:t>
-      </w:r>
-      <w:r>
-        <w:t xml:space="preserve">. Published online [year].</w:t>
-      </w:r>
+        <w:t xml:space="preserve">Cureus</w:t>
+      </w:r>
+      <w:r>
+        <w:t xml:space="preserve">. 2025;17(9):e91744. doi:</w:t>
+      </w:r>
+      <w:hyperlink r:id="rId76">
+        <w:r>
+          <w:rPr>
+            <w:rStyle w:val="Hyperlink"/>
+          </w:rPr>
+          <w:t xml:space="preserve">10.7759/cureus.91744</w:t>
+        </w:r>
+      </w:hyperlink>
     </w:p>
-    <w:bookmarkEnd w:id="75"/>
-    <w:bookmarkEnd w:id="76"/>
     <w:bookmarkEnd w:id="77"/>
+    <w:bookmarkEnd w:id="78"/>
+    <w:bookmarkEnd w:id="79"/>
     <w:sectPr>
       <w:footnotePr>
         <w:numRestart w:val="eachSect"/>

</xml_diff>

<commit_message>
Fix AMA bibliography rendering (White Journal style)
The AMA CSL (Style Variant Builder variant) set name options only on the root
<style> element, relying on inheritance to an implicit <name> node that pandoc's
citeproc does not apply -- so references rendered with full given-first names and
no et-al truncation. Added explicit <name delimiter=', ' initialize-with=''
name-as-sort-order='all' sort-separator=' '/> to the author and editor macros.
References now render true AMA: 'Corbisiero MF, Muffly TM, Gottman DC, et al.
... 2024;171(1):98-108. doi:...'. Also brace-protected 'United States' in both
new titles so AMA sentence-casing keeps the proper noun capitalized.

Bibliography pipeline is BibTeX (references.bib = data) + CSL (style); both are
used together via pandoc citeproc.

Co-Authored-By: Claude Opus 4.8 (1M context) <noreply@anthropic.com>
</commit_message>
<xml_diff>
--- a/manuscript_output/manuscript_mystery_caller.docx
+++ b/manuscript_output/manuscript_mystery_caller.docx
@@ -21044,7 +21044,7 @@
         <w:t xml:space="preserve">	</w:t>
       </w:r>
       <w:r>
-        <w:t xml:space="preserve">A. Author, B. Author. [PLACEHOLDER] prior mystery-caller study of specialty access.</w:t>
+        <w:t xml:space="preserve">Author A, Author B. [PLACEHOLDER] prior mystery-caller study of specialty access.</w:t>
       </w:r>
       <w:r>
         <w:t xml:space="preserve"> </w:t>
@@ -21076,7 +21076,7 @@
         <w:t xml:space="preserve">	</w:t>
       </w:r>
       <w:r>
-        <w:t xml:space="preserve">C. Author. [PLACEHOLDER] geographic distribution of the otolaryngology workforce.</w:t>
+        <w:t xml:space="preserve">Author C. [PLACEHOLDER] geographic distribution of the otolaryngology workforce.</w:t>
       </w:r>
       <w:r>
         <w:t xml:space="preserve"> </w:t>
@@ -21158,7 +21158,7 @@
         <w:t xml:space="preserve">	</w:t>
       </w:r>
       <w:r>
-        <w:t xml:space="preserve">Russell V. Lenth.</w:t>
+        <w:t xml:space="preserve">Lenth RV.</w:t>
       </w:r>
       <w:r>
         <w:t xml:space="preserve"> </w:t>
@@ -21244,7 +21244,7 @@
         <w:t xml:space="preserve">	</w:t>
       </w:r>
       <w:r>
-        <w:t xml:space="preserve">Mollie E. Brooks, Kasper Kristensen, Koen J. van Benthem, Arni Magnusson, Casper W. Berg, Anders Nielsen, Hans J. Skaug, Martin Maechler, Benjamin M. Bolker.</w:t>
+        <w:t xml:space="preserve">Brooks ME, Kristensen K, Benthem KJ van, et al.</w:t>
       </w:r>
       <w:r>
         <w:t xml:space="preserve"> </w:t>
@@ -21296,7 +21296,7 @@
         <w:t xml:space="preserve">	</w:t>
       </w:r>
       <w:r>
-        <w:t xml:space="preserve">Erik von Elm, Douglas G. Altman, Matthias Egger, Stuart J. Pocock, Peter C. Gøtzsche, Jan P. Vandenbroucke. The</w:t>
+        <w:t xml:space="preserve">Elm E von, Altman DG, Egger M, Pocock SJ, Gøtzsche PC, Vandenbroucke JP. The</w:t>
       </w:r>
       <w:r>
         <w:t xml:space="preserve"> </w:t>
@@ -21396,7 +21396,16 @@
         <w:t xml:space="preserve">	</w:t>
       </w:r>
       <w:r>
-        <w:t xml:space="preserve">Michaele Francesco Corbisiero, Tyler M. Muffly, Drew C. Gottman, Madeline Olson, Yasmine Hachicha, Elizabeth Garcia-Creighton, Natalie Gallego, Maryam Elsayed, Sophia Ahmed, Cristina Cabrera-Muffly. Insurance status and access to otolaryngology care: National mystery caller study in the united states.</w:t>
+        <w:t xml:space="preserve">Corbisiero MF, Muffly TM, Gottman DC, et al. Insurance status and access to otolaryngology care: National mystery caller study in the</w:t>
+      </w:r>
+      <w:r>
+        <w:t xml:space="preserve"> </w:t>
+      </w:r>
+      <w:r>
+        <w:t xml:space="preserve">United States</w:t>
+      </w:r>
+      <w:r>
+        <w:t xml:space="preserve">.</w:t>
       </w:r>
       <w:r>
         <w:t xml:space="preserve"> </w:t>
@@ -21436,7 +21445,16 @@
         <w:t xml:space="preserve">	</w:t>
       </w:r>
       <w:r>
-        <w:t xml:space="preserve">Arman Saeedi, Tyler Muffly, Michaele Francesco Corbisiero, G. Burnet, J. Huang, B. D. Abell, E. Moore, A. Saatchi, A. Ai, B. Asare, L. Maly, Drew C. Gottman, Andrew J. Tompkins, Cristina Cabrera-Muffly. Referral conundrum: Wait times for subspecialists versus comprehensive otolaryngologists in the united states.</w:t>
+        <w:t xml:space="preserve">Saeedi A, Muffly T, Corbisiero MF, et al. Referral conundrum: Wait times for subspecialists versus comprehensive otolaryngologists in the</w:t>
+      </w:r>
+      <w:r>
+        <w:t xml:space="preserve"> </w:t>
+      </w:r>
+      <w:r>
+        <w:t xml:space="preserve">United States</w:t>
+      </w:r>
+      <w:r>
+        <w:t xml:space="preserve">.</w:t>
       </w:r>
       <w:r>
         <w:t xml:space="preserve"> </w:t>

</xml_diff>

<commit_message>
Replace the two placeholder citations with real references
- Introduction access/mystery-caller claim -> Bisgaier J, Rhodes KV. Auditing
  Access to Specialty Care for Children with Public Insurance. N Engl J Med.
  2011;364(24):2324-2333. doi:10.1056/NEJMsa1013285 (landmark simulated-patient
  specialty-access study).
- Otolaryngology workforce/supply claim -> Vickery TW, Weterings R,
  Cabrera-Muffly C. Geographic Distribution of Otolaryngologists in the United
  States. Ear Nose Throat J. 2016;95(6):218-223. doi:10.1177/014556131609500607
  (senior-authored by a co-author of this study).
Removed the placeholder stubs and the stale PLACEHOLDER header comment; the
bibliography now contains no placeholders.

Co-Authored-By: Claude Opus 4.8 (1M context) <noreply@anthropic.com>
</commit_message>
<xml_diff>
--- a/manuscript_output/manuscript_mystery_caller.docx
+++ b/manuscript_output/manuscript_mystery_caller.docx
@@ -156,7 +156,7 @@
       <w:r>
         <w:t xml:space="preserve">Otolaryngologic conditions—from chronic rhinosinusitis and otitis media to airway disorders and head-and-neck malignancy—are among the most common reasons patients seek specialty care, and for many of these conditions timely evaluation influences diagnosis and outcome</w:t>
       </w:r>
-      <w:hyperlink w:anchor="ref-PLACEHOLDER_access">
+      <w:hyperlink w:anchor="ref-bisgaier2011">
         <w:r>
           <w:rPr>
             <w:rStyle w:val="Hyperlink"/>
@@ -216,7 +216,7 @@
       <w:r>
         <w:t xml:space="preserve">) studies address this gap by having trained callers pose as new patients and request appointments under a standardized script, directly measuring the experience a real patient would encounter</w:t>
       </w:r>
-      <w:hyperlink w:anchor="ref-PLACEHOLDER_access">
+      <w:hyperlink w:anchor="ref-bisgaier2011">
         <w:r>
           <w:rPr>
             <w:rStyle w:val="Hyperlink"/>
@@ -260,7 +260,7 @@
       <w:r>
         <w:t xml:space="preserve">environment of the practice—local physician supply, the generosity of the state Medicaid fee schedule, community social vulnerability, the share of dual-eligible beneficiaries, and rurality</w:t>
       </w:r>
-      <w:hyperlink w:anchor="ref-PLACEHOLDER_ent_supply">
+      <w:hyperlink w:anchor="ref-vickery2016">
         <w:r>
           <w:rPr>
             <w:rStyle w:val="Hyperlink"/>
@@ -21019,7 +21019,7 @@
     </w:p>
     <w:bookmarkEnd w:id="60"/>
     <w:bookmarkEnd w:id="61"/>
-    <w:bookmarkStart w:id="79" w:name="references"/>
+    <w:bookmarkStart w:id="81" w:name="references"/>
     <w:p>
       <w:pPr>
         <w:pStyle w:val="Heading1"/>
@@ -21028,8 +21028,8 @@
         <w:t xml:space="preserve">References</w:t>
       </w:r>
     </w:p>
-    <w:bookmarkStart w:id="78" w:name="refs"/>
-    <w:bookmarkStart w:id="62" w:name="ref-PLACEHOLDER_access"/>
+    <w:bookmarkStart w:id="80" w:name="refs"/>
+    <w:bookmarkStart w:id="63" w:name="ref-bisgaier2011"/>
     <w:p>
       <w:pPr>
         <w:pStyle w:val="Bibliography"/>
@@ -21044,7 +21044,7 @@
         <w:t xml:space="preserve">	</w:t>
       </w:r>
       <w:r>
-        <w:t xml:space="preserve">Author A, Author B. [PLACEHOLDER] prior mystery-caller study of specialty access.</w:t>
+        <w:t xml:space="preserve">Bisgaier J, Rhodes KV. Auditing access to specialty care for children with public insurance.</w:t>
       </w:r>
       <w:r>
         <w:t xml:space="preserve"> </w:t>
@@ -21054,14 +21054,22 @@
           <w:i/>
           <w:iCs/>
         </w:rPr>
-        <w:t xml:space="preserve">[Journal]</w:t>
-      </w:r>
-      <w:r>
-        <w:t xml:space="preserve">. Published online 2020.</w:t>
-      </w:r>
+        <w:t xml:space="preserve">New England Journal of Medicine</w:t>
+      </w:r>
+      <w:r>
+        <w:t xml:space="preserve">. 2011;364(24):2324-2333. doi:</w:t>
+      </w:r>
+      <w:hyperlink r:id="rId62">
+        <w:r>
+          <w:rPr>
+            <w:rStyle w:val="Hyperlink"/>
+          </w:rPr>
+          <w:t xml:space="preserve">10.1056/NEJMsa1013285</w:t>
+        </w:r>
+      </w:hyperlink>
     </w:p>
-    <w:bookmarkEnd w:id="62"/>
-    <w:bookmarkStart w:id="63" w:name="ref-PLACEHOLDER_ent_supply"/>
+    <w:bookmarkEnd w:id="63"/>
+    <w:bookmarkStart w:id="65" w:name="ref-vickery2016"/>
     <w:p>
       <w:pPr>
         <w:pStyle w:val="Bibliography"/>
@@ -21076,7 +21084,16 @@
         <w:t xml:space="preserve">	</w:t>
       </w:r>
       <w:r>
-        <w:t xml:space="preserve">Author C. [PLACEHOLDER] geographic distribution of the otolaryngology workforce.</w:t>
+        <w:t xml:space="preserve">Vickery TW, Weterings R, Cabrera-Muffly C. Geographic distribution of otolaryngologists in the</w:t>
+      </w:r>
+      <w:r>
+        <w:t xml:space="preserve"> </w:t>
+      </w:r>
+      <w:r>
+        <w:t xml:space="preserve">United States</w:t>
+      </w:r>
+      <w:r>
+        <w:t xml:space="preserve">.</w:t>
       </w:r>
       <w:r>
         <w:t xml:space="preserve"> </w:t>
@@ -21086,14 +21103,22 @@
           <w:i/>
           <w:iCs/>
         </w:rPr>
-        <w:t xml:space="preserve">[Journal]</w:t>
-      </w:r>
-      <w:r>
-        <w:t xml:space="preserve">. Published online 2021.</w:t>
-      </w:r>
+        <w:t xml:space="preserve">Ear, Nose &amp; Throat Journal</w:t>
+      </w:r>
+      <w:r>
+        <w:t xml:space="preserve">. 2016;95(6):218-223. doi:</w:t>
+      </w:r>
+      <w:hyperlink r:id="rId64">
+        <w:r>
+          <w:rPr>
+            <w:rStyle w:val="Hyperlink"/>
+          </w:rPr>
+          <w:t xml:space="preserve">10.1177/014556131609500607</w:t>
+        </w:r>
+      </w:hyperlink>
     </w:p>
-    <w:bookmarkEnd w:id="63"/>
-    <w:bookmarkStart w:id="64" w:name="ref-kfffee"/>
+    <w:bookmarkEnd w:id="65"/>
+    <w:bookmarkStart w:id="66" w:name="ref-kfffee"/>
     <w:p>
       <w:pPr>
         <w:pStyle w:val="Bibliography"/>
@@ -21111,8 +21136,8 @@
         <w:t xml:space="preserve">Kaiser Family Foundation. Medicaid-to-medicare fee index. Published online 2024.</w:t>
       </w:r>
     </w:p>
-    <w:bookmarkEnd w:id="64"/>
-    <w:bookmarkStart w:id="65" w:name="ref-cdcsvi"/>
+    <w:bookmarkEnd w:id="66"/>
+    <w:bookmarkStart w:id="67" w:name="ref-cdcsvi"/>
     <w:p>
       <w:pPr>
         <w:pStyle w:val="Bibliography"/>
@@ -21142,8 +21167,8 @@
         <w:t xml:space="preserve">social vulnerability index (2022 database). Published online 2022.</w:t>
       </w:r>
     </w:p>
-    <w:bookmarkEnd w:id="65"/>
-    <w:bookmarkStart w:id="67" w:name="ref-emmeans"/>
+    <w:bookmarkEnd w:id="67"/>
+    <w:bookmarkStart w:id="69" w:name="ref-emmeans"/>
     <w:p>
       <w:pPr>
         <w:pStyle w:val="Bibliography"/>
@@ -21176,7 +21201,7 @@
       <w:r>
         <w:t xml:space="preserve"> </w:t>
       </w:r>
-      <w:hyperlink r:id="rId66">
+      <w:hyperlink r:id="rId68">
         <w:r>
           <w:rPr>
             <w:rStyle w:val="Hyperlink"/>
@@ -21185,8 +21210,8 @@
         </w:r>
       </w:hyperlink>
     </w:p>
-    <w:bookmarkEnd w:id="67"/>
-    <w:bookmarkStart w:id="69" w:name="ref-rcoreteam"/>
+    <w:bookmarkEnd w:id="69"/>
+    <w:bookmarkStart w:id="71" w:name="ref-rcoreteam"/>
     <w:p>
       <w:pPr>
         <w:pStyle w:val="Bibliography"/>
@@ -21219,7 +21244,7 @@
       <w:r>
         <w:t xml:space="preserve"> </w:t>
       </w:r>
-      <w:hyperlink r:id="rId68">
+      <w:hyperlink r:id="rId70">
         <w:r>
           <w:rPr>
             <w:rStyle w:val="Hyperlink"/>
@@ -21228,8 +21253,8 @@
         </w:r>
       </w:hyperlink>
     </w:p>
-    <w:bookmarkEnd w:id="69"/>
-    <w:bookmarkStart w:id="71" w:name="ref-glmmTMB"/>
+    <w:bookmarkEnd w:id="71"/>
+    <w:bookmarkStart w:id="73" w:name="ref-glmmTMB"/>
     <w:p>
       <w:pPr>
         <w:pStyle w:val="Bibliography"/>
@@ -21271,7 +21296,7 @@
       <w:r>
         <w:t xml:space="preserve">. 2017;9(2):378-400. doi:</w:t>
       </w:r>
-      <w:hyperlink r:id="rId70">
+      <w:hyperlink r:id="rId72">
         <w:r>
           <w:rPr>
             <w:rStyle w:val="Hyperlink"/>
@@ -21280,8 +21305,8 @@
         </w:r>
       </w:hyperlink>
     </w:p>
-    <w:bookmarkEnd w:id="71"/>
-    <w:bookmarkStart w:id="73" w:name="ref-strobe"/>
+    <w:bookmarkEnd w:id="73"/>
+    <w:bookmarkStart w:id="75" w:name="ref-strobe"/>
     <w:p>
       <w:pPr>
         <w:pStyle w:val="Bibliography"/>
@@ -21371,7 +21396,7 @@
       <w:r>
         <w:t xml:space="preserve">. 2007;147(8):573-577. doi:</w:t>
       </w:r>
-      <w:hyperlink r:id="rId72">
+      <w:hyperlink r:id="rId74">
         <w:r>
           <w:rPr>
             <w:rStyle w:val="Hyperlink"/>
@@ -21380,8 +21405,8 @@
         </w:r>
       </w:hyperlink>
     </w:p>
-    <w:bookmarkEnd w:id="73"/>
-    <w:bookmarkStart w:id="75" w:name="ref-corbisiero2024"/>
+    <w:bookmarkEnd w:id="75"/>
+    <w:bookmarkStart w:id="77" w:name="ref-corbisiero2024"/>
     <w:p>
       <w:pPr>
         <w:pStyle w:val="Bibliography"/>
@@ -21420,7 +21445,7 @@
       <w:r>
         <w:t xml:space="preserve">. 2024;171(1):98-108. doi:</w:t>
       </w:r>
-      <w:hyperlink r:id="rId74">
+      <w:hyperlink r:id="rId76">
         <w:r>
           <w:rPr>
             <w:rStyle w:val="Hyperlink"/>
@@ -21429,8 +21454,8 @@
         </w:r>
       </w:hyperlink>
     </w:p>
-    <w:bookmarkEnd w:id="75"/>
-    <w:bookmarkStart w:id="77" w:name="ref-saeedi2025"/>
+    <w:bookmarkEnd w:id="77"/>
+    <w:bookmarkStart w:id="79" w:name="ref-saeedi2025"/>
     <w:p>
       <w:pPr>
         <w:pStyle w:val="Bibliography"/>
@@ -21469,7 +21494,7 @@
       <w:r>
         <w:t xml:space="preserve">. 2025;17(9):e91744. doi:</w:t>
       </w:r>
-      <w:hyperlink r:id="rId76">
+      <w:hyperlink r:id="rId78">
         <w:r>
           <w:rPr>
             <w:rStyle w:val="Hyperlink"/>
@@ -21478,9 +21503,9 @@
         </w:r>
       </w:hyperlink>
     </w:p>
-    <w:bookmarkEnd w:id="77"/>
-    <w:bookmarkEnd w:id="78"/>
     <w:bookmarkEnd w:id="79"/>
+    <w:bookmarkEnd w:id="80"/>
+    <w:bookmarkEnd w:id="81"/>
     <w:sectPr>
       <w:footnotePr>
         <w:numRestart w:val="eachSect"/>

</xml_diff>

<commit_message>
Add clinical delayed-evaluation source to Introduction
The opening clinical claim (timely evaluation influences outcome) now cites a
dedicated clinical-outcomes source instead of the access-methodology paper:
Graboyes EM, Kompelli AR, Neskey DM, et al. Association of Treatment Delays With
Survival for Patients With Head and Neck Cancer: A Systematic Review. JAMA
Otolaryngol Head Neck Surg. 2019;145(2):166-177. doi:10.1001/jamaoto.2018.2716.
Bisgaier & Rhodes remains at the mystery-caller methodology sentence. Reworded
the sentence to name the diagnosis-to-treatment-interval / survival link the
review documents.

Co-Authored-By: Claude Opus 4.8 (1M context) <noreply@anthropic.com>
</commit_message>
<xml_diff>
--- a/manuscript_output/manuscript_mystery_caller.docx
+++ b/manuscript_output/manuscript_mystery_caller.docx
@@ -154,9 +154,9 @@
         <w:pStyle w:val="FirstParagraph"/>
       </w:pPr>
       <w:r>
-        <w:t xml:space="preserve">Otolaryngologic conditions—from chronic rhinosinusitis and otitis media to airway disorders and head-and-neck malignancy—are among the most common reasons patients seek specialty care, and for many of these conditions timely evaluation influences diagnosis and outcome</w:t>
-      </w:r>
-      <w:hyperlink w:anchor="ref-bisgaier2011">
+        <w:t xml:space="preserve">Otolaryngologic conditions—from chronic rhinosinusitis and otitis media to airway disorders and head-and-neck malignancy—are among the most common reasons patients seek specialty care, and for many of these conditions timely evaluation influences diagnosis and outcome, with delays in the diagnosis-to-treatment interval associated with worse survival in head-and-neck cancer</w:t>
+      </w:r>
+      <w:hyperlink w:anchor="ref-graboyes2019">
         <w:r>
           <w:rPr>
             <w:rStyle w:val="Hyperlink"/>
@@ -222,7 +222,7 @@
             <w:rStyle w:val="Hyperlink"/>
             <w:vertAlign w:val="superscript"/>
           </w:rPr>
-          <w:t xml:space="preserve">1</w:t>
+          <w:t xml:space="preserve">2</w:t>
         </w:r>
       </w:hyperlink>
       <w:r>
@@ -261,193 +261,6 @@
         <w:t xml:space="preserve">environment of the practice—local physician supply, the generosity of the state Medicaid fee schedule, community social vulnerability, the share of dual-eligible beneficiaries, and rurality</w:t>
       </w:r>
       <w:hyperlink w:anchor="ref-vickery2016">
-        <w:r>
-          <w:rPr>
-            <w:rStyle w:val="Hyperlink"/>
-            <w:vertAlign w:val="superscript"/>
-          </w:rPr>
-          <w:t xml:space="preserve">2</w:t>
-        </w:r>
-      </w:hyperlink>
-      <w:r>
-        <w:t xml:space="preserve">.</w:t>
-      </w:r>
-    </w:p>
-    <w:p>
-      <w:pPr>
-        <w:pStyle w:val="BodyText"/>
-      </w:pPr>
-      <w:r>
-        <w:t xml:space="preserve">We conducted a national mystery-caller study of board-certified otolaryngologists to quantify how the requested subspecialty and the geographic-contextual environment relate to (1) whether a new-patient appointment is offered and (2) the business-day wait when one is offered. To keep these two dimensions of access distinct, we analyzed them with a two-part model.</w:t>
-      </w:r>
-    </w:p>
-    <w:bookmarkEnd w:id="21"/>
-    <w:bookmarkStart w:id="27" w:name="methods"/>
-    <w:p>
-      <w:pPr>
-        <w:pStyle w:val="Heading2"/>
-      </w:pPr>
-      <w:r>
-        <w:t xml:space="preserve">Methods</w:t>
-      </w:r>
-    </w:p>
-    <w:bookmarkStart w:id="22" w:name="study-design-and-sample"/>
-    <w:p>
-      <w:pPr>
-        <w:pStyle w:val="Heading3"/>
-      </w:pPr>
-      <w:r>
-        <w:t xml:space="preserve">Study design and sample</w:t>
-      </w:r>
-    </w:p>
-    <w:p>
-      <w:pPr>
-        <w:pStyle w:val="FirstParagraph"/>
-      </w:pPr>
-      <w:r>
-        <w:t xml:space="preserve">We conducted a cross-sectional, simulated-patient (</w:t>
-      </w:r>
-      <w:r>
-        <w:t xml:space="preserve">“mystery caller”</w:t>
-      </w:r>
-      <w:r>
-        <w:t xml:space="preserve">) study of access to otolaryngology (ENT) care in the United States. Trained callers telephoned a national sample of practicing, board-certified otolaryngologists and, following a standardized script, requested a new-patient appointment for a subspecialty-matched chief complaint. Each sampled physician was contacted once.</w:t>
-      </w:r>
-      <w:r>
-        <w:t xml:space="preserve"> </w:t>
-      </w:r>
-      <w:r>
-        <w:rPr>
-          <w:i/>
-          <w:iCs/>
-        </w:rPr>
-        <w:t xml:space="preserve">[Describe the sampling frame and its size, the number and timing of call attempts before a call was recorded as unreachable, the scripted chief complaints, caller training, and the study period.]</w:t>
-      </w:r>
-      <w:r>
-        <w:t xml:space="preserve"> </w:t>
-      </w:r>
-      <w:r>
-        <w:t xml:space="preserve">The protocol was</w:t>
-      </w:r>
-      <w:r>
-        <w:t xml:space="preserve"> </w:t>
-      </w:r>
-      <w:r>
-        <w:rPr>
-          <w:i/>
-          <w:iCs/>
-        </w:rPr>
-        <w:t xml:space="preserve">[reviewed/deemed exempt]</w:t>
-      </w:r>
-      <w:r>
-        <w:t xml:space="preserve"> </w:t>
-      </w:r>
-      <w:r>
-        <w:t xml:space="preserve">by the</w:t>
-      </w:r>
-      <w:r>
-        <w:t xml:space="preserve"> </w:t>
-      </w:r>
-      <w:r>
-        <w:rPr>
-          <w:i/>
-          <w:iCs/>
-        </w:rPr>
-        <w:t xml:space="preserve">[institution]</w:t>
-      </w:r>
-      <w:r>
-        <w:t xml:space="preserve"> </w:t>
-      </w:r>
-      <w:r>
-        <w:t xml:space="preserve">Institutional Review Board.</w:t>
-      </w:r>
-    </w:p>
-    <w:p>
-      <w:pPr>
-        <w:pStyle w:val="BodyText"/>
-      </w:pPr>
-      <w:r>
-        <w:t xml:space="preserve">Analyses were restricted to calls with a completed data-collection record and a determinable physician subspecialty. This study did not manipulate patient insurance; the exposures of interest were the requested subspecialty and the geographic context of the practice.</w:t>
-      </w:r>
-    </w:p>
-    <w:bookmarkEnd w:id="22"/>
-    <w:bookmarkStart w:id="23" w:name="outcomes"/>
-    <w:p>
-      <w:pPr>
-        <w:pStyle w:val="Heading3"/>
-      </w:pPr>
-      <w:r>
-        <w:t xml:space="preserve">Outcomes</w:t>
-      </w:r>
-    </w:p>
-    <w:p>
-      <w:pPr>
-        <w:pStyle w:val="FirstParagraph"/>
-      </w:pPr>
-      <w:r>
-        <w:t xml:space="preserve">Two outcomes were analyzed as a two-part (hurdle) process. The first,</w:t>
-      </w:r>
-      <w:r>
-        <w:t xml:space="preserve"> </w:t>
-      </w:r>
-      <w:r>
-        <w:rPr>
-          <w:i/>
-          <w:iCs/>
-        </w:rPr>
-        <w:t xml:space="preserve">access</w:t>
-      </w:r>
-      <w:r>
-        <w:t xml:space="preserve">, was whether the office offered a new-patient appointment with the sampled physician (binary). The second,</w:t>
-      </w:r>
-      <w:r>
-        <w:t xml:space="preserve"> </w:t>
-      </w:r>
-      <w:r>
-        <w:rPr>
-          <w:i/>
-          <w:iCs/>
-        </w:rPr>
-        <w:t xml:space="preserve">timeliness</w:t>
-      </w:r>
-      <w:r>
-        <w:t xml:space="preserve">, was the number of</w:t>
-      </w:r>
-      <w:r>
-        <w:t xml:space="preserve"> </w:t>
-      </w:r>
-      <w:r>
-        <w:rPr>
-          <w:b/>
-          <w:bCs/>
-        </w:rPr>
-        <w:t xml:space="preserve">business days</w:t>
-      </w:r>
-      <w:r>
-        <w:t xml:space="preserve"> </w:t>
-      </w:r>
-      <w:r>
-        <w:t xml:space="preserve">from the call to the next available appointment, counted excluding weekends and U.S. federal holidays, and defined only for calls in which an appointment was offered.</w:t>
-      </w:r>
-    </w:p>
-    <w:bookmarkEnd w:id="23"/>
-    <w:bookmarkStart w:id="24" w:name="geographic-covariates"/>
-    <w:p>
-      <w:pPr>
-        <w:pStyle w:val="Heading3"/>
-      </w:pPr>
-      <w:r>
-        <w:t xml:space="preserve">Geographic covariates</w:t>
-      </w:r>
-    </w:p>
-    <w:p>
-      <w:pPr>
-        <w:pStyle w:val="FirstParagraph"/>
-      </w:pPr>
-      <w:r>
-        <w:t xml:space="preserve">Each practice was linked to contextual covariates by practice ZIP code and state. County was assigned from a 2020 Census ZCTA-to-county crosswalk (dominant county by land area). Covariates comprised: county otolaryngologist supply per 100,000 population; the state Medicaid-to-Medicare fee index (Kaiser Family Foundation, 2024, all services)</w:t>
-      </w:r>
-      <w:hyperlink w:anchor="ref-kfffee">
         <w:r>
           <w:rPr>
             <w:rStyle w:val="Hyperlink"/>
@@ -457,9 +270,184 @@
         </w:r>
       </w:hyperlink>
       <w:r>
-        <w:t xml:space="preserve">; the CDC/ATSDR Social Vulnerability Index (SVI, 2022, tract-level, population-weighted to the practice ZIP)</w:t>
-      </w:r>
-      <w:hyperlink w:anchor="ref-cdcsvi">
+        <w:t xml:space="preserve">.</w:t>
+      </w:r>
+    </w:p>
+    <w:p>
+      <w:pPr>
+        <w:pStyle w:val="BodyText"/>
+      </w:pPr>
+      <w:r>
+        <w:t xml:space="preserve">We conducted a national mystery-caller study of board-certified otolaryngologists to quantify how the requested subspecialty and the geographic-contextual environment relate to (1) whether a new-patient appointment is offered and (2) the business-day wait when one is offered. To keep these two dimensions of access distinct, we analyzed them with a two-part model.</w:t>
+      </w:r>
+    </w:p>
+    <w:bookmarkEnd w:id="21"/>
+    <w:bookmarkStart w:id="27" w:name="methods"/>
+    <w:p>
+      <w:pPr>
+        <w:pStyle w:val="Heading2"/>
+      </w:pPr>
+      <w:r>
+        <w:t xml:space="preserve">Methods</w:t>
+      </w:r>
+    </w:p>
+    <w:bookmarkStart w:id="22" w:name="study-design-and-sample"/>
+    <w:p>
+      <w:pPr>
+        <w:pStyle w:val="Heading3"/>
+      </w:pPr>
+      <w:r>
+        <w:t xml:space="preserve">Study design and sample</w:t>
+      </w:r>
+    </w:p>
+    <w:p>
+      <w:pPr>
+        <w:pStyle w:val="FirstParagraph"/>
+      </w:pPr>
+      <w:r>
+        <w:t xml:space="preserve">We conducted a cross-sectional, simulated-patient (</w:t>
+      </w:r>
+      <w:r>
+        <w:t xml:space="preserve">“mystery caller”</w:t>
+      </w:r>
+      <w:r>
+        <w:t xml:space="preserve">) study of access to otolaryngology (ENT) care in the United States. Trained callers telephoned a national sample of practicing, board-certified otolaryngologists and, following a standardized script, requested a new-patient appointment for a subspecialty-matched chief complaint. Each sampled physician was contacted once.</w:t>
+      </w:r>
+      <w:r>
+        <w:t xml:space="preserve"> </w:t>
+      </w:r>
+      <w:r>
+        <w:rPr>
+          <w:i/>
+          <w:iCs/>
+        </w:rPr>
+        <w:t xml:space="preserve">[Describe the sampling frame and its size, the number and timing of call attempts before a call was recorded as unreachable, the scripted chief complaints, caller training, and the study period.]</w:t>
+      </w:r>
+      <w:r>
+        <w:t xml:space="preserve"> </w:t>
+      </w:r>
+      <w:r>
+        <w:t xml:space="preserve">The protocol was</w:t>
+      </w:r>
+      <w:r>
+        <w:t xml:space="preserve"> </w:t>
+      </w:r>
+      <w:r>
+        <w:rPr>
+          <w:i/>
+          <w:iCs/>
+        </w:rPr>
+        <w:t xml:space="preserve">[reviewed/deemed exempt]</w:t>
+      </w:r>
+      <w:r>
+        <w:t xml:space="preserve"> </w:t>
+      </w:r>
+      <w:r>
+        <w:t xml:space="preserve">by the</w:t>
+      </w:r>
+      <w:r>
+        <w:t xml:space="preserve"> </w:t>
+      </w:r>
+      <w:r>
+        <w:rPr>
+          <w:i/>
+          <w:iCs/>
+        </w:rPr>
+        <w:t xml:space="preserve">[institution]</w:t>
+      </w:r>
+      <w:r>
+        <w:t xml:space="preserve"> </w:t>
+      </w:r>
+      <w:r>
+        <w:t xml:space="preserve">Institutional Review Board.</w:t>
+      </w:r>
+    </w:p>
+    <w:p>
+      <w:pPr>
+        <w:pStyle w:val="BodyText"/>
+      </w:pPr>
+      <w:r>
+        <w:t xml:space="preserve">Analyses were restricted to calls with a completed data-collection record and a determinable physician subspecialty. This study did not manipulate patient insurance; the exposures of interest were the requested subspecialty and the geographic context of the practice.</w:t>
+      </w:r>
+    </w:p>
+    <w:bookmarkEnd w:id="22"/>
+    <w:bookmarkStart w:id="23" w:name="outcomes"/>
+    <w:p>
+      <w:pPr>
+        <w:pStyle w:val="Heading3"/>
+      </w:pPr>
+      <w:r>
+        <w:t xml:space="preserve">Outcomes</w:t>
+      </w:r>
+    </w:p>
+    <w:p>
+      <w:pPr>
+        <w:pStyle w:val="FirstParagraph"/>
+      </w:pPr>
+      <w:r>
+        <w:t xml:space="preserve">Two outcomes were analyzed as a two-part (hurdle) process. The first,</w:t>
+      </w:r>
+      <w:r>
+        <w:t xml:space="preserve"> </w:t>
+      </w:r>
+      <w:r>
+        <w:rPr>
+          <w:i/>
+          <w:iCs/>
+        </w:rPr>
+        <w:t xml:space="preserve">access</w:t>
+      </w:r>
+      <w:r>
+        <w:t xml:space="preserve">, was whether the office offered a new-patient appointment with the sampled physician (binary). The second,</w:t>
+      </w:r>
+      <w:r>
+        <w:t xml:space="preserve"> </w:t>
+      </w:r>
+      <w:r>
+        <w:rPr>
+          <w:i/>
+          <w:iCs/>
+        </w:rPr>
+        <w:t xml:space="preserve">timeliness</w:t>
+      </w:r>
+      <w:r>
+        <w:t xml:space="preserve">, was the number of</w:t>
+      </w:r>
+      <w:r>
+        <w:t xml:space="preserve"> </w:t>
+      </w:r>
+      <w:r>
+        <w:rPr>
+          <w:b/>
+          <w:bCs/>
+        </w:rPr>
+        <w:t xml:space="preserve">business days</w:t>
+      </w:r>
+      <w:r>
+        <w:t xml:space="preserve"> </w:t>
+      </w:r>
+      <w:r>
+        <w:t xml:space="preserve">from the call to the next available appointment, counted excluding weekends and U.S. federal holidays, and defined only for calls in which an appointment was offered.</w:t>
+      </w:r>
+    </w:p>
+    <w:bookmarkEnd w:id="23"/>
+    <w:bookmarkStart w:id="24" w:name="geographic-covariates"/>
+    <w:p>
+      <w:pPr>
+        <w:pStyle w:val="Heading3"/>
+      </w:pPr>
+      <w:r>
+        <w:t xml:space="preserve">Geographic covariates</w:t>
+      </w:r>
+    </w:p>
+    <w:p>
+      <w:pPr>
+        <w:pStyle w:val="FirstParagraph"/>
+      </w:pPr>
+      <w:r>
+        <w:t xml:space="preserve">Each practice was linked to contextual covariates by practice ZIP code and state. County was assigned from a 2020 Census ZCTA-to-county crosswalk (dominant county by land area). Covariates comprised: county otolaryngologist supply per 100,000 population; the state Medicaid-to-Medicare fee index (Kaiser Family Foundation, 2024, all services)</w:t>
+      </w:r>
+      <w:hyperlink w:anchor="ref-kfffee">
         <w:r>
           <w:rPr>
             <w:rStyle w:val="Hyperlink"/>
@@ -469,67 +457,9 @@
         </w:r>
       </w:hyperlink>
       <w:r>
-        <w:t xml:space="preserve">; the county fraction of Medicare beneficiaries dual-eligible for Medicaid (CMS); metropolitan hospital-market concentration (Herfindahl–Hirschman Index [HHI], KFF 2024; available for metropolitan areas only); rurality, dichotomized from Rural–Urban Commuting Area (RUCA) codes as urban (RUCA 1–3) versus rural (RUCA 4–10); and the American Academy of Otolaryngology–Head and Neck Surgery (AAO-HNS) Board of Governors region.</w:t>
-      </w:r>
-    </w:p>
-    <w:bookmarkEnd w:id="24"/>
-    <w:bookmarkStart w:id="25" w:name="statistical-analysis"/>
-    <w:p>
-      <w:pPr>
-        <w:pStyle w:val="Heading3"/>
-      </w:pPr>
-      <w:r>
-        <w:t xml:space="preserve">Statistical analysis</w:t>
-      </w:r>
-    </w:p>
-    <w:p>
-      <w:pPr>
-        <w:pStyle w:val="FirstParagraph"/>
-      </w:pPr>
-      <w:r>
-        <w:t xml:space="preserve">Because business-day wait time is observed only when an appointment is offered, we modeled access and timeliness separately to avoid conditioning wait-time estimates on the offer.</w:t>
-      </w:r>
-      <w:r>
-        <w:t xml:space="preserve"> </w:t>
-      </w:r>
-      <w:r>
-        <w:rPr>
-          <w:i/>
-          <w:iCs/>
-        </w:rPr>
-        <w:t xml:space="preserve">Access</w:t>
-      </w:r>
-      <w:r>
-        <w:t xml:space="preserve"> </w:t>
-      </w:r>
-      <w:r>
-        <w:t xml:space="preserve">was modeled with a mixed-effects logistic regression over all analytic calls;</w:t>
-      </w:r>
-      <w:r>
-        <w:t xml:space="preserve"> </w:t>
-      </w:r>
-      <w:r>
-        <w:rPr>
-          <w:i/>
-          <w:iCs/>
-        </w:rPr>
-        <w:t xml:space="preserve">timeliness</w:t>
-      </w:r>
-      <w:r>
-        <w:t xml:space="preserve"> </w:t>
-      </w:r>
-      <w:r>
-        <w:t xml:space="preserve">with a mixed-effects negative binomial regression over the offered subset. The negative binomial distribution was selected over Poisson on the basis of substantial overdispersion (Pearson φ = 6.22). Both models included a random intercept for core-based statistical area (CBSA; county FIPS where CBSA was undefined) to account for within-market correlation, and adjusted for the requested subspecialty (reference: general otolaryngology), county ENT supply, Medicaid fee index, SVI, dual-eligible fraction, and rurality (reference: urban). The identity of the caller (research assistant) was included as a fixed nuisance term. Continuous covariates were standardized and, for the few missing values (&lt;3%), median-imputed.</w:t>
-      </w:r>
-    </w:p>
-    <w:p>
-      <w:pPr>
-        <w:pStyle w:val="BodyText"/>
-      </w:pPr>
-      <w:r>
-        <w:t xml:space="preserve">Effects are reported as odds ratios (access) and incidence rate ratios (timeliness) with 95% Wald confidence intervals. Pairwise differences between subspecialties were estimated with Tukey-adjusted estimated marginal means</w:t>
-      </w:r>
-      <w:hyperlink w:anchor="ref-emmeans">
+        <w:t xml:space="preserve">; the CDC/ATSDR Social Vulnerability Index (SVI, 2022, tract-level, population-weighted to the practice ZIP)</w:t>
+      </w:r>
+      <w:hyperlink w:anchor="ref-cdcsvi">
         <w:r>
           <w:rPr>
             <w:rStyle w:val="Hyperlink"/>
@@ -539,9 +469,67 @@
         </w:r>
       </w:hyperlink>
       <w:r>
-        <w:t xml:space="preserve">. Effect modification of the geographic covariates by subspecialty was tested by likelihood-ratio tests. Market-level clustering was summarized by the intraclass correlation coefficient (ICC). Because the HHI is defined only in metropolitan areas, its association with timeliness was assessed in a sensitivity model restricted to the metropolitan subset. Whether call incompleteness was related to the measured covariates was assessed with chi-square and Wilcoxon rank-sum tests. Analyses used R 4.4.2</w:t>
-      </w:r>
-      <w:hyperlink w:anchor="ref-rcoreteam">
+        <w:t xml:space="preserve">; the county fraction of Medicare beneficiaries dual-eligible for Medicaid (CMS); metropolitan hospital-market concentration (Herfindahl–Hirschman Index [HHI], KFF 2024; available for metropolitan areas only); rurality, dichotomized from Rural–Urban Commuting Area (RUCA) codes as urban (RUCA 1–3) versus rural (RUCA 4–10); and the American Academy of Otolaryngology–Head and Neck Surgery (AAO-HNS) Board of Governors region.</w:t>
+      </w:r>
+    </w:p>
+    <w:bookmarkEnd w:id="24"/>
+    <w:bookmarkStart w:id="25" w:name="statistical-analysis"/>
+    <w:p>
+      <w:pPr>
+        <w:pStyle w:val="Heading3"/>
+      </w:pPr>
+      <w:r>
+        <w:t xml:space="preserve">Statistical analysis</w:t>
+      </w:r>
+    </w:p>
+    <w:p>
+      <w:pPr>
+        <w:pStyle w:val="FirstParagraph"/>
+      </w:pPr>
+      <w:r>
+        <w:t xml:space="preserve">Because business-day wait time is observed only when an appointment is offered, we modeled access and timeliness separately to avoid conditioning wait-time estimates on the offer.</w:t>
+      </w:r>
+      <w:r>
+        <w:t xml:space="preserve"> </w:t>
+      </w:r>
+      <w:r>
+        <w:rPr>
+          <w:i/>
+          <w:iCs/>
+        </w:rPr>
+        <w:t xml:space="preserve">Access</w:t>
+      </w:r>
+      <w:r>
+        <w:t xml:space="preserve"> </w:t>
+      </w:r>
+      <w:r>
+        <w:t xml:space="preserve">was modeled with a mixed-effects logistic regression over all analytic calls;</w:t>
+      </w:r>
+      <w:r>
+        <w:t xml:space="preserve"> </w:t>
+      </w:r>
+      <w:r>
+        <w:rPr>
+          <w:i/>
+          <w:iCs/>
+        </w:rPr>
+        <w:t xml:space="preserve">timeliness</w:t>
+      </w:r>
+      <w:r>
+        <w:t xml:space="preserve"> </w:t>
+      </w:r>
+      <w:r>
+        <w:t xml:space="preserve">with a mixed-effects negative binomial regression over the offered subset. The negative binomial distribution was selected over Poisson on the basis of substantial overdispersion (Pearson φ = 6.22). Both models included a random intercept for core-based statistical area (CBSA; county FIPS where CBSA was undefined) to account for within-market correlation, and adjusted for the requested subspecialty (reference: general otolaryngology), county ENT supply, Medicaid fee index, SVI, dual-eligible fraction, and rurality (reference: urban). The identity of the caller (research assistant) was included as a fixed nuisance term. Continuous covariates were standardized and, for the few missing values (&lt;3%), median-imputed.</w:t>
+      </w:r>
+    </w:p>
+    <w:p>
+      <w:pPr>
+        <w:pStyle w:val="BodyText"/>
+      </w:pPr>
+      <w:r>
+        <w:t xml:space="preserve">Effects are reported as odds ratios (access) and incidence rate ratios (timeliness) with 95% Wald confidence intervals. Pairwise differences between subspecialties were estimated with Tukey-adjusted estimated marginal means</w:t>
+      </w:r>
+      <w:hyperlink w:anchor="ref-emmeans">
         <w:r>
           <w:rPr>
             <w:rStyle w:val="Hyperlink"/>
@@ -551,21 +539,9 @@
         </w:r>
       </w:hyperlink>
       <w:r>
-        <w:t xml:space="preserve"> </w:t>
-      </w:r>
-      <w:r>
-        <w:t xml:space="preserve">(packages</w:t>
-      </w:r>
-      <w:r>
-        <w:t xml:space="preserve"> </w:t>
-      </w:r>
-      <w:r>
-        <w:rPr>
-          <w:rStyle w:val="VerbatimChar"/>
-        </w:rPr>
-        <w:t xml:space="preserve">glmmTMB</w:t>
-      </w:r>
-      <w:hyperlink w:anchor="ref-glmmTMB">
+        <w:t xml:space="preserve">. Effect modification of the geographic covariates by subspecialty was tested by likelihood-ratio tests. Market-level clustering was summarized by the intraclass correlation coefficient (ICC). Because the HHI is defined only in metropolitan areas, its association with timeliness was assessed in a sensitivity model restricted to the metropolitan subset. Whether call incompleteness was related to the measured covariates was assessed with chi-square and Wilcoxon rank-sum tests. Analyses used R 4.4.2</w:t>
+      </w:r>
+      <w:hyperlink w:anchor="ref-rcoreteam">
         <w:r>
           <w:rPr>
             <w:rStyle w:val="Hyperlink"/>
@@ -575,7 +551,10 @@
         </w:r>
       </w:hyperlink>
       <w:r>
-        <w:t xml:space="preserve">,</w:t>
+        <w:t xml:space="preserve"> </w:t>
+      </w:r>
+      <w:r>
+        <w:t xml:space="preserve">(packages</w:t>
       </w:r>
       <w:r>
         <w:t xml:space="preserve"> </w:t>
@@ -584,33 +563,9 @@
         <w:rPr>
           <w:rStyle w:val="VerbatimChar"/>
         </w:rPr>
-        <w:t xml:space="preserve">emmeans</w:t>
-      </w:r>
-      <w:hyperlink w:anchor="ref-emmeans">
-        <w:r>
-          <w:rPr>
-            <w:rStyle w:val="Hyperlink"/>
-            <w:vertAlign w:val="superscript"/>
-          </w:rPr>
-          <w:t xml:space="preserve">5</w:t>
-        </w:r>
-      </w:hyperlink>
-      <w:r>
-        <w:t xml:space="preserve">, and the study package</w:t>
-      </w:r>
-      <w:r>
-        <w:t xml:space="preserve"> </w:t>
-      </w:r>
-      <w:r>
-        <w:rPr>
-          <w:rStyle w:val="VerbatimChar"/>
-        </w:rPr>
-        <w:t xml:space="preserve">mysterycall</w:t>
-      </w:r>
-      <w:r>
-        <w:t xml:space="preserve">); two-sided α = 0.05. Reporting follows the STROBE guideline for observational studies</w:t>
-      </w:r>
-      <w:hyperlink w:anchor="ref-strobe">
+        <w:t xml:space="preserve">glmmTMB</w:t>
+      </w:r>
+      <w:hyperlink w:anchor="ref-glmmTMB">
         <w:r>
           <w:rPr>
             <w:rStyle w:val="Hyperlink"/>
@@ -620,43 +575,42 @@
         </w:r>
       </w:hyperlink>
       <w:r>
-        <w:t xml:space="preserve">.</w:t>
-      </w:r>
-    </w:p>
-    <w:bookmarkEnd w:id="25"/>
-    <w:bookmarkStart w:id="26" w:name="sample-size-and-power"/>
-    <w:p>
-      <w:pPr>
-        <w:pStyle w:val="Heading3"/>
-      </w:pPr>
-      <w:r>
-        <w:t xml:space="preserve">Sample size and power</w:t>
-      </w:r>
-    </w:p>
-    <w:p>
-      <w:pPr>
-        <w:pStyle w:val="FirstParagraph"/>
-      </w:pPr>
-      <w:r>
-        <w:t xml:space="preserve">The sample size was fixed</w:t>
+        <w:t xml:space="preserve">,</w:t>
       </w:r>
       <w:r>
         <w:t xml:space="preserve"> </w:t>
       </w:r>
       <w:r>
         <w:rPr>
-          <w:i/>
-          <w:iCs/>
+          <w:rStyle w:val="VerbatimChar"/>
         </w:rPr>
-        <w:t xml:space="preserve">a priori</w:t>
+        <w:t xml:space="preserve">emmeans</w:t>
+      </w:r>
+      <w:hyperlink w:anchor="ref-emmeans">
+        <w:r>
+          <w:rPr>
+            <w:rStyle w:val="Hyperlink"/>
+            <w:vertAlign w:val="superscript"/>
+          </w:rPr>
+          <w:t xml:space="preserve">6</w:t>
+        </w:r>
+      </w:hyperlink>
+      <w:r>
+        <w:t xml:space="preserve">, and the study package</w:t>
       </w:r>
       <w:r>
         <w:t xml:space="preserve"> </w:t>
       </w:r>
       <w:r>
-        <w:t xml:space="preserve">by a call budget of 800, with the rural-versus-urban difference in business-day wait time as the primary contrast. The power analysis was pre-specified before data collection and implemented in a purpose-built simulation application. Its assumptions were anchored to empirical data rather than convention: the expected rural wait penalty, the negative binomial dispersion (φ = 1.7), and the state-level intraclass correlation (ICC = 0.08) were estimated by pooling 273 rural otolaryngology observations from two published access series</w:t>
-      </w:r>
-      <w:hyperlink w:anchor="ref-corbisiero2024">
+        <w:rPr>
+          <w:rStyle w:val="VerbatimChar"/>
+        </w:rPr>
+        <w:t xml:space="preserve">mysterycall</w:t>
+      </w:r>
+      <w:r>
+        <w:t xml:space="preserve">); two-sided α = 0.05. Reporting follows the STROBE guideline for observational studies</w:t>
+      </w:r>
+      <w:hyperlink w:anchor="ref-strobe">
         <w:r>
           <w:rPr>
             <w:rStyle w:val="Hyperlink"/>
@@ -666,6 +620,52 @@
         </w:r>
       </w:hyperlink>
       <w:r>
+        <w:t xml:space="preserve">.</w:t>
+      </w:r>
+    </w:p>
+    <w:bookmarkEnd w:id="25"/>
+    <w:bookmarkStart w:id="26" w:name="sample-size-and-power"/>
+    <w:p>
+      <w:pPr>
+        <w:pStyle w:val="Heading3"/>
+      </w:pPr>
+      <w:r>
+        <w:t xml:space="preserve">Sample size and power</w:t>
+      </w:r>
+    </w:p>
+    <w:p>
+      <w:pPr>
+        <w:pStyle w:val="FirstParagraph"/>
+      </w:pPr>
+      <w:r>
+        <w:t xml:space="preserve">The sample size was fixed</w:t>
+      </w:r>
+      <w:r>
+        <w:t xml:space="preserve"> </w:t>
+      </w:r>
+      <w:r>
+        <w:rPr>
+          <w:i/>
+          <w:iCs/>
+        </w:rPr>
+        <w:t xml:space="preserve">a priori</w:t>
+      </w:r>
+      <w:r>
+        <w:t xml:space="preserve"> </w:t>
+      </w:r>
+      <w:r>
+        <w:t xml:space="preserve">by a call budget of 800, with the rural-versus-urban difference in business-day wait time as the primary contrast. The power analysis was pre-specified before data collection and implemented in a purpose-built simulation application. Its assumptions were anchored to empirical data rather than convention: the expected rural wait penalty, the negative binomial dispersion (φ = 1.7), and the state-level intraclass correlation (ICC = 0.08) were estimated by pooling 273 rural otolaryngology observations from two published access series</w:t>
+      </w:r>
+      <w:hyperlink w:anchor="ref-corbisiero2024">
+        <w:r>
+          <w:rPr>
+            <w:rStyle w:val="Hyperlink"/>
+            <w:vertAlign w:val="superscript"/>
+          </w:rPr>
+          <w:t xml:space="preserve">10</w:t>
+        </w:r>
+      </w:hyperlink>
+      <w:r>
         <w:rPr>
           <w:vertAlign w:val="superscript"/>
         </w:rPr>
@@ -677,7 +677,7 @@
             <w:rStyle w:val="Hyperlink"/>
             <w:vertAlign w:val="superscript"/>
           </w:rPr>
-          <w:t xml:space="preserve">10</w:t>
+          <w:t xml:space="preserve">11</w:t>
         </w:r>
       </w:hyperlink>
       <w:r>
@@ -21019,7 +21019,7 @@
     </w:p>
     <w:bookmarkEnd w:id="60"/>
     <w:bookmarkEnd w:id="61"/>
-    <w:bookmarkStart w:id="81" w:name="references"/>
+    <w:bookmarkStart w:id="83" w:name="references"/>
     <w:p>
       <w:pPr>
         <w:pStyle w:val="Heading1"/>
@@ -21028,14 +21028,54 @@
         <w:t xml:space="preserve">References</w:t>
       </w:r>
     </w:p>
-    <w:bookmarkStart w:id="80" w:name="refs"/>
-    <w:bookmarkStart w:id="63" w:name="ref-bisgaier2011"/>
+    <w:bookmarkStart w:id="82" w:name="refs"/>
+    <w:bookmarkStart w:id="63" w:name="ref-graboyes2019"/>
     <w:p>
       <w:pPr>
         <w:pStyle w:val="Bibliography"/>
       </w:pPr>
       <w:r>
         <w:t xml:space="preserve">1.</w:t>
+      </w:r>
+      <w:r>
+        <w:t xml:space="preserve"> </w:t>
+      </w:r>
+      <w:r>
+        <w:t xml:space="preserve">	</w:t>
+      </w:r>
+      <w:r>
+        <w:t xml:space="preserve">Graboyes EM, Kompelli AR, Neskey DM, et al. Association of treatment delays with survival for patients with head and neck cancer: A systematic review.</w:t>
+      </w:r>
+      <w:r>
+        <w:t xml:space="preserve"> </w:t>
+      </w:r>
+      <w:r>
+        <w:rPr>
+          <w:i/>
+          <w:iCs/>
+        </w:rPr>
+        <w:t xml:space="preserve">JAMA Otolaryngology–Head &amp; Neck Surgery</w:t>
+      </w:r>
+      <w:r>
+        <w:t xml:space="preserve">. 2019;145(2):166-177. doi:</w:t>
+      </w:r>
+      <w:hyperlink r:id="rId62">
+        <w:r>
+          <w:rPr>
+            <w:rStyle w:val="Hyperlink"/>
+          </w:rPr>
+          <w:t xml:space="preserve">10.1001/jamaoto.2018.2716</w:t>
+        </w:r>
+      </w:hyperlink>
+    </w:p>
+    <w:bookmarkEnd w:id="63"/>
+    <w:bookmarkStart w:id="65" w:name="ref-bisgaier2011"/>
+    <w:p>
+      <w:pPr>
+        <w:pStyle w:val="Bibliography"/>
+      </w:pPr>
+      <w:r>
+        <w:t xml:space="preserve">2.</w:t>
       </w:r>
       <w:r>
         <w:t xml:space="preserve"> </w:t>
@@ -21059,7 +21099,7 @@
       <w:r>
         <w:t xml:space="preserve">. 2011;364(24):2324-2333. doi:</w:t>
       </w:r>
-      <w:hyperlink r:id="rId62">
+      <w:hyperlink r:id="rId64">
         <w:r>
           <w:rPr>
             <w:rStyle w:val="Hyperlink"/>
@@ -21068,14 +21108,14 @@
         </w:r>
       </w:hyperlink>
     </w:p>
-    <w:bookmarkEnd w:id="63"/>
-    <w:bookmarkStart w:id="65" w:name="ref-vickery2016"/>
+    <w:bookmarkEnd w:id="65"/>
+    <w:bookmarkStart w:id="67" w:name="ref-vickery2016"/>
     <w:p>
       <w:pPr>
         <w:pStyle w:val="Bibliography"/>
       </w:pPr>
       <w:r>
-        <w:t xml:space="preserve">2.</w:t>
+        <w:t xml:space="preserve">3.</w:t>
       </w:r>
       <w:r>
         <w:t xml:space="preserve"> </w:t>
@@ -21108,7 +21148,7 @@
       <w:r>
         <w:t xml:space="preserve">. 2016;95(6):218-223. doi:</w:t>
       </w:r>
-      <w:hyperlink r:id="rId64">
+      <w:hyperlink r:id="rId66">
         <w:r>
           <w:rPr>
             <w:rStyle w:val="Hyperlink"/>
@@ -21117,14 +21157,14 @@
         </w:r>
       </w:hyperlink>
     </w:p>
-    <w:bookmarkEnd w:id="65"/>
-    <w:bookmarkStart w:id="66" w:name="ref-kfffee"/>
+    <w:bookmarkEnd w:id="67"/>
+    <w:bookmarkStart w:id="68" w:name="ref-kfffee"/>
     <w:p>
       <w:pPr>
         <w:pStyle w:val="Bibliography"/>
       </w:pPr>
       <w:r>
-        <w:t xml:space="preserve">3.</w:t>
+        <w:t xml:space="preserve">4.</w:t>
       </w:r>
       <w:r>
         <w:t xml:space="preserve"> </w:t>
@@ -21136,14 +21176,14 @@
         <w:t xml:space="preserve">Kaiser Family Foundation. Medicaid-to-medicare fee index. Published online 2024.</w:t>
       </w:r>
     </w:p>
-    <w:bookmarkEnd w:id="66"/>
-    <w:bookmarkStart w:id="67" w:name="ref-cdcsvi"/>
+    <w:bookmarkEnd w:id="68"/>
+    <w:bookmarkStart w:id="69" w:name="ref-cdcsvi"/>
     <w:p>
       <w:pPr>
         <w:pStyle w:val="Bibliography"/>
       </w:pPr>
       <w:r>
-        <w:t xml:space="preserve">4.</w:t>
+        <w:t xml:space="preserve">5.</w:t>
       </w:r>
       <w:r>
         <w:t xml:space="preserve"> </w:t>
@@ -21167,14 +21207,14 @@
         <w:t xml:space="preserve">social vulnerability index (2022 database). Published online 2022.</w:t>
       </w:r>
     </w:p>
-    <w:bookmarkEnd w:id="67"/>
-    <w:bookmarkStart w:id="69" w:name="ref-emmeans"/>
+    <w:bookmarkEnd w:id="69"/>
+    <w:bookmarkStart w:id="71" w:name="ref-emmeans"/>
     <w:p>
       <w:pPr>
         <w:pStyle w:val="Bibliography"/>
       </w:pPr>
       <w:r>
-        <w:t xml:space="preserve">5.</w:t>
+        <w:t xml:space="preserve">6.</w:t>
       </w:r>
       <w:r>
         <w:t xml:space="preserve"> </w:t>
@@ -21201,7 +21241,7 @@
       <w:r>
         <w:t xml:space="preserve"> </w:t>
       </w:r>
-      <w:hyperlink r:id="rId68">
+      <w:hyperlink r:id="rId70">
         <w:r>
           <w:rPr>
             <w:rStyle w:val="Hyperlink"/>
@@ -21210,14 +21250,14 @@
         </w:r>
       </w:hyperlink>
     </w:p>
-    <w:bookmarkEnd w:id="69"/>
-    <w:bookmarkStart w:id="71" w:name="ref-rcoreteam"/>
+    <w:bookmarkEnd w:id="71"/>
+    <w:bookmarkStart w:id="73" w:name="ref-rcoreteam"/>
     <w:p>
       <w:pPr>
         <w:pStyle w:val="Bibliography"/>
       </w:pPr>
       <w:r>
-        <w:t xml:space="preserve">6.</w:t>
+        <w:t xml:space="preserve">7.</w:t>
       </w:r>
       <w:r>
         <w:t xml:space="preserve"> </w:t>
@@ -21244,7 +21284,7 @@
       <w:r>
         <w:t xml:space="preserve"> </w:t>
       </w:r>
-      <w:hyperlink r:id="rId70">
+      <w:hyperlink r:id="rId72">
         <w:r>
           <w:rPr>
             <w:rStyle w:val="Hyperlink"/>
@@ -21253,14 +21293,14 @@
         </w:r>
       </w:hyperlink>
     </w:p>
-    <w:bookmarkEnd w:id="71"/>
-    <w:bookmarkStart w:id="73" w:name="ref-glmmTMB"/>
+    <w:bookmarkEnd w:id="73"/>
+    <w:bookmarkStart w:id="75" w:name="ref-glmmTMB"/>
     <w:p>
       <w:pPr>
         <w:pStyle w:val="Bibliography"/>
       </w:pPr>
       <w:r>
-        <w:t xml:space="preserve">7.</w:t>
+        <w:t xml:space="preserve">8.</w:t>
       </w:r>
       <w:r>
         <w:t xml:space="preserve"> </w:t>
@@ -21296,7 +21336,7 @@
       <w:r>
         <w:t xml:space="preserve">. 2017;9(2):378-400. doi:</w:t>
       </w:r>
-      <w:hyperlink r:id="rId72">
+      <w:hyperlink r:id="rId74">
         <w:r>
           <w:rPr>
             <w:rStyle w:val="Hyperlink"/>
@@ -21305,14 +21345,14 @@
         </w:r>
       </w:hyperlink>
     </w:p>
-    <w:bookmarkEnd w:id="73"/>
-    <w:bookmarkStart w:id="75" w:name="ref-strobe"/>
+    <w:bookmarkEnd w:id="75"/>
+    <w:bookmarkStart w:id="77" w:name="ref-strobe"/>
     <w:p>
       <w:pPr>
         <w:pStyle w:val="Bibliography"/>
       </w:pPr>
       <w:r>
-        <w:t xml:space="preserve">8.</w:t>
+        <w:t xml:space="preserve">9.</w:t>
       </w:r>
       <w:r>
         <w:t xml:space="preserve"> </w:t>
@@ -21396,7 +21436,7 @@
       <w:r>
         <w:t xml:space="preserve">. 2007;147(8):573-577. doi:</w:t>
       </w:r>
-      <w:hyperlink r:id="rId74">
+      <w:hyperlink r:id="rId76">
         <w:r>
           <w:rPr>
             <w:rStyle w:val="Hyperlink"/>
@@ -21405,14 +21445,14 @@
         </w:r>
       </w:hyperlink>
     </w:p>
-    <w:bookmarkEnd w:id="75"/>
-    <w:bookmarkStart w:id="77" w:name="ref-corbisiero2024"/>
+    <w:bookmarkEnd w:id="77"/>
+    <w:bookmarkStart w:id="79" w:name="ref-corbisiero2024"/>
     <w:p>
       <w:pPr>
         <w:pStyle w:val="Bibliography"/>
       </w:pPr>
       <w:r>
-        <w:t xml:space="preserve">9.</w:t>
+        <w:t xml:space="preserve">10.</w:t>
       </w:r>
       <w:r>
         <w:t xml:space="preserve"> </w:t>
@@ -21445,7 +21485,7 @@
       <w:r>
         <w:t xml:space="preserve">. 2024;171(1):98-108. doi:</w:t>
       </w:r>
-      <w:hyperlink r:id="rId76">
+      <w:hyperlink r:id="rId78">
         <w:r>
           <w:rPr>
             <w:rStyle w:val="Hyperlink"/>
@@ -21454,14 +21494,14 @@
         </w:r>
       </w:hyperlink>
     </w:p>
-    <w:bookmarkEnd w:id="77"/>
-    <w:bookmarkStart w:id="79" w:name="ref-saeedi2025"/>
+    <w:bookmarkEnd w:id="79"/>
+    <w:bookmarkStart w:id="81" w:name="ref-saeedi2025"/>
     <w:p>
       <w:pPr>
         <w:pStyle w:val="Bibliography"/>
       </w:pPr>
       <w:r>
-        <w:t xml:space="preserve">10.</w:t>
+        <w:t xml:space="preserve">11.</w:t>
       </w:r>
       <w:r>
         <w:t xml:space="preserve"> </w:t>
@@ -21494,7 +21534,7 @@
       <w:r>
         <w:t xml:space="preserve">. 2025;17(9):e91744. doi:</w:t>
       </w:r>
-      <w:hyperlink r:id="rId78">
+      <w:hyperlink r:id="rId80">
         <w:r>
           <w:rPr>
             <w:rStyle w:val="Hyperlink"/>
@@ -21503,9 +21543,9 @@
         </w:r>
       </w:hyperlink>
     </w:p>
-    <w:bookmarkEnd w:id="79"/>
-    <w:bookmarkEnd w:id="80"/>
     <w:bookmarkEnd w:id="81"/>
+    <w:bookmarkEnd w:id="82"/>
+    <w:bookmarkEnd w:id="83"/>
     <w:sectPr>
       <w:footnotePr>
         <w:numRestart w:val="eachSect"/>

</xml_diff>

<commit_message>
Fill in sampling-frame details in Methods
Populated the sampling paragraph from the data: ABOto board-certified ENT roster
frame (N=11,333), rurality-stratified design (480 urban + 480 rural = 960, one
call per NPI) that near-exhaustively sampled the frame's 791 rural ENTs to reach
balance, study period 2026-05-29 to 2026-07-06, 48 states, BCBS commercial
scenario held constant, chief complaint matched to one of eight subspecialties.
Remaining protocol specifics not documented anywhere in the repo (call-attempt
rule, exact script wording, caller-training procedure) left as a single narrow
flagged bracket for the study team to confirm rather than fabricated.

Co-Authored-By: Claude Opus 4.8 (1M context) <noreply@anthropic.com>
</commit_message>
<xml_diff>
--- a/manuscript_output/manuscript_mystery_caller.docx
+++ b/manuscript_output/manuscript_mystery_caller.docx
@@ -311,7 +311,7 @@
         <w:t xml:space="preserve">“mystery caller”</w:t>
       </w:r>
       <w:r>
-        <w:t xml:space="preserve">) study of access to otolaryngology (ENT) care in the United States. Trained callers telephoned a national sample of practicing, board-certified otolaryngologists and, following a standardized script, requested a new-patient appointment for a subspecialty-matched chief complaint. Each sampled physician was contacted once.</w:t>
+        <w:t xml:space="preserve">) study of access to otolaryngology (ENT) care in the United States. Trained callers telephoned a national sample of practicing, board-certified otolaryngologists and, following a standardized script, requested a new-patient appointment for a subspecialty-matched chief complaint. Each sampled physician was contacted once. The sampling frame was the American Board of Otolaryngology–Head and Neck Surgery roster of board-certified otolaryngologists practicing in the United States (N = 11,333), linked to National Provider Identifier records for practice location and rurality. Because rural otolaryngologists were scarce in this frame (791 of 11,333; 7.0%), we drew a rurality-stratified sample of 480 urban and 480 rural physicians (960 total) to obtain balanced representation; the rural stratum accordingly included a majority of all rural board-certified otolaryngologists in the frame. Calls were placed between May 29 and July 6, 2026, to physicians in 48 states, each under a commercial Blue Cross Blue Shield insurance scenario held constant across calls, with the chief complaint matched to the sampled physician’s subspecialty (general otolaryngology, facial plastic surgery, head and neck oncology, laryngology, otology/neurotology, pediatric otolaryngology, rhinology, or sleep medicine).</w:t>
       </w:r>
       <w:r>
         <w:t xml:space="preserve"> </w:t>
@@ -321,7 +321,7 @@
           <w:i/>
           <w:iCs/>
         </w:rPr>
-        <w:t xml:space="preserve">[Describe the sampling frame and its size, the number and timing of call attempts before a call was recorded as unreachable, the scripted chief complaints, caller training, and the study period.]</w:t>
+        <w:t xml:space="preserve">[To confirm from the protocol: the number and timing of call attempts before a physician was recorded as unreachable, the exact wording of the subspecialty-specific chief-complaint scripts, and caller-training procedures.]</w:t>
       </w:r>
       <w:r>
         <w:t xml:space="preserve"> </w:t>

</xml_diff>

<commit_message>
Add reproducibility harness, STROBE checklist, and results polish
(1) run_all.R: one-command staged reproduction (data|analysis|render|all),
defaulting to analysis+render from the committed enriched CSV; heavy/external
steps (Valhalla isochrones, simr power) documented but excluded. Writes a
reproducibility snapshot to repro/ (sessionInfo.txt + package_versions.csv).
(2) manuscript/STROBE_checklist.md: completed 22-item cross-sectional STROBE
checklist mapped to manuscript sections; referenced from the Supplement.
(3) Results polish: report the market-clustering ICC (access 0.043; CBSA log-
scale variance 0.26 for timeliness), translate the significant IRRs into
concrete added wait (~2-3 wk laryngology, ~1-1.5 wk pediatric vs general), and
add a title-page block (keywords, running head, corresponding-author and
word-count placeholders). Verified via a clean full run_all.R pass.

Co-Authored-By: Claude Opus 4.8 (1M context) <noreply@anthropic.com>
</commit_message>
<xml_diff>
--- a/manuscript_output/manuscript_mystery_caller.docx
+++ b/manuscript_output/manuscript_mystery_caller.docx
@@ -137,6 +137,96 @@
       </w:r>
       <w:r>
         <w:t xml:space="preserve">New-patient access to otolaryngology care is shaped more by the requested subspecialty than by local physician supply, insurance generosity, social vulnerability, or rurality. Getting an appointment and being seen promptly are distinct dimensions that diverge by subspecialty.</w:t>
+      </w:r>
+    </w:p>
+    <w:p>
+      <w:pPr>
+        <w:pStyle w:val="BodyText"/>
+      </w:pPr>
+      <w:r>
+        <w:rPr>
+          <w:b/>
+          <w:bCs/>
+        </w:rPr>
+        <w:t xml:space="preserve">Keywords:</w:t>
+      </w:r>
+      <w:r>
+        <w:t xml:space="preserve"> </w:t>
+      </w:r>
+      <w:r>
+        <w:t xml:space="preserve">otolaryngology; access to care; health services accessibility; simulated patient; mystery caller; appointment wait time; rural health; workforce.</w:t>
+      </w:r>
+    </w:p>
+    <w:p>
+      <w:pPr>
+        <w:pStyle w:val="BodyText"/>
+      </w:pPr>
+      <w:r>
+        <w:rPr>
+          <w:b/>
+          <w:bCs/>
+        </w:rPr>
+        <w:t xml:space="preserve">Running head:</w:t>
+      </w:r>
+      <w:r>
+        <w:t xml:space="preserve"> </w:t>
+      </w:r>
+      <w:r>
+        <w:t xml:space="preserve">Subspecialty and geography in otolaryngology access.</w:t>
+      </w:r>
+    </w:p>
+    <w:p>
+      <w:pPr>
+        <w:pStyle w:val="BodyText"/>
+      </w:pPr>
+      <w:r>
+        <w:rPr>
+          <w:b/>
+          <w:bCs/>
+        </w:rPr>
+        <w:t xml:space="preserve">Corresponding author:</w:t>
+      </w:r>
+      <w:r>
+        <w:t xml:space="preserve"> </w:t>
+      </w:r>
+      <w:r>
+        <w:rPr>
+          <w:i/>
+          <w:iCs/>
+        </w:rPr>
+        <w:t xml:space="preserve">[Name, degree; institution; address; email; telephone]</w:t>
+      </w:r>
+      <w:r>
+        <w:t xml:space="preserve">.</w:t>
+      </w:r>
+    </w:p>
+    <w:p>
+      <w:pPr>
+        <w:pStyle w:val="BodyText"/>
+      </w:pPr>
+      <w:r>
+        <w:rPr>
+          <w:i/>
+          <w:iCs/>
+        </w:rPr>
+        <w:t xml:space="preserve">Word count: abstract ≈ 200; main text</w:t>
+      </w:r>
+      <w:r>
+        <w:rPr>
+          <w:i/>
+          <w:iCs/>
+        </w:rPr>
+        <w:t xml:space="preserve"> </w:t>
+      </w:r>
+      <w:r>
+        <w:t xml:space="preserve">[to finalize]</w:t>
+      </w:r>
+      <w:r>
+        <w:rPr>
+          <w:i/>
+          <w:iCs/>
+        </w:rPr>
+        <w:t xml:space="preserve">. Tables: 2 main, 8 supplementary. Figures: 2 main, 6 supplementary.</w:t>
       </w:r>
     </w:p>
     <w:bookmarkEnd w:id="20"/>
@@ -8007,7 +8097,7 @@
         <w:pStyle w:val="FirstParagraph"/>
       </w:pPr>
       <w:r>
-        <w:t xml:space="preserve">Among offering offices, waits again varied by subspecialty and not geography. Relative to general otolaryngology, waits were longer for laryngology (IRR 2.25 (95% CI 1.14–4.47; p = 0.020)) and pediatric otolaryngology (IRR 1.63 (95% CI 1.11–2.40; p = 0.013)). No geographic covariate was associated with wait time (</w:t>
+        <w:t xml:space="preserve">Among offering offices, waits again varied by subspecialty and not geography. Relative to general otolaryngology, waits were longer for laryngology (IRR 2.25 (95% CI 1.14–4.47; p = 0.020)) and pediatric otolaryngology (IRR 1.63 (95% CI 1.11–2.40; p = 0.013)). Anchored to the roughly two-week median wait for general otolaryngology (14 business days), these rate ratios correspond to a substantially longer typical wait—on the order of an additional two to three weeks for laryngology and about one to one-and-a-half weeks for pediatric otolaryngology—consistent with the observed subspecialty medians (Table S3). No geographic covariate was associated with wait time (</w:t>
       </w:r>
       <w:r>
         <w:rPr>
@@ -12452,7 +12542,7 @@
         <w:pStyle w:val="FirstParagraph"/>
       </w:pPr>
       <w:r>
-        <w:t xml:space="preserve">Under Tukey-adjusted pairwise comparison no subspecialty pair reached significance, and the subspecialty effect did not vary by rurality or supply (interaction likelihood-ratio tests, both non-significant). In a metropolitan sensitivity model, greater hospital-market concentration was associated with a borderline increase in wait time (HHI IRR 1.20 per SD; p = 0.058). Call incompleteness was unrelated to practice geography, supporting a missing-at-random mechanism with respect to location (Supplement).</w:t>
+        <w:t xml:space="preserve">Market-level clustering was modest: the core-based statistical area random intercept accounted for a latent intraclass correlation of 0.043 in the access model (CBSA variance 0.26 on the log scale in the timeliness model), indicating that most variation in access and timeliness lay within rather than between markets. Under Tukey-adjusted pairwise comparison no subspecialty pair reached significance, and the subspecialty effect did not vary by rurality or supply (interaction likelihood-ratio tests, both non-significant). In a metropolitan sensitivity model, greater hospital-market concentration was associated with a borderline increase in wait time (HHI IRR 1.20 per SD; p = 0.058). Call incompleteness was unrelated to practice geography, supporting a missing-at-random mechanism with respect to location (Supplement).</w:t>
       </w:r>
     </w:p>
     <w:bookmarkEnd w:id="31"/>
@@ -21184,6 +21274,28 @@
           <w:iCs/>
         </w:rPr>
         <w:t xml:space="preserve">docs/supplementary_legends.md</w:t>
+      </w:r>
+      <w:r>
+        <w:rPr>
+          <w:i/>
+          <w:iCs/>
+        </w:rPr>
+        <w:t xml:space="preserve">. A completed STROBE checklist is provided in</w:t>
+      </w:r>
+      <w:r>
+        <w:rPr>
+          <w:i/>
+          <w:iCs/>
+        </w:rPr>
+        <w:t xml:space="preserve"> </w:t>
+      </w:r>
+      <w:r>
+        <w:rPr>
+          <w:rStyle w:val="VerbatimChar"/>
+          <w:i/>
+          <w:iCs/>
+        </w:rPr>
+        <w:t xml:space="preserve">manuscript/STROBE_checklist.md</w:t>
       </w:r>
       <w:r>
         <w:rPr>

</xml_diff>

<commit_message>
Add and surface sensitivity analyses (3-level RUCA + complete-case)
New scripts/sensitivity_analyses.R refits both parts of the two-part model under
(S-A) three-level rurality (urban RUCA 1-3 / suburban 4-6 / rural 7-10) and
(S-B) complete-case (no median imputation), comparing key coefficients to the
primary binary-RUCA imputed model; writes model_output/supp/S8_sensitivity_
analyses.csv and is wired into run_all.R. Findings are robust: no urban->rural
gradient (suburban wait IRR 1.15, rural 1.29, both null), subspecialty effects
unchanged (laryngology 2.25, pediatric 1.64), and complete-case (n=412) reproduces
laryngology 2.51 / pediatric 1.52 with a null rural-urban contrast (1.14). Added
as Table S8 (chief-complaint appendix table renumbered S9), surfaced in the
Robustness Results paragraph, and noted in Methods.

Co-Authored-By: Claude Opus 4.8 (1M context) <noreply@anthropic.com>
</commit_message>
<xml_diff>
--- a/manuscript_output/manuscript_mystery_caller.docx
+++ b/manuscript_output/manuscript_mystery_caller.docx
@@ -226,7 +226,7 @@
           <w:i/>
           <w:iCs/>
         </w:rPr>
-        <w:t xml:space="preserve">. Tables: 2 main, 8 supplementary. Figures: 2 main, 6 supplementary.</w:t>
+        <w:t xml:space="preserve">. Tables: 2 main, 9 supplementary. Figures: 2 main, 6 supplementary.</w:t>
       </w:r>
     </w:p>
     <w:bookmarkEnd w:id="20"/>
@@ -609,7 +609,7 @@
         </w:r>
       </w:hyperlink>
       <w:r>
-        <w:t xml:space="preserve">. Effect modification of the geographic covariates by subspecialty was tested by likelihood-ratio tests. Market-level clustering was summarized by the intraclass correlation coefficient (ICC). Because the HHI is defined only in metropolitan areas, its association with timeliness was assessed in a sensitivity model restricted to the metropolitan subset. Whether call incompleteness was related to the measured covariates was assessed with chi-square and Wilcoxon rank-sum tests. Analyses used R 4.4.2</w:t>
+        <w:t xml:space="preserve">. Effect modification of the geographic covariates by subspecialty was tested by likelihood-ratio tests. Market-level clustering was summarized by the intraclass correlation coefficient (ICC). Because the HHI is defined only in metropolitan areas, its association with timeliness was assessed in a sensitivity model restricted to the metropolitan subset. Two additional sensitivity analyses were performed: a three-level rurality specification (urban, RUCA 1–3; suburban, 4–6; rural, 7–10) in place of the binary contrast, and a complete-case refit that excluded records with any missing covariate rather than median-imputing them. Whether call incompleteness was related to the measured covariates was assessed with chi-square and Wilcoxon rank-sum tests. Analyses used R 4.4.2</w:t>
       </w:r>
       <w:hyperlink w:anchor="ref-rcoreteam">
         <w:r>
@@ -12542,7 +12542,17 @@
         <w:pStyle w:val="FirstParagraph"/>
       </w:pPr>
       <w:r>
-        <w:t xml:space="preserve">Market-level clustering was modest: the core-based statistical area random intercept accounted for a latent intraclass correlation of 0.043 in the access model (CBSA variance 0.26 on the log scale in the timeliness model), indicating that most variation in access and timeliness lay within rather than between markets. Under Tukey-adjusted pairwise comparison no subspecialty pair reached significance, and the subspecialty effect did not vary by rurality or supply (interaction likelihood-ratio tests, both non-significant). In a metropolitan sensitivity model, greater hospital-market concentration was associated with a borderline increase in wait time (HHI IRR 1.20 per SD; p = 0.058). Call incompleteness was unrelated to practice geography, supporting a missing-at-random mechanism with respect to location (Supplement).</w:t>
+        <w:t xml:space="preserve">Market-level clustering was modest: the core-based statistical area random intercept accounted for a latent intraclass correlation of 0.043 in the access model (CBSA variance 0.26 on the log scale in the timeliness model), indicating that most variation in access and timeliness lay within rather than between markets. Under Tukey-adjusted pairwise comparison no subspecialty pair reached significance, and the subspecialty effect did not vary by rurality or supply (interaction likelihood-ratio tests, both non-significant). In a metropolitan sensitivity model, greater hospital-market concentration was associated with a borderline increase in wait time (HHI IRR 1.20 per SD; p = 0.058). Call incompleteness was unrelated to practice geography, supporting a missing-at-random mechanism with respect to location (Supplement). The main findings were stable across two sensitivity analyses (</w:t>
+      </w:r>
+      <w:r>
+        <w:rPr>
+          <w:b/>
+          <w:bCs/>
+        </w:rPr>
+        <w:t xml:space="preserve">Table S8</w:t>
+      </w:r>
+      <w:r>
+        <w:t xml:space="preserve">). Under a three-level rurality specification (urban, RUCA 1–3; suburban, 4–6; rural, 7–10), no urban-to-rural gradient emerged—neither suburban (wait IRR 1.15) nor the sparse rural stratum (IRR 1.29) differed significantly from urban—while the subspecialty effects were unchanged. A complete-case analysis without imputation (n = 412 recorded waits) likewise reproduced the longer waits for laryngology (IRR 2.51) and pediatric otolaryngology (IRR 1.52) and the null rural–urban contrast (IRR 1.14).</w:t>
       </w:r>
     </w:p>
     <w:bookmarkEnd w:id="31"/>
@@ -20885,6 +20895,2095 @@
         </w:tc>
       </w:tr>
     </w:tbl>
+    <w:p/>
+    <w:p>
+      <w:pPr>
+        <w:pStyle w:val="TableCaption"/>
+      </w:pPr>
+      <w:r>
+        <w:t xml:space="preserve">Table S8. Sensitivity analyses: three-level RUCA and complete-case (key coefficients vs primary model).</w:t>
+      </w:r>
+    </w:p>
+    <w:tbl>
+      <w:tblPr>
+        <w:tblStyle w:val="Table"/>
+        <w:tblW w:type="pct" w:w="5000"/>
+        <w:tblLayout w:type="fixed"/>
+        <w:tblLook w:firstRow="1" w:lastRow="0" w:firstColumn="0" w:lastColumn="0" w:noHBand="0" w:noVBand="0" w:val="0020"/>
+        <w:tblCaption w:val="Table S8. Sensitivity analyses: three-level RUCA and complete-case (key coefficients vs primary model)."/>
+      </w:tblPr>
+      <w:tblGrid>
+        <w:gridCol w:w="1964"/>
+        <w:gridCol w:w="1077"/>
+        <w:gridCol w:w="1900"/>
+        <w:gridCol w:w="570"/>
+        <w:gridCol w:w="633"/>
+        <w:gridCol w:w="380"/>
+        <w:gridCol w:w="570"/>
+        <w:gridCol w:w="823"/>
+      </w:tblGrid>
+      <w:tr>
+        <w:trPr>
+          <w:tblHeader w:val="on"/>
+        </w:trPr>
+        <w:tc>
+          <w:tcPr/>
+          <w:p>
+            <w:pPr>
+              <w:pStyle w:val="Compact"/>
+              <w:jc w:val="left"/>
+            </w:pPr>
+            <w:r>
+              <w:t xml:space="preserve">spec</w:t>
+            </w:r>
+          </w:p>
+        </w:tc>
+        <w:tc>
+          <w:tcPr/>
+          <w:p>
+            <w:pPr>
+              <w:pStyle w:val="Compact"/>
+              <w:jc w:val="left"/>
+            </w:pPr>
+            <w:r>
+              <w:t xml:space="preserve">part</w:t>
+            </w:r>
+          </w:p>
+        </w:tc>
+        <w:tc>
+          <w:tcPr/>
+          <w:p>
+            <w:pPr>
+              <w:pStyle w:val="Compact"/>
+              <w:jc w:val="left"/>
+            </w:pPr>
+            <w:r>
+              <w:t xml:space="preserve">term</w:t>
+            </w:r>
+          </w:p>
+        </w:tc>
+        <w:tc>
+          <w:tcPr/>
+          <w:p>
+            <w:pPr>
+              <w:pStyle w:val="Compact"/>
+              <w:jc w:val="right"/>
+            </w:pPr>
+            <w:r>
+              <w:t xml:space="preserve">estimate</w:t>
+            </w:r>
+          </w:p>
+        </w:tc>
+        <w:tc>
+          <w:tcPr/>
+          <w:p>
+            <w:pPr>
+              <w:pStyle w:val="Compact"/>
+              <w:jc w:val="left"/>
+            </w:pPr>
+            <w:r>
+              <w:t xml:space="preserve">ci</w:t>
+            </w:r>
+          </w:p>
+        </w:tc>
+        <w:tc>
+          <w:tcPr/>
+          <w:p>
+            <w:pPr>
+              <w:pStyle w:val="Compact"/>
+              <w:jc w:val="right"/>
+            </w:pPr>
+            <w:r>
+              <w:t xml:space="preserve">p</w:t>
+            </w:r>
+          </w:p>
+        </w:tc>
+        <w:tc>
+          <w:tcPr/>
+          <w:p>
+            <w:pPr>
+              <w:pStyle w:val="Compact"/>
+              <w:jc w:val="right"/>
+            </w:pPr>
+            <w:r>
+              <w:t xml:space="preserve">n_access</w:t>
+            </w:r>
+          </w:p>
+        </w:tc>
+        <w:tc>
+          <w:tcPr/>
+          <w:p>
+            <w:pPr>
+              <w:pStyle w:val="Compact"/>
+              <w:jc w:val="right"/>
+            </w:pPr>
+            <w:r>
+              <w:t xml:space="preserve">n_timeliness</w:t>
+            </w:r>
+          </w:p>
+        </w:tc>
+      </w:tr>
+      <w:tr>
+        <w:tc>
+          <w:tcPr/>
+          <w:p>
+            <w:pPr>
+              <w:pStyle w:val="Compact"/>
+              <w:jc w:val="left"/>
+            </w:pPr>
+            <w:r>
+              <w:t xml:space="preserve">Primary (binary RUCA, imputed)</w:t>
+            </w:r>
+          </w:p>
+        </w:tc>
+        <w:tc>
+          <w:tcPr/>
+          <w:p>
+            <w:pPr>
+              <w:pStyle w:val="Compact"/>
+              <w:jc w:val="left"/>
+            </w:pPr>
+            <w:r>
+              <w:t xml:space="preserve">Access (OR)</w:t>
+            </w:r>
+          </w:p>
+        </w:tc>
+        <w:tc>
+          <w:tcPr/>
+          <w:p>
+            <w:pPr>
+              <w:pStyle w:val="Compact"/>
+              <w:jc w:val="left"/>
+            </w:pPr>
+            <w:r>
+              <w:t xml:space="preserve">Laryngology</w:t>
+            </w:r>
+          </w:p>
+        </w:tc>
+        <w:tc>
+          <w:tcPr/>
+          <w:p>
+            <w:pPr>
+              <w:pStyle w:val="Compact"/>
+              <w:jc w:val="right"/>
+            </w:pPr>
+            <w:r>
+              <w:t xml:space="preserve">1.74</w:t>
+            </w:r>
+          </w:p>
+        </w:tc>
+        <w:tc>
+          <w:tcPr/>
+          <w:p>
+            <w:pPr>
+              <w:pStyle w:val="Compact"/>
+              <w:jc w:val="left"/>
+            </w:pPr>
+            <w:r>
+              <w:t xml:space="preserve">0.50-6.07</w:t>
+            </w:r>
+          </w:p>
+        </w:tc>
+        <w:tc>
+          <w:tcPr/>
+          <w:p>
+            <w:pPr>
+              <w:pStyle w:val="Compact"/>
+              <w:jc w:val="right"/>
+            </w:pPr>
+            <w:r>
+              <w:t xml:space="preserve">0.386</w:t>
+            </w:r>
+          </w:p>
+        </w:tc>
+        <w:tc>
+          <w:tcPr/>
+          <w:p>
+            <w:pPr>
+              <w:pStyle w:val="Compact"/>
+              <w:jc w:val="right"/>
+            </w:pPr>
+            <w:r>
+              <w:t xml:space="preserve">731</w:t>
+            </w:r>
+          </w:p>
+        </w:tc>
+        <w:tc>
+          <w:tcPr/>
+          <w:p>
+            <w:pPr>
+              <w:pStyle w:val="Compact"/>
+              <w:jc w:val="right"/>
+            </w:pPr>
+            <w:r>
+              <w:t xml:space="preserve">429</w:t>
+            </w:r>
+          </w:p>
+        </w:tc>
+      </w:tr>
+      <w:tr>
+        <w:tc>
+          <w:tcPr/>
+          <w:p>
+            <w:pPr>
+              <w:pStyle w:val="Compact"/>
+              <w:jc w:val="left"/>
+            </w:pPr>
+            <w:r>
+              <w:t xml:space="preserve">Primary (binary RUCA, imputed)</w:t>
+            </w:r>
+          </w:p>
+        </w:tc>
+        <w:tc>
+          <w:tcPr/>
+          <w:p>
+            <w:pPr>
+              <w:pStyle w:val="Compact"/>
+              <w:jc w:val="left"/>
+            </w:pPr>
+            <w:r>
+              <w:t xml:space="preserve">Access (OR)</w:t>
+            </w:r>
+          </w:p>
+        </w:tc>
+        <w:tc>
+          <w:tcPr/>
+          <w:p>
+            <w:pPr>
+              <w:pStyle w:val="Compact"/>
+              <w:jc w:val="left"/>
+            </w:pPr>
+            <w:r>
+              <w:t xml:space="preserve">Pediatric otolaryngology</w:t>
+            </w:r>
+          </w:p>
+        </w:tc>
+        <w:tc>
+          <w:tcPr/>
+          <w:p>
+            <w:pPr>
+              <w:pStyle w:val="Compact"/>
+              <w:jc w:val="right"/>
+            </w:pPr>
+            <w:r>
+              <w:t xml:space="preserve">2.27</w:t>
+            </w:r>
+          </w:p>
+        </w:tc>
+        <w:tc>
+          <w:tcPr/>
+          <w:p>
+            <w:pPr>
+              <w:pStyle w:val="Compact"/>
+              <w:jc w:val="left"/>
+            </w:pPr>
+            <w:r>
+              <w:t xml:space="preserve">1.08-4.76</w:t>
+            </w:r>
+          </w:p>
+        </w:tc>
+        <w:tc>
+          <w:tcPr/>
+          <w:p>
+            <w:pPr>
+              <w:pStyle w:val="Compact"/>
+              <w:jc w:val="right"/>
+            </w:pPr>
+            <w:r>
+              <w:t xml:space="preserve">0.031</w:t>
+            </w:r>
+          </w:p>
+        </w:tc>
+        <w:tc>
+          <w:tcPr/>
+          <w:p>
+            <w:pPr>
+              <w:pStyle w:val="Compact"/>
+              <w:jc w:val="right"/>
+            </w:pPr>
+            <w:r>
+              <w:t xml:space="preserve">731</w:t>
+            </w:r>
+          </w:p>
+        </w:tc>
+        <w:tc>
+          <w:tcPr/>
+          <w:p>
+            <w:pPr>
+              <w:pStyle w:val="Compact"/>
+              <w:jc w:val="right"/>
+            </w:pPr>
+            <w:r>
+              <w:t xml:space="preserve">429</w:t>
+            </w:r>
+          </w:p>
+        </w:tc>
+      </w:tr>
+      <w:tr>
+        <w:tc>
+          <w:tcPr/>
+          <w:p>
+            <w:pPr>
+              <w:pStyle w:val="Compact"/>
+              <w:jc w:val="left"/>
+            </w:pPr>
+            <w:r>
+              <w:t xml:space="preserve">Primary (binary RUCA, imputed)</w:t>
+            </w:r>
+          </w:p>
+        </w:tc>
+        <w:tc>
+          <w:tcPr/>
+          <w:p>
+            <w:pPr>
+              <w:pStyle w:val="Compact"/>
+              <w:jc w:val="left"/>
+            </w:pPr>
+            <w:r>
+              <w:t xml:space="preserve">Access (OR)</w:t>
+            </w:r>
+          </w:p>
+        </w:tc>
+        <w:tc>
+          <w:tcPr/>
+          <w:p>
+            <w:pPr>
+              <w:pStyle w:val="Compact"/>
+              <w:jc w:val="left"/>
+            </w:pPr>
+            <w:r>
+              <w:t xml:space="preserve">Rural (vs urban)</w:t>
+            </w:r>
+          </w:p>
+        </w:tc>
+        <w:tc>
+          <w:tcPr/>
+          <w:p>
+            <w:pPr>
+              <w:pStyle w:val="Compact"/>
+              <w:jc w:val="right"/>
+            </w:pPr>
+            <w:r>
+              <w:t xml:space="preserve">1.02</w:t>
+            </w:r>
+          </w:p>
+        </w:tc>
+        <w:tc>
+          <w:tcPr/>
+          <w:p>
+            <w:pPr>
+              <w:pStyle w:val="Compact"/>
+              <w:jc w:val="left"/>
+            </w:pPr>
+            <w:r>
+              <w:t xml:space="preserve">0.71-1.46</w:t>
+            </w:r>
+          </w:p>
+        </w:tc>
+        <w:tc>
+          <w:tcPr/>
+          <w:p>
+            <w:pPr>
+              <w:pStyle w:val="Compact"/>
+              <w:jc w:val="right"/>
+            </w:pPr>
+            <w:r>
+              <w:t xml:space="preserve">0.922</w:t>
+            </w:r>
+          </w:p>
+        </w:tc>
+        <w:tc>
+          <w:tcPr/>
+          <w:p>
+            <w:pPr>
+              <w:pStyle w:val="Compact"/>
+              <w:jc w:val="right"/>
+            </w:pPr>
+            <w:r>
+              <w:t xml:space="preserve">731</w:t>
+            </w:r>
+          </w:p>
+        </w:tc>
+        <w:tc>
+          <w:tcPr/>
+          <w:p>
+            <w:pPr>
+              <w:pStyle w:val="Compact"/>
+              <w:jc w:val="right"/>
+            </w:pPr>
+            <w:r>
+              <w:t xml:space="preserve">429</w:t>
+            </w:r>
+          </w:p>
+        </w:tc>
+      </w:tr>
+      <w:tr>
+        <w:tc>
+          <w:tcPr/>
+          <w:p>
+            <w:pPr>
+              <w:pStyle w:val="Compact"/>
+              <w:jc w:val="left"/>
+            </w:pPr>
+            <w:r>
+              <w:t xml:space="preserve">Primary (binary RUCA, imputed)</w:t>
+            </w:r>
+          </w:p>
+        </w:tc>
+        <w:tc>
+          <w:tcPr/>
+          <w:p>
+            <w:pPr>
+              <w:pStyle w:val="Compact"/>
+              <w:jc w:val="left"/>
+            </w:pPr>
+            <w:r>
+              <w:t xml:space="preserve">Timeliness (IRR)</w:t>
+            </w:r>
+          </w:p>
+        </w:tc>
+        <w:tc>
+          <w:tcPr/>
+          <w:p>
+            <w:pPr>
+              <w:pStyle w:val="Compact"/>
+              <w:jc w:val="left"/>
+            </w:pPr>
+            <w:r>
+              <w:t xml:space="preserve">Laryngology</w:t>
+            </w:r>
+          </w:p>
+        </w:tc>
+        <w:tc>
+          <w:tcPr/>
+          <w:p>
+            <w:pPr>
+              <w:pStyle w:val="Compact"/>
+              <w:jc w:val="right"/>
+            </w:pPr>
+            <w:r>
+              <w:t xml:space="preserve">2.25</w:t>
+            </w:r>
+          </w:p>
+        </w:tc>
+        <w:tc>
+          <w:tcPr/>
+          <w:p>
+            <w:pPr>
+              <w:pStyle w:val="Compact"/>
+              <w:jc w:val="left"/>
+            </w:pPr>
+            <w:r>
+              <w:t xml:space="preserve">1.14-4.47</w:t>
+            </w:r>
+          </w:p>
+        </w:tc>
+        <w:tc>
+          <w:tcPr/>
+          <w:p>
+            <w:pPr>
+              <w:pStyle w:val="Compact"/>
+              <w:jc w:val="right"/>
+            </w:pPr>
+            <w:r>
+              <w:t xml:space="preserve">0.020</w:t>
+            </w:r>
+          </w:p>
+        </w:tc>
+        <w:tc>
+          <w:tcPr/>
+          <w:p>
+            <w:pPr>
+              <w:pStyle w:val="Compact"/>
+              <w:jc w:val="right"/>
+            </w:pPr>
+            <w:r>
+              <w:t xml:space="preserve">731</w:t>
+            </w:r>
+          </w:p>
+        </w:tc>
+        <w:tc>
+          <w:tcPr/>
+          <w:p>
+            <w:pPr>
+              <w:pStyle w:val="Compact"/>
+              <w:jc w:val="right"/>
+            </w:pPr>
+            <w:r>
+              <w:t xml:space="preserve">429</w:t>
+            </w:r>
+          </w:p>
+        </w:tc>
+      </w:tr>
+      <w:tr>
+        <w:tc>
+          <w:tcPr/>
+          <w:p>
+            <w:pPr>
+              <w:pStyle w:val="Compact"/>
+              <w:jc w:val="left"/>
+            </w:pPr>
+            <w:r>
+              <w:t xml:space="preserve">Primary (binary RUCA, imputed)</w:t>
+            </w:r>
+          </w:p>
+        </w:tc>
+        <w:tc>
+          <w:tcPr/>
+          <w:p>
+            <w:pPr>
+              <w:pStyle w:val="Compact"/>
+              <w:jc w:val="left"/>
+            </w:pPr>
+            <w:r>
+              <w:t xml:space="preserve">Timeliness (IRR)</w:t>
+            </w:r>
+          </w:p>
+        </w:tc>
+        <w:tc>
+          <w:tcPr/>
+          <w:p>
+            <w:pPr>
+              <w:pStyle w:val="Compact"/>
+              <w:jc w:val="left"/>
+            </w:pPr>
+            <w:r>
+              <w:t xml:space="preserve">Pediatric otolaryngology</w:t>
+            </w:r>
+          </w:p>
+        </w:tc>
+        <w:tc>
+          <w:tcPr/>
+          <w:p>
+            <w:pPr>
+              <w:pStyle w:val="Compact"/>
+              <w:jc w:val="right"/>
+            </w:pPr>
+            <w:r>
+              <w:t xml:space="preserve">1.63</w:t>
+            </w:r>
+          </w:p>
+        </w:tc>
+        <w:tc>
+          <w:tcPr/>
+          <w:p>
+            <w:pPr>
+              <w:pStyle w:val="Compact"/>
+              <w:jc w:val="left"/>
+            </w:pPr>
+            <w:r>
+              <w:t xml:space="preserve">1.11-2.40</w:t>
+            </w:r>
+          </w:p>
+        </w:tc>
+        <w:tc>
+          <w:tcPr/>
+          <w:p>
+            <w:pPr>
+              <w:pStyle w:val="Compact"/>
+              <w:jc w:val="right"/>
+            </w:pPr>
+            <w:r>
+              <w:t xml:space="preserve">0.013</w:t>
+            </w:r>
+          </w:p>
+        </w:tc>
+        <w:tc>
+          <w:tcPr/>
+          <w:p>
+            <w:pPr>
+              <w:pStyle w:val="Compact"/>
+              <w:jc w:val="right"/>
+            </w:pPr>
+            <w:r>
+              <w:t xml:space="preserve">731</w:t>
+            </w:r>
+          </w:p>
+        </w:tc>
+        <w:tc>
+          <w:tcPr/>
+          <w:p>
+            <w:pPr>
+              <w:pStyle w:val="Compact"/>
+              <w:jc w:val="right"/>
+            </w:pPr>
+            <w:r>
+              <w:t xml:space="preserve">429</w:t>
+            </w:r>
+          </w:p>
+        </w:tc>
+      </w:tr>
+      <w:tr>
+        <w:tc>
+          <w:tcPr/>
+          <w:p>
+            <w:pPr>
+              <w:pStyle w:val="Compact"/>
+              <w:jc w:val="left"/>
+            </w:pPr>
+            <w:r>
+              <w:t xml:space="preserve">Primary (binary RUCA, imputed)</w:t>
+            </w:r>
+          </w:p>
+        </w:tc>
+        <w:tc>
+          <w:tcPr/>
+          <w:p>
+            <w:pPr>
+              <w:pStyle w:val="Compact"/>
+              <w:jc w:val="left"/>
+            </w:pPr>
+            <w:r>
+              <w:t xml:space="preserve">Timeliness (IRR)</w:t>
+            </w:r>
+          </w:p>
+        </w:tc>
+        <w:tc>
+          <w:tcPr/>
+          <w:p>
+            <w:pPr>
+              <w:pStyle w:val="Compact"/>
+              <w:jc w:val="left"/>
+            </w:pPr>
+            <w:r>
+              <w:t xml:space="preserve">Rural (vs urban)</w:t>
+            </w:r>
+          </w:p>
+        </w:tc>
+        <w:tc>
+          <w:tcPr/>
+          <w:p>
+            <w:pPr>
+              <w:pStyle w:val="Compact"/>
+              <w:jc w:val="right"/>
+            </w:pPr>
+            <w:r>
+              <w:t xml:space="preserve">1.17</w:t>
+            </w:r>
+          </w:p>
+        </w:tc>
+        <w:tc>
+          <w:tcPr/>
+          <w:p>
+            <w:pPr>
+              <w:pStyle w:val="Compact"/>
+              <w:jc w:val="left"/>
+            </w:pPr>
+            <w:r>
+              <w:t xml:space="preserve">0.90-1.51</w:t>
+            </w:r>
+          </w:p>
+        </w:tc>
+        <w:tc>
+          <w:tcPr/>
+          <w:p>
+            <w:pPr>
+              <w:pStyle w:val="Compact"/>
+              <w:jc w:val="right"/>
+            </w:pPr>
+            <w:r>
+              <w:t xml:space="preserve">0.242</w:t>
+            </w:r>
+          </w:p>
+        </w:tc>
+        <w:tc>
+          <w:tcPr/>
+          <w:p>
+            <w:pPr>
+              <w:pStyle w:val="Compact"/>
+              <w:jc w:val="right"/>
+            </w:pPr>
+            <w:r>
+              <w:t xml:space="preserve">731</w:t>
+            </w:r>
+          </w:p>
+        </w:tc>
+        <w:tc>
+          <w:tcPr/>
+          <w:p>
+            <w:pPr>
+              <w:pStyle w:val="Compact"/>
+              <w:jc w:val="right"/>
+            </w:pPr>
+            <w:r>
+              <w:t xml:space="preserve">429</w:t>
+            </w:r>
+          </w:p>
+        </w:tc>
+      </w:tr>
+      <w:tr>
+        <w:tc>
+          <w:tcPr/>
+          <w:p>
+            <w:pPr>
+              <w:pStyle w:val="Compact"/>
+              <w:jc w:val="left"/>
+            </w:pPr>
+            <w:r>
+              <w:t xml:space="preserve">S-A: 3-level RUCA</w:t>
+            </w:r>
+          </w:p>
+        </w:tc>
+        <w:tc>
+          <w:tcPr/>
+          <w:p>
+            <w:pPr>
+              <w:pStyle w:val="Compact"/>
+              <w:jc w:val="left"/>
+            </w:pPr>
+            <w:r>
+              <w:t xml:space="preserve">Access (OR)</w:t>
+            </w:r>
+          </w:p>
+        </w:tc>
+        <w:tc>
+          <w:tcPr/>
+          <w:p>
+            <w:pPr>
+              <w:pStyle w:val="Compact"/>
+              <w:jc w:val="left"/>
+            </w:pPr>
+            <w:r>
+              <w:t xml:space="preserve">Laryngology</w:t>
+            </w:r>
+          </w:p>
+        </w:tc>
+        <w:tc>
+          <w:tcPr/>
+          <w:p>
+            <w:pPr>
+              <w:pStyle w:val="Compact"/>
+              <w:jc w:val="right"/>
+            </w:pPr>
+            <w:r>
+              <w:t xml:space="preserve">1.74</w:t>
+            </w:r>
+          </w:p>
+        </w:tc>
+        <w:tc>
+          <w:tcPr/>
+          <w:p>
+            <w:pPr>
+              <w:pStyle w:val="Compact"/>
+              <w:jc w:val="left"/>
+            </w:pPr>
+            <w:r>
+              <w:t xml:space="preserve">0.50-6.08</w:t>
+            </w:r>
+          </w:p>
+        </w:tc>
+        <w:tc>
+          <w:tcPr/>
+          <w:p>
+            <w:pPr>
+              <w:pStyle w:val="Compact"/>
+              <w:jc w:val="right"/>
+            </w:pPr>
+            <w:r>
+              <w:t xml:space="preserve">0.385</w:t>
+            </w:r>
+          </w:p>
+        </w:tc>
+        <w:tc>
+          <w:tcPr/>
+          <w:p>
+            <w:pPr>
+              <w:pStyle w:val="Compact"/>
+              <w:jc w:val="right"/>
+            </w:pPr>
+            <w:r>
+              <w:t xml:space="preserve">731</w:t>
+            </w:r>
+          </w:p>
+        </w:tc>
+        <w:tc>
+          <w:tcPr/>
+          <w:p>
+            <w:pPr>
+              <w:pStyle w:val="Compact"/>
+              <w:jc w:val="right"/>
+            </w:pPr>
+            <w:r>
+              <w:t xml:space="preserve">429</w:t>
+            </w:r>
+          </w:p>
+        </w:tc>
+      </w:tr>
+      <w:tr>
+        <w:tc>
+          <w:tcPr/>
+          <w:p>
+            <w:pPr>
+              <w:pStyle w:val="Compact"/>
+              <w:jc w:val="left"/>
+            </w:pPr>
+            <w:r>
+              <w:t xml:space="preserve">S-A: 3-level RUCA</w:t>
+            </w:r>
+          </w:p>
+        </w:tc>
+        <w:tc>
+          <w:tcPr/>
+          <w:p>
+            <w:pPr>
+              <w:pStyle w:val="Compact"/>
+              <w:jc w:val="left"/>
+            </w:pPr>
+            <w:r>
+              <w:t xml:space="preserve">Access (OR)</w:t>
+            </w:r>
+          </w:p>
+        </w:tc>
+        <w:tc>
+          <w:tcPr/>
+          <w:p>
+            <w:pPr>
+              <w:pStyle w:val="Compact"/>
+              <w:jc w:val="left"/>
+            </w:pPr>
+            <w:r>
+              <w:t xml:space="preserve">Pediatric otolaryngology</w:t>
+            </w:r>
+          </w:p>
+        </w:tc>
+        <w:tc>
+          <w:tcPr/>
+          <w:p>
+            <w:pPr>
+              <w:pStyle w:val="Compact"/>
+              <w:jc w:val="right"/>
+            </w:pPr>
+            <w:r>
+              <w:t xml:space="preserve">2.26</w:t>
+            </w:r>
+          </w:p>
+        </w:tc>
+        <w:tc>
+          <w:tcPr/>
+          <w:p>
+            <w:pPr>
+              <w:pStyle w:val="Compact"/>
+              <w:jc w:val="left"/>
+            </w:pPr>
+            <w:r>
+              <w:t xml:space="preserve">1.08-4.75</w:t>
+            </w:r>
+          </w:p>
+        </w:tc>
+        <w:tc>
+          <w:tcPr/>
+          <w:p>
+            <w:pPr>
+              <w:pStyle w:val="Compact"/>
+              <w:jc w:val="right"/>
+            </w:pPr>
+            <w:r>
+              <w:t xml:space="preserve">0.031</w:t>
+            </w:r>
+          </w:p>
+        </w:tc>
+        <w:tc>
+          <w:tcPr/>
+          <w:p>
+            <w:pPr>
+              <w:pStyle w:val="Compact"/>
+              <w:jc w:val="right"/>
+            </w:pPr>
+            <w:r>
+              <w:t xml:space="preserve">731</w:t>
+            </w:r>
+          </w:p>
+        </w:tc>
+        <w:tc>
+          <w:tcPr/>
+          <w:p>
+            <w:pPr>
+              <w:pStyle w:val="Compact"/>
+              <w:jc w:val="right"/>
+            </w:pPr>
+            <w:r>
+              <w:t xml:space="preserve">429</w:t>
+            </w:r>
+          </w:p>
+        </w:tc>
+      </w:tr>
+      <w:tr>
+        <w:tc>
+          <w:tcPr/>
+          <w:p>
+            <w:pPr>
+              <w:pStyle w:val="Compact"/>
+              <w:jc w:val="left"/>
+            </w:pPr>
+            <w:r>
+              <w:t xml:space="preserve">S-A: 3-level RUCA</w:t>
+            </w:r>
+          </w:p>
+        </w:tc>
+        <w:tc>
+          <w:tcPr/>
+          <w:p>
+            <w:pPr>
+              <w:pStyle w:val="Compact"/>
+              <w:jc w:val="left"/>
+            </w:pPr>
+            <w:r>
+              <w:t xml:space="preserve">Access (OR)</w:t>
+            </w:r>
+          </w:p>
+        </w:tc>
+        <w:tc>
+          <w:tcPr/>
+          <w:p>
+            <w:pPr>
+              <w:pStyle w:val="Compact"/>
+              <w:jc w:val="left"/>
+            </w:pPr>
+            <w:r>
+              <w:t xml:space="preserve">Suburban, RUCA 4-6 (vs urban)</w:t>
+            </w:r>
+          </w:p>
+        </w:tc>
+        <w:tc>
+          <w:tcPr/>
+          <w:p>
+            <w:pPr>
+              <w:pStyle w:val="Compact"/>
+              <w:jc w:val="right"/>
+            </w:pPr>
+            <w:r>
+              <w:t xml:space="preserve">1.03</w:t>
+            </w:r>
+          </w:p>
+        </w:tc>
+        <w:tc>
+          <w:tcPr/>
+          <w:p>
+            <w:pPr>
+              <w:pStyle w:val="Compact"/>
+              <w:jc w:val="left"/>
+            </w:pPr>
+            <w:r>
+              <w:t xml:space="preserve">0.71-1.50</w:t>
+            </w:r>
+          </w:p>
+        </w:tc>
+        <w:tc>
+          <w:tcPr/>
+          <w:p>
+            <w:pPr>
+              <w:pStyle w:val="Compact"/>
+              <w:jc w:val="right"/>
+            </w:pPr>
+            <w:r>
+              <w:t xml:space="preserve">0.857</w:t>
+            </w:r>
+          </w:p>
+        </w:tc>
+        <w:tc>
+          <w:tcPr/>
+          <w:p>
+            <w:pPr>
+              <w:pStyle w:val="Compact"/>
+              <w:jc w:val="right"/>
+            </w:pPr>
+            <w:r>
+              <w:t xml:space="preserve">731</w:t>
+            </w:r>
+          </w:p>
+        </w:tc>
+        <w:tc>
+          <w:tcPr/>
+          <w:p>
+            <w:pPr>
+              <w:pStyle w:val="Compact"/>
+              <w:jc w:val="right"/>
+            </w:pPr>
+            <w:r>
+              <w:t xml:space="preserve">429</w:t>
+            </w:r>
+          </w:p>
+        </w:tc>
+      </w:tr>
+      <w:tr>
+        <w:tc>
+          <w:tcPr/>
+          <w:p>
+            <w:pPr>
+              <w:pStyle w:val="Compact"/>
+              <w:jc w:val="left"/>
+            </w:pPr>
+            <w:r>
+              <w:t xml:space="preserve">S-A: 3-level RUCA</w:t>
+            </w:r>
+          </w:p>
+        </w:tc>
+        <w:tc>
+          <w:tcPr/>
+          <w:p>
+            <w:pPr>
+              <w:pStyle w:val="Compact"/>
+              <w:jc w:val="left"/>
+            </w:pPr>
+            <w:r>
+              <w:t xml:space="preserve">Access (OR)</w:t>
+            </w:r>
+          </w:p>
+        </w:tc>
+        <w:tc>
+          <w:tcPr/>
+          <w:p>
+            <w:pPr>
+              <w:pStyle w:val="Compact"/>
+              <w:jc w:val="left"/>
+            </w:pPr>
+            <w:r>
+              <w:t xml:space="preserve">Rural, RUCA 7-10 (vs urban)</w:t>
+            </w:r>
+          </w:p>
+        </w:tc>
+        <w:tc>
+          <w:tcPr/>
+          <w:p>
+            <w:pPr>
+              <w:pStyle w:val="Compact"/>
+              <w:jc w:val="right"/>
+            </w:pPr>
+            <w:r>
+              <w:t xml:space="preserve">0.93</w:t>
+            </w:r>
+          </w:p>
+        </w:tc>
+        <w:tc>
+          <w:tcPr/>
+          <w:p>
+            <w:pPr>
+              <w:pStyle w:val="Compact"/>
+              <w:jc w:val="left"/>
+            </w:pPr>
+            <w:r>
+              <w:t xml:space="preserve">0.49-1.75</w:t>
+            </w:r>
+          </w:p>
+        </w:tc>
+        <w:tc>
+          <w:tcPr/>
+          <w:p>
+            <w:pPr>
+              <w:pStyle w:val="Compact"/>
+              <w:jc w:val="right"/>
+            </w:pPr>
+            <w:r>
+              <w:t xml:space="preserve">0.823</w:t>
+            </w:r>
+          </w:p>
+        </w:tc>
+        <w:tc>
+          <w:tcPr/>
+          <w:p>
+            <w:pPr>
+              <w:pStyle w:val="Compact"/>
+              <w:jc w:val="right"/>
+            </w:pPr>
+            <w:r>
+              <w:t xml:space="preserve">731</w:t>
+            </w:r>
+          </w:p>
+        </w:tc>
+        <w:tc>
+          <w:tcPr/>
+          <w:p>
+            <w:pPr>
+              <w:pStyle w:val="Compact"/>
+              <w:jc w:val="right"/>
+            </w:pPr>
+            <w:r>
+              <w:t xml:space="preserve">429</w:t>
+            </w:r>
+          </w:p>
+        </w:tc>
+      </w:tr>
+      <w:tr>
+        <w:tc>
+          <w:tcPr/>
+          <w:p>
+            <w:pPr>
+              <w:pStyle w:val="Compact"/>
+              <w:jc w:val="left"/>
+            </w:pPr>
+            <w:r>
+              <w:t xml:space="preserve">S-A: 3-level RUCA</w:t>
+            </w:r>
+          </w:p>
+        </w:tc>
+        <w:tc>
+          <w:tcPr/>
+          <w:p>
+            <w:pPr>
+              <w:pStyle w:val="Compact"/>
+              <w:jc w:val="left"/>
+            </w:pPr>
+            <w:r>
+              <w:t xml:space="preserve">Timeliness (IRR)</w:t>
+            </w:r>
+          </w:p>
+        </w:tc>
+        <w:tc>
+          <w:tcPr/>
+          <w:p>
+            <w:pPr>
+              <w:pStyle w:val="Compact"/>
+              <w:jc w:val="left"/>
+            </w:pPr>
+            <w:r>
+              <w:t xml:space="preserve">Laryngology</w:t>
+            </w:r>
+          </w:p>
+        </w:tc>
+        <w:tc>
+          <w:tcPr/>
+          <w:p>
+            <w:pPr>
+              <w:pStyle w:val="Compact"/>
+              <w:jc w:val="right"/>
+            </w:pPr>
+            <w:r>
+              <w:t xml:space="preserve">2.25</w:t>
+            </w:r>
+          </w:p>
+        </w:tc>
+        <w:tc>
+          <w:tcPr/>
+          <w:p>
+            <w:pPr>
+              <w:pStyle w:val="Compact"/>
+              <w:jc w:val="left"/>
+            </w:pPr>
+            <w:r>
+              <w:t xml:space="preserve">1.13-4.46</w:t>
+            </w:r>
+          </w:p>
+        </w:tc>
+        <w:tc>
+          <w:tcPr/>
+          <w:p>
+            <w:pPr>
+              <w:pStyle w:val="Compact"/>
+              <w:jc w:val="right"/>
+            </w:pPr>
+            <w:r>
+              <w:t xml:space="preserve">0.021</w:t>
+            </w:r>
+          </w:p>
+        </w:tc>
+        <w:tc>
+          <w:tcPr/>
+          <w:p>
+            <w:pPr>
+              <w:pStyle w:val="Compact"/>
+              <w:jc w:val="right"/>
+            </w:pPr>
+            <w:r>
+              <w:t xml:space="preserve">731</w:t>
+            </w:r>
+          </w:p>
+        </w:tc>
+        <w:tc>
+          <w:tcPr/>
+          <w:p>
+            <w:pPr>
+              <w:pStyle w:val="Compact"/>
+              <w:jc w:val="right"/>
+            </w:pPr>
+            <w:r>
+              <w:t xml:space="preserve">429</w:t>
+            </w:r>
+          </w:p>
+        </w:tc>
+      </w:tr>
+      <w:tr>
+        <w:tc>
+          <w:tcPr/>
+          <w:p>
+            <w:pPr>
+              <w:pStyle w:val="Compact"/>
+              <w:jc w:val="left"/>
+            </w:pPr>
+            <w:r>
+              <w:t xml:space="preserve">S-A: 3-level RUCA</w:t>
+            </w:r>
+          </w:p>
+        </w:tc>
+        <w:tc>
+          <w:tcPr/>
+          <w:p>
+            <w:pPr>
+              <w:pStyle w:val="Compact"/>
+              <w:jc w:val="left"/>
+            </w:pPr>
+            <w:r>
+              <w:t xml:space="preserve">Timeliness (IRR)</w:t>
+            </w:r>
+          </w:p>
+        </w:tc>
+        <w:tc>
+          <w:tcPr/>
+          <w:p>
+            <w:pPr>
+              <w:pStyle w:val="Compact"/>
+              <w:jc w:val="left"/>
+            </w:pPr>
+            <w:r>
+              <w:t xml:space="preserve">Pediatric otolaryngology</w:t>
+            </w:r>
+          </w:p>
+        </w:tc>
+        <w:tc>
+          <w:tcPr/>
+          <w:p>
+            <w:pPr>
+              <w:pStyle w:val="Compact"/>
+              <w:jc w:val="right"/>
+            </w:pPr>
+            <w:r>
+              <w:t xml:space="preserve">1.64</w:t>
+            </w:r>
+          </w:p>
+        </w:tc>
+        <w:tc>
+          <w:tcPr/>
+          <w:p>
+            <w:pPr>
+              <w:pStyle w:val="Compact"/>
+              <w:jc w:val="left"/>
+            </w:pPr>
+            <w:r>
+              <w:t xml:space="preserve">1.11-2.41</w:t>
+            </w:r>
+          </w:p>
+        </w:tc>
+        <w:tc>
+          <w:tcPr/>
+          <w:p>
+            <w:pPr>
+              <w:pStyle w:val="Compact"/>
+              <w:jc w:val="right"/>
+            </w:pPr>
+            <w:r>
+              <w:t xml:space="preserve">0.012</w:t>
+            </w:r>
+          </w:p>
+        </w:tc>
+        <w:tc>
+          <w:tcPr/>
+          <w:p>
+            <w:pPr>
+              <w:pStyle w:val="Compact"/>
+              <w:jc w:val="right"/>
+            </w:pPr>
+            <w:r>
+              <w:t xml:space="preserve">731</w:t>
+            </w:r>
+          </w:p>
+        </w:tc>
+        <w:tc>
+          <w:tcPr/>
+          <w:p>
+            <w:pPr>
+              <w:pStyle w:val="Compact"/>
+              <w:jc w:val="right"/>
+            </w:pPr>
+            <w:r>
+              <w:t xml:space="preserve">429</w:t>
+            </w:r>
+          </w:p>
+        </w:tc>
+      </w:tr>
+      <w:tr>
+        <w:tc>
+          <w:tcPr/>
+          <w:p>
+            <w:pPr>
+              <w:pStyle w:val="Compact"/>
+              <w:jc w:val="left"/>
+            </w:pPr>
+            <w:r>
+              <w:t xml:space="preserve">S-A: 3-level RUCA</w:t>
+            </w:r>
+          </w:p>
+        </w:tc>
+        <w:tc>
+          <w:tcPr/>
+          <w:p>
+            <w:pPr>
+              <w:pStyle w:val="Compact"/>
+              <w:jc w:val="left"/>
+            </w:pPr>
+            <w:r>
+              <w:t xml:space="preserve">Timeliness (IRR)</w:t>
+            </w:r>
+          </w:p>
+        </w:tc>
+        <w:tc>
+          <w:tcPr/>
+          <w:p>
+            <w:pPr>
+              <w:pStyle w:val="Compact"/>
+              <w:jc w:val="left"/>
+            </w:pPr>
+            <w:r>
+              <w:t xml:space="preserve">Suburban, RUCA 4-6 (vs urban)</w:t>
+            </w:r>
+          </w:p>
+        </w:tc>
+        <w:tc>
+          <w:tcPr/>
+          <w:p>
+            <w:pPr>
+              <w:pStyle w:val="Compact"/>
+              <w:jc w:val="right"/>
+            </w:pPr>
+            <w:r>
+              <w:t xml:space="preserve">1.15</w:t>
+            </w:r>
+          </w:p>
+        </w:tc>
+        <w:tc>
+          <w:tcPr/>
+          <w:p>
+            <w:pPr>
+              <w:pStyle w:val="Compact"/>
+              <w:jc w:val="left"/>
+            </w:pPr>
+            <w:r>
+              <w:t xml:space="preserve">0.88-1.49</w:t>
+            </w:r>
+          </w:p>
+        </w:tc>
+        <w:tc>
+          <w:tcPr/>
+          <w:p>
+            <w:pPr>
+              <w:pStyle w:val="Compact"/>
+              <w:jc w:val="right"/>
+            </w:pPr>
+            <w:r>
+              <w:t xml:space="preserve">0.317</w:t>
+            </w:r>
+          </w:p>
+        </w:tc>
+        <w:tc>
+          <w:tcPr/>
+          <w:p>
+            <w:pPr>
+              <w:pStyle w:val="Compact"/>
+              <w:jc w:val="right"/>
+            </w:pPr>
+            <w:r>
+              <w:t xml:space="preserve">731</w:t>
+            </w:r>
+          </w:p>
+        </w:tc>
+        <w:tc>
+          <w:tcPr/>
+          <w:p>
+            <w:pPr>
+              <w:pStyle w:val="Compact"/>
+              <w:jc w:val="right"/>
+            </w:pPr>
+            <w:r>
+              <w:t xml:space="preserve">429</w:t>
+            </w:r>
+          </w:p>
+        </w:tc>
+      </w:tr>
+      <w:tr>
+        <w:tc>
+          <w:tcPr/>
+          <w:p>
+            <w:pPr>
+              <w:pStyle w:val="Compact"/>
+              <w:jc w:val="left"/>
+            </w:pPr>
+            <w:r>
+              <w:t xml:space="preserve">S-A: 3-level RUCA</w:t>
+            </w:r>
+          </w:p>
+        </w:tc>
+        <w:tc>
+          <w:tcPr/>
+          <w:p>
+            <w:pPr>
+              <w:pStyle w:val="Compact"/>
+              <w:jc w:val="left"/>
+            </w:pPr>
+            <w:r>
+              <w:t xml:space="preserve">Timeliness (IRR)</w:t>
+            </w:r>
+          </w:p>
+        </w:tc>
+        <w:tc>
+          <w:tcPr/>
+          <w:p>
+            <w:pPr>
+              <w:pStyle w:val="Compact"/>
+              <w:jc w:val="left"/>
+            </w:pPr>
+            <w:r>
+              <w:t xml:space="preserve">Rural, RUCA 7-10 (vs urban)</w:t>
+            </w:r>
+          </w:p>
+        </w:tc>
+        <w:tc>
+          <w:tcPr/>
+          <w:p>
+            <w:pPr>
+              <w:pStyle w:val="Compact"/>
+              <w:jc w:val="right"/>
+            </w:pPr>
+            <w:r>
+              <w:t xml:space="preserve">1.29</w:t>
+            </w:r>
+          </w:p>
+        </w:tc>
+        <w:tc>
+          <w:tcPr/>
+          <w:p>
+            <w:pPr>
+              <w:pStyle w:val="Compact"/>
+              <w:jc w:val="left"/>
+            </w:pPr>
+            <w:r>
+              <w:t xml:space="preserve">0.83-2.02</w:t>
+            </w:r>
+          </w:p>
+        </w:tc>
+        <w:tc>
+          <w:tcPr/>
+          <w:p>
+            <w:pPr>
+              <w:pStyle w:val="Compact"/>
+              <w:jc w:val="right"/>
+            </w:pPr>
+            <w:r>
+              <w:t xml:space="preserve">0.261</w:t>
+            </w:r>
+          </w:p>
+        </w:tc>
+        <w:tc>
+          <w:tcPr/>
+          <w:p>
+            <w:pPr>
+              <w:pStyle w:val="Compact"/>
+              <w:jc w:val="right"/>
+            </w:pPr>
+            <w:r>
+              <w:t xml:space="preserve">731</w:t>
+            </w:r>
+          </w:p>
+        </w:tc>
+        <w:tc>
+          <w:tcPr/>
+          <w:p>
+            <w:pPr>
+              <w:pStyle w:val="Compact"/>
+              <w:jc w:val="right"/>
+            </w:pPr>
+            <w:r>
+              <w:t xml:space="preserve">429</w:t>
+            </w:r>
+          </w:p>
+        </w:tc>
+      </w:tr>
+      <w:tr>
+        <w:tc>
+          <w:tcPr/>
+          <w:p>
+            <w:pPr>
+              <w:pStyle w:val="Compact"/>
+              <w:jc w:val="left"/>
+            </w:pPr>
+            <w:r>
+              <w:t xml:space="preserve">S-B: Complete-case</w:t>
+            </w:r>
+          </w:p>
+        </w:tc>
+        <w:tc>
+          <w:tcPr/>
+          <w:p>
+            <w:pPr>
+              <w:pStyle w:val="Compact"/>
+              <w:jc w:val="left"/>
+            </w:pPr>
+            <w:r>
+              <w:t xml:space="preserve">Access (OR)</w:t>
+            </w:r>
+          </w:p>
+        </w:tc>
+        <w:tc>
+          <w:tcPr/>
+          <w:p>
+            <w:pPr>
+              <w:pStyle w:val="Compact"/>
+              <w:jc w:val="left"/>
+            </w:pPr>
+            <w:r>
+              <w:t xml:space="preserve">Laryngology</w:t>
+            </w:r>
+          </w:p>
+        </w:tc>
+        <w:tc>
+          <w:tcPr/>
+          <w:p>
+            <w:pPr>
+              <w:pStyle w:val="Compact"/>
+              <w:jc w:val="right"/>
+            </w:pPr>
+            <w:r>
+              <w:t xml:space="preserve">1.53</w:t>
+            </w:r>
+          </w:p>
+        </w:tc>
+        <w:tc>
+          <w:tcPr/>
+          <w:p>
+            <w:pPr>
+              <w:pStyle w:val="Compact"/>
+              <w:jc w:val="left"/>
+            </w:pPr>
+            <w:r>
+              <w:t xml:space="preserve">0.42-5.52</w:t>
+            </w:r>
+          </w:p>
+        </w:tc>
+        <w:tc>
+          <w:tcPr/>
+          <w:p>
+            <w:pPr>
+              <w:pStyle w:val="Compact"/>
+              <w:jc w:val="right"/>
+            </w:pPr>
+            <w:r>
+              <w:t xml:space="preserve">0.517</w:t>
+            </w:r>
+          </w:p>
+        </w:tc>
+        <w:tc>
+          <w:tcPr/>
+          <w:p>
+            <w:pPr>
+              <w:pStyle w:val="Compact"/>
+              <w:jc w:val="right"/>
+            </w:pPr>
+            <w:r>
+              <w:t xml:space="preserve">701</w:t>
+            </w:r>
+          </w:p>
+        </w:tc>
+        <w:tc>
+          <w:tcPr/>
+          <w:p>
+            <w:pPr>
+              <w:pStyle w:val="Compact"/>
+              <w:jc w:val="right"/>
+            </w:pPr>
+            <w:r>
+              <w:t xml:space="preserve">412</w:t>
+            </w:r>
+          </w:p>
+        </w:tc>
+      </w:tr>
+      <w:tr>
+        <w:tc>
+          <w:tcPr/>
+          <w:p>
+            <w:pPr>
+              <w:pStyle w:val="Compact"/>
+              <w:jc w:val="left"/>
+            </w:pPr>
+            <w:r>
+              <w:t xml:space="preserve">S-B: Complete-case</w:t>
+            </w:r>
+          </w:p>
+        </w:tc>
+        <w:tc>
+          <w:tcPr/>
+          <w:p>
+            <w:pPr>
+              <w:pStyle w:val="Compact"/>
+              <w:jc w:val="left"/>
+            </w:pPr>
+            <w:r>
+              <w:t xml:space="preserve">Access (OR)</w:t>
+            </w:r>
+          </w:p>
+        </w:tc>
+        <w:tc>
+          <w:tcPr/>
+          <w:p>
+            <w:pPr>
+              <w:pStyle w:val="Compact"/>
+              <w:jc w:val="left"/>
+            </w:pPr>
+            <w:r>
+              <w:t xml:space="preserve">Pediatric otolaryngology</w:t>
+            </w:r>
+          </w:p>
+        </w:tc>
+        <w:tc>
+          <w:tcPr/>
+          <w:p>
+            <w:pPr>
+              <w:pStyle w:val="Compact"/>
+              <w:jc w:val="right"/>
+            </w:pPr>
+            <w:r>
+              <w:t xml:space="preserve">2.32</w:t>
+            </w:r>
+          </w:p>
+        </w:tc>
+        <w:tc>
+          <w:tcPr/>
+          <w:p>
+            <w:pPr>
+              <w:pStyle w:val="Compact"/>
+              <w:jc w:val="left"/>
+            </w:pPr>
+            <w:r>
+              <w:t xml:space="preserve">1.06-5.06</w:t>
+            </w:r>
+          </w:p>
+        </w:tc>
+        <w:tc>
+          <w:tcPr/>
+          <w:p>
+            <w:pPr>
+              <w:pStyle w:val="Compact"/>
+              <w:jc w:val="right"/>
+            </w:pPr>
+            <w:r>
+              <w:t xml:space="preserve">0.034</w:t>
+            </w:r>
+          </w:p>
+        </w:tc>
+        <w:tc>
+          <w:tcPr/>
+          <w:p>
+            <w:pPr>
+              <w:pStyle w:val="Compact"/>
+              <w:jc w:val="right"/>
+            </w:pPr>
+            <w:r>
+              <w:t xml:space="preserve">701</w:t>
+            </w:r>
+          </w:p>
+        </w:tc>
+        <w:tc>
+          <w:tcPr/>
+          <w:p>
+            <w:pPr>
+              <w:pStyle w:val="Compact"/>
+              <w:jc w:val="right"/>
+            </w:pPr>
+            <w:r>
+              <w:t xml:space="preserve">412</w:t>
+            </w:r>
+          </w:p>
+        </w:tc>
+      </w:tr>
+      <w:tr>
+        <w:tc>
+          <w:tcPr/>
+          <w:p>
+            <w:pPr>
+              <w:pStyle w:val="Compact"/>
+              <w:jc w:val="left"/>
+            </w:pPr>
+            <w:r>
+              <w:t xml:space="preserve">S-B: Complete-case</w:t>
+            </w:r>
+          </w:p>
+        </w:tc>
+        <w:tc>
+          <w:tcPr/>
+          <w:p>
+            <w:pPr>
+              <w:pStyle w:val="Compact"/>
+              <w:jc w:val="left"/>
+            </w:pPr>
+            <w:r>
+              <w:t xml:space="preserve">Access (OR)</w:t>
+            </w:r>
+          </w:p>
+        </w:tc>
+        <w:tc>
+          <w:tcPr/>
+          <w:p>
+            <w:pPr>
+              <w:pStyle w:val="Compact"/>
+              <w:jc w:val="left"/>
+            </w:pPr>
+            <w:r>
+              <w:t xml:space="preserve">Rural (vs urban)</w:t>
+            </w:r>
+          </w:p>
+        </w:tc>
+        <w:tc>
+          <w:tcPr/>
+          <w:p>
+            <w:pPr>
+              <w:pStyle w:val="Compact"/>
+              <w:jc w:val="right"/>
+            </w:pPr>
+            <w:r>
+              <w:t xml:space="preserve">1.00</w:t>
+            </w:r>
+          </w:p>
+        </w:tc>
+        <w:tc>
+          <w:tcPr/>
+          <w:p>
+            <w:pPr>
+              <w:pStyle w:val="Compact"/>
+              <w:jc w:val="left"/>
+            </w:pPr>
+            <w:r>
+              <w:t xml:space="preserve">0.69-1.45</w:t>
+            </w:r>
+          </w:p>
+        </w:tc>
+        <w:tc>
+          <w:tcPr/>
+          <w:p>
+            <w:pPr>
+              <w:pStyle w:val="Compact"/>
+              <w:jc w:val="right"/>
+            </w:pPr>
+            <w:r>
+              <w:t xml:space="preserve">1.000</w:t>
+            </w:r>
+          </w:p>
+        </w:tc>
+        <w:tc>
+          <w:tcPr/>
+          <w:p>
+            <w:pPr>
+              <w:pStyle w:val="Compact"/>
+              <w:jc w:val="right"/>
+            </w:pPr>
+            <w:r>
+              <w:t xml:space="preserve">701</w:t>
+            </w:r>
+          </w:p>
+        </w:tc>
+        <w:tc>
+          <w:tcPr/>
+          <w:p>
+            <w:pPr>
+              <w:pStyle w:val="Compact"/>
+              <w:jc w:val="right"/>
+            </w:pPr>
+            <w:r>
+              <w:t xml:space="preserve">412</w:t>
+            </w:r>
+          </w:p>
+        </w:tc>
+      </w:tr>
+      <w:tr>
+        <w:tc>
+          <w:tcPr/>
+          <w:p>
+            <w:pPr>
+              <w:pStyle w:val="Compact"/>
+              <w:jc w:val="left"/>
+            </w:pPr>
+            <w:r>
+              <w:t xml:space="preserve">S-B: Complete-case</w:t>
+            </w:r>
+          </w:p>
+        </w:tc>
+        <w:tc>
+          <w:tcPr/>
+          <w:p>
+            <w:pPr>
+              <w:pStyle w:val="Compact"/>
+              <w:jc w:val="left"/>
+            </w:pPr>
+            <w:r>
+              <w:t xml:space="preserve">Timeliness (IRR)</w:t>
+            </w:r>
+          </w:p>
+        </w:tc>
+        <w:tc>
+          <w:tcPr/>
+          <w:p>
+            <w:pPr>
+              <w:pStyle w:val="Compact"/>
+              <w:jc w:val="left"/>
+            </w:pPr>
+            <w:r>
+              <w:t xml:space="preserve">Laryngology</w:t>
+            </w:r>
+          </w:p>
+        </w:tc>
+        <w:tc>
+          <w:tcPr/>
+          <w:p>
+            <w:pPr>
+              <w:pStyle w:val="Compact"/>
+              <w:jc w:val="right"/>
+            </w:pPr>
+            <w:r>
+              <w:t xml:space="preserve">2.51</w:t>
+            </w:r>
+          </w:p>
+        </w:tc>
+        <w:tc>
+          <w:tcPr/>
+          <w:p>
+            <w:pPr>
+              <w:pStyle w:val="Compact"/>
+              <w:jc w:val="left"/>
+            </w:pPr>
+            <w:r>
+              <w:t xml:space="preserve">1.22-5.18</w:t>
+            </w:r>
+          </w:p>
+        </w:tc>
+        <w:tc>
+          <w:tcPr/>
+          <w:p>
+            <w:pPr>
+              <w:pStyle w:val="Compact"/>
+              <w:jc w:val="right"/>
+            </w:pPr>
+            <w:r>
+              <w:t xml:space="preserve">0.012</w:t>
+            </w:r>
+          </w:p>
+        </w:tc>
+        <w:tc>
+          <w:tcPr/>
+          <w:p>
+            <w:pPr>
+              <w:pStyle w:val="Compact"/>
+              <w:jc w:val="right"/>
+            </w:pPr>
+            <w:r>
+              <w:t xml:space="preserve">701</w:t>
+            </w:r>
+          </w:p>
+        </w:tc>
+        <w:tc>
+          <w:tcPr/>
+          <w:p>
+            <w:pPr>
+              <w:pStyle w:val="Compact"/>
+              <w:jc w:val="right"/>
+            </w:pPr>
+            <w:r>
+              <w:t xml:space="preserve">412</w:t>
+            </w:r>
+          </w:p>
+        </w:tc>
+      </w:tr>
+      <w:tr>
+        <w:tc>
+          <w:tcPr/>
+          <w:p>
+            <w:pPr>
+              <w:pStyle w:val="Compact"/>
+              <w:jc w:val="left"/>
+            </w:pPr>
+            <w:r>
+              <w:t xml:space="preserve">S-B: Complete-case</w:t>
+            </w:r>
+          </w:p>
+        </w:tc>
+        <w:tc>
+          <w:tcPr/>
+          <w:p>
+            <w:pPr>
+              <w:pStyle w:val="Compact"/>
+              <w:jc w:val="left"/>
+            </w:pPr>
+            <w:r>
+              <w:t xml:space="preserve">Timeliness (IRR)</w:t>
+            </w:r>
+          </w:p>
+        </w:tc>
+        <w:tc>
+          <w:tcPr/>
+          <w:p>
+            <w:pPr>
+              <w:pStyle w:val="Compact"/>
+              <w:jc w:val="left"/>
+            </w:pPr>
+            <w:r>
+              <w:t xml:space="preserve">Pediatric otolaryngology</w:t>
+            </w:r>
+          </w:p>
+        </w:tc>
+        <w:tc>
+          <w:tcPr/>
+          <w:p>
+            <w:pPr>
+              <w:pStyle w:val="Compact"/>
+              <w:jc w:val="right"/>
+            </w:pPr>
+            <w:r>
+              <w:t xml:space="preserve">1.52</w:t>
+            </w:r>
+          </w:p>
+        </w:tc>
+        <w:tc>
+          <w:tcPr/>
+          <w:p>
+            <w:pPr>
+              <w:pStyle w:val="Compact"/>
+              <w:jc w:val="left"/>
+            </w:pPr>
+            <w:r>
+              <w:t xml:space="preserve">1.02-2.28</w:t>
+            </w:r>
+          </w:p>
+        </w:tc>
+        <w:tc>
+          <w:tcPr/>
+          <w:p>
+            <w:pPr>
+              <w:pStyle w:val="Compact"/>
+              <w:jc w:val="right"/>
+            </w:pPr>
+            <w:r>
+              <w:t xml:space="preserve">0.040</w:t>
+            </w:r>
+          </w:p>
+        </w:tc>
+        <w:tc>
+          <w:tcPr/>
+          <w:p>
+            <w:pPr>
+              <w:pStyle w:val="Compact"/>
+              <w:jc w:val="right"/>
+            </w:pPr>
+            <w:r>
+              <w:t xml:space="preserve">701</w:t>
+            </w:r>
+          </w:p>
+        </w:tc>
+        <w:tc>
+          <w:tcPr/>
+          <w:p>
+            <w:pPr>
+              <w:pStyle w:val="Compact"/>
+              <w:jc w:val="right"/>
+            </w:pPr>
+            <w:r>
+              <w:t xml:space="preserve">412</w:t>
+            </w:r>
+          </w:p>
+        </w:tc>
+      </w:tr>
+      <w:tr>
+        <w:tc>
+          <w:tcPr/>
+          <w:p>
+            <w:pPr>
+              <w:pStyle w:val="Compact"/>
+              <w:jc w:val="left"/>
+            </w:pPr>
+            <w:r>
+              <w:t xml:space="preserve">S-B: Complete-case</w:t>
+            </w:r>
+          </w:p>
+        </w:tc>
+        <w:tc>
+          <w:tcPr/>
+          <w:p>
+            <w:pPr>
+              <w:pStyle w:val="Compact"/>
+              <w:jc w:val="left"/>
+            </w:pPr>
+            <w:r>
+              <w:t xml:space="preserve">Timeliness (IRR)</w:t>
+            </w:r>
+          </w:p>
+        </w:tc>
+        <w:tc>
+          <w:tcPr/>
+          <w:p>
+            <w:pPr>
+              <w:pStyle w:val="Compact"/>
+              <w:jc w:val="left"/>
+            </w:pPr>
+            <w:r>
+              <w:t xml:space="preserve">Rural (vs urban)</w:t>
+            </w:r>
+          </w:p>
+        </w:tc>
+        <w:tc>
+          <w:tcPr/>
+          <w:p>
+            <w:pPr>
+              <w:pStyle w:val="Compact"/>
+              <w:jc w:val="right"/>
+            </w:pPr>
+            <w:r>
+              <w:t xml:space="preserve">1.14</w:t>
+            </w:r>
+          </w:p>
+        </w:tc>
+        <w:tc>
+          <w:tcPr/>
+          <w:p>
+            <w:pPr>
+              <w:pStyle w:val="Compact"/>
+              <w:jc w:val="left"/>
+            </w:pPr>
+            <w:r>
+              <w:t xml:space="preserve">0.87-1.48</w:t>
+            </w:r>
+          </w:p>
+        </w:tc>
+        <w:tc>
+          <w:tcPr/>
+          <w:p>
+            <w:pPr>
+              <w:pStyle w:val="Compact"/>
+              <w:jc w:val="right"/>
+            </w:pPr>
+            <w:r>
+              <w:t xml:space="preserve">0.340</w:t>
+            </w:r>
+          </w:p>
+        </w:tc>
+        <w:tc>
+          <w:tcPr/>
+          <w:p>
+            <w:pPr>
+              <w:pStyle w:val="Compact"/>
+              <w:jc w:val="right"/>
+            </w:pPr>
+            <w:r>
+              <w:t xml:space="preserve">701</w:t>
+            </w:r>
+          </w:p>
+        </w:tc>
+        <w:tc>
+          <w:tcPr/>
+          <w:p>
+            <w:pPr>
+              <w:pStyle w:val="Compact"/>
+              <w:jc w:val="right"/>
+            </w:pPr>
+            <w:r>
+              <w:t xml:space="preserve">412</w:t>
+            </w:r>
+          </w:p>
+        </w:tc>
+      </w:tr>
+    </w:tbl>
     <w:bookmarkEnd w:id="45"/>
     <w:bookmarkStart w:id="64" w:name="supplementary-figures"/>
     <w:p>
@@ -21516,7 +23615,7 @@
           <w:b/>
           <w:bCs/>
         </w:rPr>
-        <w:t xml:space="preserve">Table S8. Subspecialty-matched chief complaints.</w:t>
+        <w:t xml:space="preserve">Table S9. Subspecialty-matched chief complaints.</w:t>
       </w:r>
     </w:p>
     <w:tbl>

</xml_diff>

<commit_message>
Reference the 2011 HHS mystery-shopper controversy and add the canonical SP ethics analysis
Adds the definitive ethical-justification citation for covert simulated-patient
research (Rhodes KV, Miller FG. Simulated Patient Studies: An Ethical Analysis.
Milbank Q. 2012;90(4):706-724. doi:10.1111/j.1468-0009.2012.00680.x) and anchors
the ethics paragraph to the public debate that motivated it: the 2011 federally
commissioned 'mystery shopper' primary-care-access survey that was shelved over
deception concerns. Our design is framed as satisfying Rhodes & Miller's three
conditions (minimal risk/burden, consent waiver necessary for valid data,
substantial social value). No standalone JAMA article exists on this; the AMA
Journal of Ethics (Virtual Mentor, 2013) and Rhodes NEJM 2011 Perspective are the
other AMA-family pieces and can be added if desired.

Co-Authored-By: Claude Opus 4.8 (1M context) <noreply@anthropic.com>
</commit_message>
<xml_diff>
--- a/manuscript_output/manuscript_mystery_caller.docx
+++ b/manuscript_output/manuscript_mystery_caller.docx
@@ -429,7 +429,31 @@
         <w:t xml:space="preserve"> </w:t>
       </w:r>
       <w:r>
-        <w:t xml:space="preserve">The University of Colorado Multiple Institutional Review Board (COMIRB 23-1303) deemed this study not human subjects research and did not require informed consent. Consistent with established simulated-patient practice, the covert design incorporated several safeguards: no protected health information was collected and no calls were recorded; each contact was a single brief call that booked no real appointment and imposed minimal burden on office staff; and identifying information about individual staff members was neither requested nor stored. Covert simulated calling was necessary because non-covert methods—for example, surveys of offices aware of being observed—would systematically bias access estimates through social desirability, the same rationale that underlies the design’s measurement validity</w:t>
+        <w:t xml:space="preserve">The University of Colorado Multiple Institutional Review Board (COMIRB 23-1303) deemed this study not human subjects research and did not require informed consent. The covert measurement of clinician behavior has been debated—most publicly when a 2011 federally commissioned</w:t>
+      </w:r>
+      <w:r>
+        <w:t xml:space="preserve"> </w:t>
+      </w:r>
+      <w:r>
+        <w:t xml:space="preserve">“mystery shopper”</w:t>
+      </w:r>
+      <w:r>
+        <w:t xml:space="preserve"> </w:t>
+      </w:r>
+      <w:r>
+        <w:t xml:space="preserve">survey of primary-care access was shelved amid concern about deceiving physician practices—but a formal ethical analysis has since established that simulated-patient research without prior consent is justified when risks and burdens are minimal, a consent waiver is necessary for scientifically valid data, and the study carries substantial social value</w:t>
+      </w:r>
+      <w:hyperlink w:anchor="ref-rhodesmiller2012">
+        <w:r>
+          <w:rPr>
+            <w:rStyle w:val="Hyperlink"/>
+            <w:vertAlign w:val="superscript"/>
+          </w:rPr>
+          <w:t xml:space="preserve">5</w:t>
+        </w:r>
+      </w:hyperlink>
+      <w:r>
+        <w:t xml:space="preserve">. This study was designed to satisfy those conditions. Consistent with established simulated-patient practice, the covert design incorporated several safeguards: no protected health information was collected and no calls were recorded; each contact was a single brief call that booked no real appointment and imposed minimal burden on office staff; and identifying information about individual staff members was neither requested nor stored. Covert simulated calling was necessary because non-covert methods—for example, surveys of offices aware of being observed—would systematically bias access estimates through social desirability, the same rationale that underlies the design’s measurement validity</w:t>
       </w:r>
       <w:hyperlink w:anchor="ref-rankin2022">
         <w:r>
@@ -444,9 +468,9 @@
         <w:rPr>
           <w:vertAlign w:val="superscript"/>
         </w:rPr>
-        <w:t xml:space="preserve">–</w:t>
-      </w:r>
-      <w:hyperlink w:anchor="ref-hodson2025">
+        <w:t xml:space="preserve">,</w:t>
+      </w:r>
+      <w:hyperlink w:anchor="ref-moriarty2003">
         <w:r>
           <w:rPr>
             <w:rStyle w:val="Hyperlink"/>
@@ -456,9 +480,12 @@
         </w:r>
       </w:hyperlink>
       <w:r>
-        <w:t xml:space="preserve">. Aggregate, market-level findings will be made available through specialty-society and state channels as a benefit to participating communities, in the spirit of the participant-feedback provisions used in prior covert simulated-patient studies</w:t>
-      </w:r>
-      <w:hyperlink w:anchor="ref-lungfiel2023">
+        <w:rPr>
+          <w:vertAlign w:val="superscript"/>
+        </w:rPr>
+        <w:t xml:space="preserve">,</w:t>
+      </w:r>
+      <w:hyperlink w:anchor="ref-hodson2025">
         <w:r>
           <w:rPr>
             <w:rStyle w:val="Hyperlink"/>
@@ -468,90 +495,9 @@
         </w:r>
       </w:hyperlink>
       <w:r>
-        <w:t xml:space="preserve">.</w:t>
-      </w:r>
-    </w:p>
-    <w:p>
-      <w:pPr>
-        <w:pStyle w:val="BodyText"/>
-      </w:pPr>
-      <w:r>
-        <w:t xml:space="preserve">Analyses were restricted to calls with a completed data-collection record and a determinable physician subspecialty. This study did not manipulate patient insurance; the exposures of interest were the requested subspecialty and the geographic context of the practice.</w:t>
-      </w:r>
-    </w:p>
-    <w:bookmarkEnd w:id="22"/>
-    <w:bookmarkStart w:id="23" w:name="outcomes"/>
-    <w:p>
-      <w:pPr>
-        <w:pStyle w:val="Heading3"/>
-      </w:pPr>
-      <w:r>
-        <w:t xml:space="preserve">Outcomes</w:t>
-      </w:r>
-    </w:p>
-    <w:p>
-      <w:pPr>
-        <w:pStyle w:val="FirstParagraph"/>
-      </w:pPr>
-      <w:r>
-        <w:t xml:space="preserve">Two outcomes were analyzed as a two-part (hurdle) process. The first,</w:t>
-      </w:r>
-      <w:r>
-        <w:t xml:space="preserve"> </w:t>
-      </w:r>
-      <w:r>
-        <w:rPr>
-          <w:i/>
-          <w:iCs/>
-        </w:rPr>
-        <w:t xml:space="preserve">access</w:t>
-      </w:r>
-      <w:r>
-        <w:t xml:space="preserve">, was whether the office offered a new-patient appointment with the sampled physician (binary). The second,</w:t>
-      </w:r>
-      <w:r>
-        <w:t xml:space="preserve"> </w:t>
-      </w:r>
-      <w:r>
-        <w:rPr>
-          <w:i/>
-          <w:iCs/>
-        </w:rPr>
-        <w:t xml:space="preserve">timeliness</w:t>
-      </w:r>
-      <w:r>
-        <w:t xml:space="preserve">, was the number of</w:t>
-      </w:r>
-      <w:r>
-        <w:t xml:space="preserve"> </w:t>
-      </w:r>
-      <w:r>
-        <w:rPr>
-          <w:b/>
-          <w:bCs/>
-        </w:rPr>
-        <w:t xml:space="preserve">business days</w:t>
-      </w:r>
-      <w:r>
-        <w:t xml:space="preserve"> </w:t>
-      </w:r>
-      <w:r>
-        <w:t xml:space="preserve">from the call to the next available appointment, counted excluding weekends and U.S. federal holidays, and defined only for calls in which an appointment was offered. We recorded the</w:t>
-      </w:r>
-      <w:r>
-        <w:t xml:space="preserve"> </w:t>
-      </w:r>
-      <w:r>
-        <w:rPr>
-          <w:i/>
-          <w:iCs/>
-        </w:rPr>
-        <w:t xml:space="preserve">first</w:t>
-      </w:r>
-      <w:r>
-        <w:t xml:space="preserve">-available appointment; prior simulated-patient work has shown that the more elaborate third-next-available metric adds little beyond first-available while reducing reliability</w:t>
-      </w:r>
-      <w:hyperlink w:anchor="ref-campbell2013">
+        <w:t xml:space="preserve">. Aggregate, market-level findings will be made available through specialty-society and state channels as a benefit to participating communities, in the spirit of the participant-feedback provisions used in prior covert simulated-patient studies</w:t>
+      </w:r>
+      <w:hyperlink w:anchor="ref-lungfiel2023">
         <w:r>
           <w:rPr>
             <w:rStyle w:val="Hyperlink"/>
@@ -564,14 +510,22 @@
         <w:t xml:space="preserve">.</w:t>
       </w:r>
     </w:p>
-    <w:bookmarkEnd w:id="23"/>
-    <w:bookmarkStart w:id="24" w:name="geographic-covariates"/>
+    <w:p>
+      <w:pPr>
+        <w:pStyle w:val="BodyText"/>
+      </w:pPr>
+      <w:r>
+        <w:t xml:space="preserve">Analyses were restricted to calls with a completed data-collection record and a determinable physician subspecialty. This study did not manipulate patient insurance; the exposures of interest were the requested subspecialty and the geographic context of the practice.</w:t>
+      </w:r>
+    </w:p>
+    <w:bookmarkEnd w:id="22"/>
+    <w:bookmarkStart w:id="23" w:name="outcomes"/>
     <w:p>
       <w:pPr>
         <w:pStyle w:val="Heading3"/>
       </w:pPr>
       <w:r>
-        <w:t xml:space="preserve">Geographic covariates</w:t>
+        <w:t xml:space="preserve">Outcomes</w:t>
       </w:r>
     </w:p>
     <w:p>
@@ -579,9 +533,64 @@
         <w:pStyle w:val="FirstParagraph"/>
       </w:pPr>
       <w:r>
-        <w:t xml:space="preserve">Each practice was linked to contextual covariates by practice ZIP code and state. County was assigned from a 2020 Census ZCTA-to-county crosswalk (dominant county by land area). Covariates comprised: county otolaryngologist supply per 100,000 population; the state Medicaid-to-Medicare fee index (Kaiser Family Foundation, 2024, all services)</w:t>
-      </w:r>
-      <w:hyperlink w:anchor="ref-kfffee">
+        <w:t xml:space="preserve">Two outcomes were analyzed as a two-part (hurdle) process. The first,</w:t>
+      </w:r>
+      <w:r>
+        <w:t xml:space="preserve"> </w:t>
+      </w:r>
+      <w:r>
+        <w:rPr>
+          <w:i/>
+          <w:iCs/>
+        </w:rPr>
+        <w:t xml:space="preserve">access</w:t>
+      </w:r>
+      <w:r>
+        <w:t xml:space="preserve">, was whether the office offered a new-patient appointment with the sampled physician (binary). The second,</w:t>
+      </w:r>
+      <w:r>
+        <w:t xml:space="preserve"> </w:t>
+      </w:r>
+      <w:r>
+        <w:rPr>
+          <w:i/>
+          <w:iCs/>
+        </w:rPr>
+        <w:t xml:space="preserve">timeliness</w:t>
+      </w:r>
+      <w:r>
+        <w:t xml:space="preserve">, was the number of</w:t>
+      </w:r>
+      <w:r>
+        <w:t xml:space="preserve"> </w:t>
+      </w:r>
+      <w:r>
+        <w:rPr>
+          <w:b/>
+          <w:bCs/>
+        </w:rPr>
+        <w:t xml:space="preserve">business days</w:t>
+      </w:r>
+      <w:r>
+        <w:t xml:space="preserve"> </w:t>
+      </w:r>
+      <w:r>
+        <w:t xml:space="preserve">from the call to the next available appointment, counted excluding weekends and U.S. federal holidays, and defined only for calls in which an appointment was offered. We recorded the</w:t>
+      </w:r>
+      <w:r>
+        <w:t xml:space="preserve"> </w:t>
+      </w:r>
+      <w:r>
+        <w:rPr>
+          <w:i/>
+          <w:iCs/>
+        </w:rPr>
+        <w:t xml:space="preserve">first</w:t>
+      </w:r>
+      <w:r>
+        <w:t xml:space="preserve">-available appointment; prior simulated-patient work has shown that the more elaborate third-next-available metric adds little beyond first-available while reducing reliability</w:t>
+      </w:r>
+      <w:hyperlink w:anchor="ref-campbell2013">
         <w:r>
           <w:rPr>
             <w:rStyle w:val="Hyperlink"/>
@@ -591,9 +600,27 @@
         </w:r>
       </w:hyperlink>
       <w:r>
-        <w:t xml:space="preserve">; the CDC/ATSDR Social Vulnerability Index (SVI, 2022, tract-level, population-weighted to the practice ZIP)</w:t>
-      </w:r>
-      <w:hyperlink w:anchor="ref-cdcsvi">
+        <w:t xml:space="preserve">.</w:t>
+      </w:r>
+    </w:p>
+    <w:bookmarkEnd w:id="23"/>
+    <w:bookmarkStart w:id="24" w:name="geographic-covariates"/>
+    <w:p>
+      <w:pPr>
+        <w:pStyle w:val="Heading3"/>
+      </w:pPr>
+      <w:r>
+        <w:t xml:space="preserve">Geographic covariates</w:t>
+      </w:r>
+    </w:p>
+    <w:p>
+      <w:pPr>
+        <w:pStyle w:val="FirstParagraph"/>
+      </w:pPr>
+      <w:r>
+        <w:t xml:space="preserve">Each practice was linked to contextual covariates by practice ZIP code and state. County was assigned from a 2020 Census ZCTA-to-county crosswalk (dominant county by land area). Covariates comprised: county otolaryngologist supply per 100,000 population; the state Medicaid-to-Medicare fee index (Kaiser Family Foundation, 2024, all services)</w:t>
+      </w:r>
+      <w:hyperlink w:anchor="ref-kfffee">
         <w:r>
           <w:rPr>
             <w:rStyle w:val="Hyperlink"/>
@@ -603,67 +630,9 @@
         </w:r>
       </w:hyperlink>
       <w:r>
-        <w:t xml:space="preserve">; the county fraction of Medicare beneficiaries dual-eligible for Medicaid (CMS); metropolitan hospital-market concentration (Herfindahl–Hirschman Index [HHI], KFF 2024; available for metropolitan areas only); rurality, dichotomized from Rural–Urban Commuting Area (RUCA) codes as urban (RUCA 1–3) versus rural (RUCA 4–10); and the American Academy of Otolaryngology–Head and Neck Surgery (AAO-HNS) Board of Governors region.</w:t>
-      </w:r>
-    </w:p>
-    <w:bookmarkEnd w:id="24"/>
-    <w:bookmarkStart w:id="25" w:name="statistical-analysis"/>
-    <w:p>
-      <w:pPr>
-        <w:pStyle w:val="Heading3"/>
-      </w:pPr>
-      <w:r>
-        <w:t xml:space="preserve">Statistical analysis</w:t>
-      </w:r>
-    </w:p>
-    <w:p>
-      <w:pPr>
-        <w:pStyle w:val="FirstParagraph"/>
-      </w:pPr>
-      <w:r>
-        <w:t xml:space="preserve">Because business-day wait time is observed only when an appointment is offered, we modeled access and timeliness separately to avoid conditioning wait-time estimates on the offer.</w:t>
-      </w:r>
-      <w:r>
-        <w:t xml:space="preserve"> </w:t>
-      </w:r>
-      <w:r>
-        <w:rPr>
-          <w:i/>
-          <w:iCs/>
-        </w:rPr>
-        <w:t xml:space="preserve">Access</w:t>
-      </w:r>
-      <w:r>
-        <w:t xml:space="preserve"> </w:t>
-      </w:r>
-      <w:r>
-        <w:t xml:space="preserve">was modeled with a mixed-effects logistic regression over all analytic calls;</w:t>
-      </w:r>
-      <w:r>
-        <w:t xml:space="preserve"> </w:t>
-      </w:r>
-      <w:r>
-        <w:rPr>
-          <w:i/>
-          <w:iCs/>
-        </w:rPr>
-        <w:t xml:space="preserve">timeliness</w:t>
-      </w:r>
-      <w:r>
-        <w:t xml:space="preserve"> </w:t>
-      </w:r>
-      <w:r>
-        <w:t xml:space="preserve">with a mixed-effects negative binomial regression over the offered subset. The negative binomial distribution was selected over Poisson on the basis of substantial overdispersion (Pearson φ = 6.22). Both models included a random intercept for core-based statistical area (CBSA; county FIPS where CBSA was undefined) to account for within-market correlation, and adjusted for the requested subspecialty (reference: general otolaryngology), county ENT supply, Medicaid fee index, SVI, dual-eligible fraction, and rurality (reference: urban). The identity of the caller (research assistant) was included as a fixed nuisance term to adjust for operator-level differences in call handling. Continuous covariates were standardized and, for the few missing values (&lt;3%), median-imputed.</w:t>
-      </w:r>
-    </w:p>
-    <w:p>
-      <w:pPr>
-        <w:pStyle w:val="BodyText"/>
-      </w:pPr>
-      <w:r>
-        <w:t xml:space="preserve">Effects are reported as odds ratios (access) and incidence rate ratios (timeliness) with 95% Wald confidence intervals. Pairwise differences between subspecialties were estimated with Tukey-adjusted estimated marginal means</w:t>
-      </w:r>
-      <w:hyperlink w:anchor="ref-emmeans">
+        <w:t xml:space="preserve">; the CDC/ATSDR Social Vulnerability Index (SVI, 2022, tract-level, population-weighted to the practice ZIP)</w:t>
+      </w:r>
+      <w:hyperlink w:anchor="ref-cdcsvi">
         <w:r>
           <w:rPr>
             <w:rStyle w:val="Hyperlink"/>
@@ -673,9 +642,67 @@
         </w:r>
       </w:hyperlink>
       <w:r>
-        <w:t xml:space="preserve">. Effect modification of the geographic covariates by subspecialty was tested by likelihood-ratio tests. Market-level clustering was summarized by the intraclass correlation coefficient (ICC). Because the HHI is defined only in metropolitan areas, its association with timeliness was assessed in a sensitivity model restricted to the metropolitan subset. Two additional sensitivity analyses were performed: a three-level rurality specification (urban, RUCA 1–3; suburban, 4–6; rural, 7–10) in place of the binary contrast, and a complete-case refit that excluded records with any missing covariate rather than median-imputing them. Whether call incompleteness was related to the measured covariates was assessed with chi-square and Wilcoxon rank-sum tests. Analyses used R 4.4.2</w:t>
-      </w:r>
-      <w:hyperlink w:anchor="ref-rcoreteam">
+        <w:t xml:space="preserve">; the county fraction of Medicare beneficiaries dual-eligible for Medicaid (CMS); metropolitan hospital-market concentration (Herfindahl–Hirschman Index [HHI], KFF 2024; available for metropolitan areas only); rurality, dichotomized from Rural–Urban Commuting Area (RUCA) codes as urban (RUCA 1–3) versus rural (RUCA 4–10); and the American Academy of Otolaryngology–Head and Neck Surgery (AAO-HNS) Board of Governors region.</w:t>
+      </w:r>
+    </w:p>
+    <w:bookmarkEnd w:id="24"/>
+    <w:bookmarkStart w:id="25" w:name="statistical-analysis"/>
+    <w:p>
+      <w:pPr>
+        <w:pStyle w:val="Heading3"/>
+      </w:pPr>
+      <w:r>
+        <w:t xml:space="preserve">Statistical analysis</w:t>
+      </w:r>
+    </w:p>
+    <w:p>
+      <w:pPr>
+        <w:pStyle w:val="FirstParagraph"/>
+      </w:pPr>
+      <w:r>
+        <w:t xml:space="preserve">Because business-day wait time is observed only when an appointment is offered, we modeled access and timeliness separately to avoid conditioning wait-time estimates on the offer.</w:t>
+      </w:r>
+      <w:r>
+        <w:t xml:space="preserve"> </w:t>
+      </w:r>
+      <w:r>
+        <w:rPr>
+          <w:i/>
+          <w:iCs/>
+        </w:rPr>
+        <w:t xml:space="preserve">Access</w:t>
+      </w:r>
+      <w:r>
+        <w:t xml:space="preserve"> </w:t>
+      </w:r>
+      <w:r>
+        <w:t xml:space="preserve">was modeled with a mixed-effects logistic regression over all analytic calls;</w:t>
+      </w:r>
+      <w:r>
+        <w:t xml:space="preserve"> </w:t>
+      </w:r>
+      <w:r>
+        <w:rPr>
+          <w:i/>
+          <w:iCs/>
+        </w:rPr>
+        <w:t xml:space="preserve">timeliness</w:t>
+      </w:r>
+      <w:r>
+        <w:t xml:space="preserve"> </w:t>
+      </w:r>
+      <w:r>
+        <w:t xml:space="preserve">with a mixed-effects negative binomial regression over the offered subset. The negative binomial distribution was selected over Poisson on the basis of substantial overdispersion (Pearson φ = 6.22). Both models included a random intercept for core-based statistical area (CBSA; county FIPS where CBSA was undefined) to account for within-market correlation, and adjusted for the requested subspecialty (reference: general otolaryngology), county ENT supply, Medicaid fee index, SVI, dual-eligible fraction, and rurality (reference: urban). The identity of the caller (research assistant) was included as a fixed nuisance term to adjust for operator-level differences in call handling. Continuous covariates were standardized and, for the few missing values (&lt;3%), median-imputed.</w:t>
+      </w:r>
+    </w:p>
+    <w:p>
+      <w:pPr>
+        <w:pStyle w:val="BodyText"/>
+      </w:pPr>
+      <w:r>
+        <w:t xml:space="preserve">Effects are reported as odds ratios (access) and incidence rate ratios (timeliness) with 95% Wald confidence intervals. Pairwise differences between subspecialties were estimated with Tukey-adjusted estimated marginal means</w:t>
+      </w:r>
+      <w:hyperlink w:anchor="ref-emmeans">
         <w:r>
           <w:rPr>
             <w:rStyle w:val="Hyperlink"/>
@@ -685,21 +712,9 @@
         </w:r>
       </w:hyperlink>
       <w:r>
-        <w:t xml:space="preserve"> </w:t>
-      </w:r>
-      <w:r>
-        <w:t xml:space="preserve">(packages</w:t>
-      </w:r>
-      <w:r>
-        <w:t xml:space="preserve"> </w:t>
-      </w:r>
-      <w:r>
-        <w:rPr>
-          <w:rStyle w:val="VerbatimChar"/>
-        </w:rPr>
-        <w:t xml:space="preserve">glmmTMB</w:t>
-      </w:r>
-      <w:hyperlink w:anchor="ref-glmmTMB">
+        <w:t xml:space="preserve">. Effect modification of the geographic covariates by subspecialty was tested by likelihood-ratio tests. Market-level clustering was summarized by the intraclass correlation coefficient (ICC). Because the HHI is defined only in metropolitan areas, its association with timeliness was assessed in a sensitivity model restricted to the metropolitan subset. Two additional sensitivity analyses were performed: a three-level rurality specification (urban, RUCA 1–3; suburban, 4–6; rural, 7–10) in place of the binary contrast, and a complete-case refit that excluded records with any missing covariate rather than median-imputing them. Whether call incompleteness was related to the measured covariates was assessed with chi-square and Wilcoxon rank-sum tests. Analyses used R 4.4.2</w:t>
+      </w:r>
+      <w:hyperlink w:anchor="ref-rcoreteam">
         <w:r>
           <w:rPr>
             <w:rStyle w:val="Hyperlink"/>
@@ -709,7 +724,10 @@
         </w:r>
       </w:hyperlink>
       <w:r>
-        <w:t xml:space="preserve">,</w:t>
+        <w:t xml:space="preserve"> </w:t>
+      </w:r>
+      <w:r>
+        <w:t xml:space="preserve">(packages</w:t>
       </w:r>
       <w:r>
         <w:t xml:space="preserve"> </w:t>
@@ -718,33 +736,9 @@
         <w:rPr>
           <w:rStyle w:val="VerbatimChar"/>
         </w:rPr>
-        <w:t xml:space="preserve">emmeans</w:t>
-      </w:r>
-      <w:hyperlink w:anchor="ref-emmeans">
-        <w:r>
-          <w:rPr>
-            <w:rStyle w:val="Hyperlink"/>
-            <w:vertAlign w:val="superscript"/>
-          </w:rPr>
-          <w:t xml:space="preserve">11</w:t>
-        </w:r>
-      </w:hyperlink>
-      <w:r>
-        <w:t xml:space="preserve">, and the study package</w:t>
-      </w:r>
-      <w:r>
-        <w:t xml:space="preserve"> </w:t>
-      </w:r>
-      <w:r>
-        <w:rPr>
-          <w:rStyle w:val="VerbatimChar"/>
-        </w:rPr>
-        <w:t xml:space="preserve">mysterycall</w:t>
-      </w:r>
-      <w:r>
-        <w:t xml:space="preserve">); two-sided α = 0.05. Reporting follows the STROBE guideline for observational studies</w:t>
-      </w:r>
-      <w:hyperlink w:anchor="ref-strobe">
+        <w:t xml:space="preserve">glmmTMB</w:t>
+      </w:r>
+      <w:hyperlink w:anchor="ref-glmmTMB">
         <w:r>
           <w:rPr>
             <w:rStyle w:val="Hyperlink"/>
@@ -754,12 +748,42 @@
         </w:r>
       </w:hyperlink>
       <w:r>
+        <w:t xml:space="preserve">,</w:t>
+      </w:r>
+      <w:r>
         <w:t xml:space="preserve"> </w:t>
       </w:r>
       <w:r>
-        <w:t xml:space="preserve">and the simulated-patient–specific CRiSP/CRiSPHe reporting checklist</w:t>
-      </w:r>
-      <w:hyperlink w:anchor="ref-crisp2021">
+        <w:rPr>
+          <w:rStyle w:val="VerbatimChar"/>
+        </w:rPr>
+        <w:t xml:space="preserve">emmeans</w:t>
+      </w:r>
+      <w:hyperlink w:anchor="ref-emmeans">
+        <w:r>
+          <w:rPr>
+            <w:rStyle w:val="Hyperlink"/>
+            <w:vertAlign w:val="superscript"/>
+          </w:rPr>
+          <w:t xml:space="preserve">12</w:t>
+        </w:r>
+      </w:hyperlink>
+      <w:r>
+        <w:t xml:space="preserve">, and the study package</w:t>
+      </w:r>
+      <w:r>
+        <w:t xml:space="preserve"> </w:t>
+      </w:r>
+      <w:r>
+        <w:rPr>
+          <w:rStyle w:val="VerbatimChar"/>
+        </w:rPr>
+        <w:t xml:space="preserve">mysterycall</w:t>
+      </w:r>
+      <w:r>
+        <w:t xml:space="preserve">); two-sided α = 0.05. Reporting follows the STROBE guideline for observational studies</w:t>
+      </w:r>
+      <w:hyperlink w:anchor="ref-strobe">
         <w:r>
           <w:rPr>
             <w:rStyle w:val="Hyperlink"/>
@@ -769,12 +793,12 @@
         </w:r>
       </w:hyperlink>
       <w:r>
-        <w:rPr>
-          <w:vertAlign w:val="superscript"/>
-        </w:rPr>
-        <w:t xml:space="preserve">,</w:t>
-      </w:r>
-      <w:hyperlink w:anchor="ref-crisphe2024">
+        <w:t xml:space="preserve"> </w:t>
+      </w:r>
+      <w:r>
+        <w:t xml:space="preserve">and the simulated-patient–specific CRiSP/CRiSPHe reporting checklist</w:t>
+      </w:r>
+      <w:hyperlink w:anchor="ref-crisp2021">
         <w:r>
           <w:rPr>
             <w:rStyle w:val="Hyperlink"/>
@@ -784,43 +808,12 @@
         </w:r>
       </w:hyperlink>
       <w:r>
-        <w:t xml:space="preserve">.</w:t>
-      </w:r>
-    </w:p>
-    <w:bookmarkEnd w:id="25"/>
-    <w:bookmarkStart w:id="26" w:name="sample-size-and-power"/>
-    <w:p>
-      <w:pPr>
-        <w:pStyle w:val="Heading3"/>
-      </w:pPr>
-      <w:r>
-        <w:t xml:space="preserve">Sample size and power</w:t>
-      </w:r>
-    </w:p>
-    <w:p>
-      <w:pPr>
-        <w:pStyle w:val="FirstParagraph"/>
-      </w:pPr>
-      <w:r>
-        <w:t xml:space="preserve">The sample size was fixed</w:t>
-      </w:r>
-      <w:r>
-        <w:t xml:space="preserve"> </w:t>
-      </w:r>
-      <w:r>
         <w:rPr>
-          <w:i/>
-          <w:iCs/>
+          <w:vertAlign w:val="superscript"/>
         </w:rPr>
-        <w:t xml:space="preserve">a priori</w:t>
-      </w:r>
-      <w:r>
-        <w:t xml:space="preserve"> </w:t>
-      </w:r>
-      <w:r>
-        <w:t xml:space="preserve">by a call budget of 800, with the rural-versus-urban difference in business-day wait time as the primary contrast. The power analysis was pre-specified before data collection and implemented in a purpose-built simulation application. Its assumptions were anchored to empirical data rather than convention: the expected rural wait penalty, the negative binomial dispersion (φ = 1.7), and the state-level intraclass correlation (ICC = 0.08) were estimated by pooling 273 rural otolaryngology observations from two published access series</w:t>
-      </w:r>
-      <w:hyperlink w:anchor="ref-corbisiero2024">
+        <w:t xml:space="preserve">,</w:t>
+      </w:r>
+      <w:hyperlink w:anchor="ref-crisphe2024">
         <w:r>
           <w:rPr>
             <w:rStyle w:val="Hyperlink"/>
@@ -830,6 +823,52 @@
         </w:r>
       </w:hyperlink>
       <w:r>
+        <w:t xml:space="preserve">.</w:t>
+      </w:r>
+    </w:p>
+    <w:bookmarkEnd w:id="25"/>
+    <w:bookmarkStart w:id="26" w:name="sample-size-and-power"/>
+    <w:p>
+      <w:pPr>
+        <w:pStyle w:val="Heading3"/>
+      </w:pPr>
+      <w:r>
+        <w:t xml:space="preserve">Sample size and power</w:t>
+      </w:r>
+    </w:p>
+    <w:p>
+      <w:pPr>
+        <w:pStyle w:val="FirstParagraph"/>
+      </w:pPr>
+      <w:r>
+        <w:t xml:space="preserve">The sample size was fixed</w:t>
+      </w:r>
+      <w:r>
+        <w:t xml:space="preserve"> </w:t>
+      </w:r>
+      <w:r>
+        <w:rPr>
+          <w:i/>
+          <w:iCs/>
+        </w:rPr>
+        <w:t xml:space="preserve">a priori</w:t>
+      </w:r>
+      <w:r>
+        <w:t xml:space="preserve"> </w:t>
+      </w:r>
+      <w:r>
+        <w:t xml:space="preserve">by a call budget of 800, with the rural-versus-urban difference in business-day wait time as the primary contrast. The power analysis was pre-specified before data collection and implemented in a purpose-built simulation application. Its assumptions were anchored to empirical data rather than convention: the expected rural wait penalty, the negative binomial dispersion (φ = 1.7), and the state-level intraclass correlation (ICC = 0.08) were estimated by pooling 273 rural otolaryngology observations from two published access series</w:t>
+      </w:r>
+      <w:hyperlink w:anchor="ref-corbisiero2024">
+        <w:r>
+          <w:rPr>
+            <w:rStyle w:val="Hyperlink"/>
+            <w:vertAlign w:val="superscript"/>
+          </w:rPr>
+          <w:t xml:space="preserve">18</w:t>
+        </w:r>
+      </w:hyperlink>
+      <w:r>
         <w:rPr>
           <w:vertAlign w:val="superscript"/>
         </w:rPr>
@@ -841,7 +880,7 @@
             <w:rStyle w:val="Hyperlink"/>
             <w:vertAlign w:val="superscript"/>
           </w:rPr>
-          <w:t xml:space="preserve">18</w:t>
+          <w:t xml:space="preserve">19</w:t>
         </w:r>
       </w:hyperlink>
       <w:r>
@@ -12947,31 +12986,13 @@
             <w:rStyle w:val="Hyperlink"/>
             <w:vertAlign w:val="superscript"/>
           </w:rPr>
-          <w:t xml:space="preserve">19</w:t>
+          <w:t xml:space="preserve">20</w:t>
         </w:r>
       </w:hyperlink>
       <w:r>
         <w:t xml:space="preserve">. Second, most otolaryngology care is physician-referred, so our patient-initiated calls capture a self-referral ceiling; a complementary arm in which the caller poses as a referring primary-care office would better reflect the true specialist-referral pathway</w:t>
       </w:r>
       <w:hyperlink w:anchor="ref-pollack2016">
-        <w:r>
-          <w:rPr>
-            <w:rStyle w:val="Hyperlink"/>
-            <w:vertAlign w:val="superscript"/>
-          </w:rPr>
-          <w:t xml:space="preserve">19</w:t>
-        </w:r>
-      </w:hyperlink>
-      <w:r>
-        <w:t xml:space="preserve">. Third, our secondary measures hint at an information-quality dimension we did not fully model—whether front-desk statements (that a practice does not see a complaint, or that a physician is unavailable) are accurate—which simulated-patient studies increasingly treat as a distinct outcome,</w:t>
-      </w:r>
-      <w:r>
-        <w:t xml:space="preserve"> </w:t>
-      </w:r>
-      <w:r>
-        <w:t xml:space="preserve">“available ≠ accessible ≠ accurately communicated”</w:t>
-      </w:r>
-      <w:hyperlink w:anchor="ref-wilkinson2018">
         <w:r>
           <w:rPr>
             <w:rStyle w:val="Hyperlink"/>
@@ -12981,6 +13002,24 @@
         </w:r>
       </w:hyperlink>
       <w:r>
+        <w:t xml:space="preserve">. Third, our secondary measures hint at an information-quality dimension we did not fully model—whether front-desk statements (that a practice does not see a complaint, or that a physician is unavailable) are accurate—which simulated-patient studies increasingly treat as a distinct outcome,</w:t>
+      </w:r>
+      <w:r>
+        <w:t xml:space="preserve"> </w:t>
+      </w:r>
+      <w:r>
+        <w:t xml:space="preserve">“available ≠ accessible ≠ accurately communicated”</w:t>
+      </w:r>
+      <w:hyperlink w:anchor="ref-wilkinson2018">
+        <w:r>
+          <w:rPr>
+            <w:rStyle w:val="Hyperlink"/>
+            <w:vertAlign w:val="superscript"/>
+          </w:rPr>
+          <w:t xml:space="preserve">21</w:t>
+        </w:r>
+      </w:hyperlink>
+      <w:r>
         <w:t xml:space="preserve">. Comparing publicly listed directory or website information against phone-obtained access would quantify this gap directly</w:t>
       </w:r>
       <w:hyperlink w:anchor="ref-hodson2025">
@@ -12989,7 +13028,7 @@
             <w:rStyle w:val="Hyperlink"/>
             <w:vertAlign w:val="superscript"/>
           </w:rPr>
-          <w:t xml:space="preserve">6</w:t>
+          <w:t xml:space="preserve">7</w:t>
         </w:r>
       </w:hyperlink>
       <w:r>
@@ -13013,7 +13052,7 @@
             <w:rStyle w:val="Hyperlink"/>
             <w:vertAlign w:val="superscript"/>
           </w:rPr>
-          <w:t xml:space="preserve">5</w:t>
+          <w:t xml:space="preserve">6</w:t>
         </w:r>
       </w:hyperlink>
       <w:r>
@@ -25087,7 +25126,7 @@
     </w:p>
     <w:bookmarkEnd w:id="69"/>
     <w:bookmarkEnd w:id="70"/>
-    <w:bookmarkStart w:id="109" w:name="references"/>
+    <w:bookmarkStart w:id="111" w:name="references"/>
     <w:p>
       <w:pPr>
         <w:pStyle w:val="Heading1"/>
@@ -25096,7 +25135,7 @@
         <w:t xml:space="preserve">References</w:t>
       </w:r>
     </w:p>
-    <w:bookmarkStart w:id="108" w:name="refs"/>
+    <w:bookmarkStart w:id="110" w:name="refs"/>
     <w:bookmarkStart w:id="72" w:name="ref-graboyes2019"/>
     <w:p>
       <w:pPr>
@@ -25266,13 +25305,53 @@
       </w:hyperlink>
     </w:p>
     <w:bookmarkEnd w:id="78"/>
-    <w:bookmarkStart w:id="79" w:name="ref-moriarty2003"/>
+    <w:bookmarkStart w:id="80" w:name="ref-rhodesmiller2012"/>
     <w:p>
       <w:pPr>
         <w:pStyle w:val="Bibliography"/>
       </w:pPr>
       <w:r>
         <w:t xml:space="preserve">5.</w:t>
+      </w:r>
+      <w:r>
+        <w:t xml:space="preserve"> </w:t>
+      </w:r>
+      <w:r>
+        <w:t xml:space="preserve">	</w:t>
+      </w:r>
+      <w:r>
+        <w:t xml:space="preserve">Rhodes KV, Miller FG. Simulated patient studies: An ethical analysis.</w:t>
+      </w:r>
+      <w:r>
+        <w:t xml:space="preserve"> </w:t>
+      </w:r>
+      <w:r>
+        <w:rPr>
+          <w:i/>
+          <w:iCs/>
+        </w:rPr>
+        <w:t xml:space="preserve">The Milbank Quarterly</w:t>
+      </w:r>
+      <w:r>
+        <w:t xml:space="preserve">. 2012;90(4):706-724. doi:</w:t>
+      </w:r>
+      <w:hyperlink r:id="rId79">
+        <w:r>
+          <w:rPr>
+            <w:rStyle w:val="Hyperlink"/>
+          </w:rPr>
+          <w:t xml:space="preserve">10.1111/j.1468-0009.2012.00680.x</w:t>
+        </w:r>
+      </w:hyperlink>
+    </w:p>
+    <w:bookmarkEnd w:id="80"/>
+    <w:bookmarkStart w:id="81" w:name="ref-moriarty2003"/>
+    <w:p>
+      <w:pPr>
+        <w:pStyle w:val="Bibliography"/>
+      </w:pPr>
+      <w:r>
+        <w:t xml:space="preserve">6.</w:t>
       </w:r>
       <w:r>
         <w:t xml:space="preserve"> </w:t>
@@ -25297,14 +25376,14 @@
         <w:t xml:space="preserve">. 2003;53(497):942-946.</w:t>
       </w:r>
     </w:p>
-    <w:bookmarkEnd w:id="79"/>
-    <w:bookmarkStart w:id="81" w:name="ref-hodson2025"/>
+    <w:bookmarkEnd w:id="81"/>
+    <w:bookmarkStart w:id="83" w:name="ref-hodson2025"/>
     <w:p>
       <w:pPr>
         <w:pStyle w:val="Bibliography"/>
       </w:pPr>
       <w:r>
-        <w:t xml:space="preserve">6.</w:t>
+        <w:t xml:space="preserve">7.</w:t>
       </w:r>
       <w:r>
         <w:t xml:space="preserve"> </w:t>
@@ -25340,7 +25419,7 @@
       <w:r>
         <w:t xml:space="preserve">. 2025;15:e100719. doi:</w:t>
       </w:r>
-      <w:hyperlink r:id="rId80">
+      <w:hyperlink r:id="rId82">
         <w:r>
           <w:rPr>
             <w:rStyle w:val="Hyperlink"/>
@@ -25349,14 +25428,14 @@
         </w:r>
       </w:hyperlink>
     </w:p>
-    <w:bookmarkEnd w:id="81"/>
-    <w:bookmarkStart w:id="83" w:name="ref-lungfiel2023"/>
+    <w:bookmarkEnd w:id="83"/>
+    <w:bookmarkStart w:id="85" w:name="ref-lungfiel2023"/>
     <w:p>
       <w:pPr>
         <w:pStyle w:val="Bibliography"/>
       </w:pPr>
       <w:r>
-        <w:t xml:space="preserve">7.</w:t>
+        <w:t xml:space="preserve">8.</w:t>
       </w:r>
       <w:r>
         <w:t xml:space="preserve"> </w:t>
@@ -25398,7 +25477,7 @@
       <w:r>
         <w:t xml:space="preserve">. 2023;16(1):68. doi:</w:t>
       </w:r>
-      <w:hyperlink r:id="rId82">
+      <w:hyperlink r:id="rId84">
         <w:r>
           <w:rPr>
             <w:rStyle w:val="Hyperlink"/>
@@ -25407,14 +25486,14 @@
         </w:r>
       </w:hyperlink>
     </w:p>
-    <w:bookmarkEnd w:id="83"/>
-    <w:bookmarkStart w:id="85" w:name="ref-campbell2013"/>
+    <w:bookmarkEnd w:id="85"/>
+    <w:bookmarkStart w:id="87" w:name="ref-campbell2013"/>
     <w:p>
       <w:pPr>
         <w:pStyle w:val="Bibliography"/>
       </w:pPr>
       <w:r>
-        <w:t xml:space="preserve">8.</w:t>
+        <w:t xml:space="preserve">9.</w:t>
       </w:r>
       <w:r>
         <w:t xml:space="preserve"> </w:t>
@@ -25438,7 +25517,7 @@
       <w:r>
         <w:t xml:space="preserve">. 2013;63(608):e171-e176. doi:</w:t>
       </w:r>
-      <w:hyperlink r:id="rId84">
+      <w:hyperlink r:id="rId86">
         <w:r>
           <w:rPr>
             <w:rStyle w:val="Hyperlink"/>
@@ -25447,14 +25526,14 @@
         </w:r>
       </w:hyperlink>
     </w:p>
-    <w:bookmarkEnd w:id="85"/>
-    <w:bookmarkStart w:id="86" w:name="ref-kfffee"/>
+    <w:bookmarkEnd w:id="87"/>
+    <w:bookmarkStart w:id="88" w:name="ref-kfffee"/>
     <w:p>
       <w:pPr>
         <w:pStyle w:val="Bibliography"/>
       </w:pPr>
       <w:r>
-        <w:t xml:space="preserve">9.</w:t>
+        <w:t xml:space="preserve">10.</w:t>
       </w:r>
       <w:r>
         <w:t xml:space="preserve"> </w:t>
@@ -25466,14 +25545,14 @@
         <w:t xml:space="preserve">Kaiser Family Foundation. Medicaid-to-medicare fee index. Published online 2024.</w:t>
       </w:r>
     </w:p>
-    <w:bookmarkEnd w:id="86"/>
-    <w:bookmarkStart w:id="87" w:name="ref-cdcsvi"/>
+    <w:bookmarkEnd w:id="88"/>
+    <w:bookmarkStart w:id="89" w:name="ref-cdcsvi"/>
     <w:p>
       <w:pPr>
         <w:pStyle w:val="Bibliography"/>
       </w:pPr>
       <w:r>
-        <w:t xml:space="preserve">10.</w:t>
+        <w:t xml:space="preserve">11.</w:t>
       </w:r>
       <w:r>
         <w:t xml:space="preserve"> </w:t>
@@ -25497,14 +25576,14 @@
         <w:t xml:space="preserve">social vulnerability index (2022 database). Published online 2022.</w:t>
       </w:r>
     </w:p>
-    <w:bookmarkEnd w:id="87"/>
-    <w:bookmarkStart w:id="89" w:name="ref-emmeans"/>
+    <w:bookmarkEnd w:id="89"/>
+    <w:bookmarkStart w:id="91" w:name="ref-emmeans"/>
     <w:p>
       <w:pPr>
         <w:pStyle w:val="Bibliography"/>
       </w:pPr>
       <w:r>
-        <w:t xml:space="preserve">11.</w:t>
+        <w:t xml:space="preserve">12.</w:t>
       </w:r>
       <w:r>
         <w:t xml:space="preserve"> </w:t>
@@ -25531,7 +25610,7 @@
       <w:r>
         <w:t xml:space="preserve"> </w:t>
       </w:r>
-      <w:hyperlink r:id="rId88">
+      <w:hyperlink r:id="rId90">
         <w:r>
           <w:rPr>
             <w:rStyle w:val="Hyperlink"/>
@@ -25540,14 +25619,14 @@
         </w:r>
       </w:hyperlink>
     </w:p>
-    <w:bookmarkEnd w:id="89"/>
-    <w:bookmarkStart w:id="91" w:name="ref-rcoreteam"/>
+    <w:bookmarkEnd w:id="91"/>
+    <w:bookmarkStart w:id="93" w:name="ref-rcoreteam"/>
     <w:p>
       <w:pPr>
         <w:pStyle w:val="Bibliography"/>
       </w:pPr>
       <w:r>
-        <w:t xml:space="preserve">12.</w:t>
+        <w:t xml:space="preserve">13.</w:t>
       </w:r>
       <w:r>
         <w:t xml:space="preserve"> </w:t>
@@ -25574,7 +25653,7 @@
       <w:r>
         <w:t xml:space="preserve"> </w:t>
       </w:r>
-      <w:hyperlink r:id="rId90">
+      <w:hyperlink r:id="rId92">
         <w:r>
           <w:rPr>
             <w:rStyle w:val="Hyperlink"/>
@@ -25583,14 +25662,14 @@
         </w:r>
       </w:hyperlink>
     </w:p>
-    <w:bookmarkEnd w:id="91"/>
-    <w:bookmarkStart w:id="93" w:name="ref-glmmTMB"/>
+    <w:bookmarkEnd w:id="93"/>
+    <w:bookmarkStart w:id="95" w:name="ref-glmmTMB"/>
     <w:p>
       <w:pPr>
         <w:pStyle w:val="Bibliography"/>
       </w:pPr>
       <w:r>
-        <w:t xml:space="preserve">13.</w:t>
+        <w:t xml:space="preserve">14.</w:t>
       </w:r>
       <w:r>
         <w:t xml:space="preserve"> </w:t>
@@ -25626,7 +25705,7 @@
       <w:r>
         <w:t xml:space="preserve">. 2017;9(2):378-400. doi:</w:t>
       </w:r>
-      <w:hyperlink r:id="rId92">
+      <w:hyperlink r:id="rId94">
         <w:r>
           <w:rPr>
             <w:rStyle w:val="Hyperlink"/>
@@ -25635,14 +25714,14 @@
         </w:r>
       </w:hyperlink>
     </w:p>
-    <w:bookmarkEnd w:id="93"/>
-    <w:bookmarkStart w:id="95" w:name="ref-strobe"/>
+    <w:bookmarkEnd w:id="95"/>
+    <w:bookmarkStart w:id="97" w:name="ref-strobe"/>
     <w:p>
       <w:pPr>
         <w:pStyle w:val="Bibliography"/>
       </w:pPr>
       <w:r>
-        <w:t xml:space="preserve">14.</w:t>
+        <w:t xml:space="preserve">15.</w:t>
       </w:r>
       <w:r>
         <w:t xml:space="preserve"> </w:t>
@@ -25726,7 +25805,7 @@
       <w:r>
         <w:t xml:space="preserve">. 2007;147(8):573-577. doi:</w:t>
       </w:r>
-      <w:hyperlink r:id="rId94">
+      <w:hyperlink r:id="rId96">
         <w:r>
           <w:rPr>
             <w:rStyle w:val="Hyperlink"/>
@@ -25735,14 +25814,14 @@
         </w:r>
       </w:hyperlink>
     </w:p>
-    <w:bookmarkEnd w:id="95"/>
-    <w:bookmarkStart w:id="97" w:name="ref-crisp2021"/>
+    <w:bookmarkEnd w:id="97"/>
+    <w:bookmarkStart w:id="99" w:name="ref-crisp2021"/>
     <w:p>
       <w:pPr>
         <w:pStyle w:val="Bibliography"/>
       </w:pPr>
       <w:r>
-        <w:t xml:space="preserve">15.</w:t>
+        <w:t xml:space="preserve">16.</w:t>
       </w:r>
       <w:r>
         <w:t xml:space="preserve"> </w:t>
@@ -25772,7 +25851,7 @@
       <w:r>
         <w:t xml:space="preserve">. 2021;29(3):218-227. doi:</w:t>
       </w:r>
-      <w:hyperlink r:id="rId96">
+      <w:hyperlink r:id="rId98">
         <w:r>
           <w:rPr>
             <w:rStyle w:val="Hyperlink"/>
@@ -25781,14 +25860,14 @@
         </w:r>
       </w:hyperlink>
     </w:p>
-    <w:bookmarkEnd w:id="97"/>
-    <w:bookmarkStart w:id="99" w:name="ref-crisphe2024"/>
+    <w:bookmarkEnd w:id="99"/>
+    <w:bookmarkStart w:id="101" w:name="ref-crisphe2024"/>
     <w:p>
       <w:pPr>
         <w:pStyle w:val="Bibliography"/>
       </w:pPr>
       <w:r>
-        <w:t xml:space="preserve">16.</w:t>
+        <w:t xml:space="preserve">17.</w:t>
       </w:r>
       <w:r>
         <w:t xml:space="preserve"> </w:t>
@@ -25836,7 +25915,7 @@
       <w:r>
         <w:t xml:space="preserve">. 2024;32(4):322-328. doi:</w:t>
       </w:r>
-      <w:hyperlink r:id="rId98">
+      <w:hyperlink r:id="rId100">
         <w:r>
           <w:rPr>
             <w:rStyle w:val="Hyperlink"/>
@@ -25845,14 +25924,14 @@
         </w:r>
       </w:hyperlink>
     </w:p>
-    <w:bookmarkEnd w:id="99"/>
-    <w:bookmarkStart w:id="101" w:name="ref-corbisiero2024"/>
+    <w:bookmarkEnd w:id="101"/>
+    <w:bookmarkStart w:id="103" w:name="ref-corbisiero2024"/>
     <w:p>
       <w:pPr>
         <w:pStyle w:val="Bibliography"/>
       </w:pPr>
       <w:r>
-        <w:t xml:space="preserve">17.</w:t>
+        <w:t xml:space="preserve">18.</w:t>
       </w:r>
       <w:r>
         <w:t xml:space="preserve"> </w:t>
@@ -25885,7 +25964,7 @@
       <w:r>
         <w:t xml:space="preserve">. 2024;171(1):98-108. doi:</w:t>
       </w:r>
-      <w:hyperlink r:id="rId100">
+      <w:hyperlink r:id="rId102">
         <w:r>
           <w:rPr>
             <w:rStyle w:val="Hyperlink"/>
@@ -25894,14 +25973,14 @@
         </w:r>
       </w:hyperlink>
     </w:p>
-    <w:bookmarkEnd w:id="101"/>
-    <w:bookmarkStart w:id="103" w:name="ref-saeedi2025"/>
+    <w:bookmarkEnd w:id="103"/>
+    <w:bookmarkStart w:id="105" w:name="ref-saeedi2025"/>
     <w:p>
       <w:pPr>
         <w:pStyle w:val="Bibliography"/>
       </w:pPr>
       <w:r>
-        <w:t xml:space="preserve">18.</w:t>
+        <w:t xml:space="preserve">19.</w:t>
       </w:r>
       <w:r>
         <w:t xml:space="preserve"> </w:t>
@@ -25934,7 +26013,7 @@
       <w:r>
         <w:t xml:space="preserve">. 2025;17(9):e91744. doi:</w:t>
       </w:r>
-      <w:hyperlink r:id="rId102">
+      <w:hyperlink r:id="rId104">
         <w:r>
           <w:rPr>
             <w:rStyle w:val="Hyperlink"/>
@@ -25943,14 +26022,14 @@
         </w:r>
       </w:hyperlink>
     </w:p>
-    <w:bookmarkEnd w:id="103"/>
-    <w:bookmarkStart w:id="105" w:name="ref-pollack2016"/>
+    <w:bookmarkEnd w:id="105"/>
+    <w:bookmarkStart w:id="107" w:name="ref-pollack2016"/>
     <w:p>
       <w:pPr>
         <w:pStyle w:val="Bibliography"/>
       </w:pPr>
       <w:r>
-        <w:t xml:space="preserve">19.</w:t>
+        <w:t xml:space="preserve">20.</w:t>
       </w:r>
       <w:r>
         <w:t xml:space="preserve"> </w:t>
@@ -25983,7 +26062,7 @@
       <w:r>
         <w:t xml:space="preserve">. 2016;11(10):e0164411. doi:</w:t>
       </w:r>
-      <w:hyperlink r:id="rId104">
+      <w:hyperlink r:id="rId106">
         <w:r>
           <w:rPr>
             <w:rStyle w:val="Hyperlink"/>
@@ -25992,14 +26071,14 @@
         </w:r>
       </w:hyperlink>
     </w:p>
-    <w:bookmarkEnd w:id="105"/>
-    <w:bookmarkStart w:id="107" w:name="ref-wilkinson2018"/>
+    <w:bookmarkEnd w:id="107"/>
+    <w:bookmarkStart w:id="109" w:name="ref-wilkinson2018"/>
     <w:p>
       <w:pPr>
         <w:pStyle w:val="Bibliography"/>
       </w:pPr>
       <w:r>
-        <w:t xml:space="preserve">20.</w:t>
+        <w:t xml:space="preserve">21.</w:t>
       </w:r>
       <w:r>
         <w:t xml:space="preserve"> </w:t>
@@ -26023,7 +26102,7 @@
       <w:r>
         <w:t xml:space="preserve">. 2018;63(1):32-36. doi:</w:t>
       </w:r>
-      <w:hyperlink r:id="rId106">
+      <w:hyperlink r:id="rId108">
         <w:r>
           <w:rPr>
             <w:rStyle w:val="Hyperlink"/>
@@ -26032,9 +26111,9 @@
         </w:r>
       </w:hyperlink>
     </w:p>
-    <w:bookmarkEnd w:id="107"/>
-    <w:bookmarkEnd w:id="108"/>
     <w:bookmarkEnd w:id="109"/>
+    <w:bookmarkEnd w:id="110"/>
+    <w:bookmarkEnd w:id="111"/>
     <w:sectPr>
       <w:footnotePr>
         <w:numRestart w:val="eachSect"/>

</xml_diff>

<commit_message>
Add NEJM (Rhodes 2011) and AMA Journal of Ethics (Blinkhorn 2013) to ethics section
Completes the ethics citation set on the 2011 HHS mystery-shopper controversy:
- Rhodes KV. Taking the Mystery Out of 'Mystery Shopper' Studies. N Engl J Med.
  2011;365(6):484-486. doi:10.1056/NEJMp1107779
- Blinkhorn L. Secret Shoppers and Conflicts of Interest. AMA J Ethics (Virtual
  Mentor). 2013;15(2):119-124. doi:10.1001/virtualmentor.2013.15.2.bndr1-1302
Both cited on the controversy sentence alongside the Rhodes & Miller (Milbank 2012)
ethical analysis.

Co-Authored-By: Claude Opus 4.8 (1M context) <noreply@anthropic.com>
</commit_message>
<xml_diff>
--- a/manuscript_output/manuscript_mystery_caller.docx
+++ b/manuscript_output/manuscript_mystery_caller.docx
@@ -441,7 +441,34 @@
         <w:t xml:space="preserve"> </w:t>
       </w:r>
       <w:r>
-        <w:t xml:space="preserve">survey of primary-care access was shelved amid concern about deceiving physician practices—but a formal ethical analysis has since established that simulated-patient research without prior consent is justified when risks and burdens are minimal, a consent waiver is necessary for scientifically valid data, and the study carries substantial social value</w:t>
+        <w:t xml:space="preserve">survey of primary-care access was shelved amid concern about deceiving physician practices</w:t>
+      </w:r>
+      <w:hyperlink w:anchor="ref-rhodes2011">
+        <w:r>
+          <w:rPr>
+            <w:rStyle w:val="Hyperlink"/>
+            <w:vertAlign w:val="superscript"/>
+          </w:rPr>
+          <w:t xml:space="preserve">5</w:t>
+        </w:r>
+      </w:hyperlink>
+      <w:r>
+        <w:rPr>
+          <w:vertAlign w:val="superscript"/>
+        </w:rPr>
+        <w:t xml:space="preserve">,</w:t>
+      </w:r>
+      <w:hyperlink w:anchor="ref-blinkhorn2013">
+        <w:r>
+          <w:rPr>
+            <w:rStyle w:val="Hyperlink"/>
+            <w:vertAlign w:val="superscript"/>
+          </w:rPr>
+          <w:t xml:space="preserve">6</w:t>
+        </w:r>
+      </w:hyperlink>
+      <w:r>
+        <w:t xml:space="preserve">—but a formal ethical analysis has since established that simulated-patient research without prior consent is justified when risks and burdens are minimal, a consent waiver is necessary for scientifically valid data, and the study carries substantial social value</w:t>
       </w:r>
       <w:hyperlink w:anchor="ref-rhodesmiller2012">
         <w:r>
@@ -449,7 +476,7 @@
             <w:rStyle w:val="Hyperlink"/>
             <w:vertAlign w:val="superscript"/>
           </w:rPr>
-          <w:t xml:space="preserve">5</w:t>
+          <w:t xml:space="preserve">7</w:t>
         </w:r>
       </w:hyperlink>
       <w:r>
@@ -476,7 +503,7 @@
             <w:rStyle w:val="Hyperlink"/>
             <w:vertAlign w:val="superscript"/>
           </w:rPr>
-          <w:t xml:space="preserve">6</w:t>
+          <w:t xml:space="preserve">8</w:t>
         </w:r>
       </w:hyperlink>
       <w:r>
@@ -486,111 +513,6 @@
         <w:t xml:space="preserve">,</w:t>
       </w:r>
       <w:hyperlink w:anchor="ref-hodson2025">
-        <w:r>
-          <w:rPr>
-            <w:rStyle w:val="Hyperlink"/>
-            <w:vertAlign w:val="superscript"/>
-          </w:rPr>
-          <w:t xml:space="preserve">7</w:t>
-        </w:r>
-      </w:hyperlink>
-      <w:r>
-        <w:t xml:space="preserve">. Aggregate, market-level findings will be made available through specialty-society and state channels as a benefit to participating communities, in the spirit of the participant-feedback provisions used in prior covert simulated-patient studies</w:t>
-      </w:r>
-      <w:hyperlink w:anchor="ref-lungfiel2023">
-        <w:r>
-          <w:rPr>
-            <w:rStyle w:val="Hyperlink"/>
-            <w:vertAlign w:val="superscript"/>
-          </w:rPr>
-          <w:t xml:space="preserve">8</w:t>
-        </w:r>
-      </w:hyperlink>
-      <w:r>
-        <w:t xml:space="preserve">.</w:t>
-      </w:r>
-    </w:p>
-    <w:p>
-      <w:pPr>
-        <w:pStyle w:val="BodyText"/>
-      </w:pPr>
-      <w:r>
-        <w:t xml:space="preserve">Analyses were restricted to calls with a completed data-collection record and a determinable physician subspecialty. This study did not manipulate patient insurance; the exposures of interest were the requested subspecialty and the geographic context of the practice.</w:t>
-      </w:r>
-    </w:p>
-    <w:bookmarkEnd w:id="22"/>
-    <w:bookmarkStart w:id="23" w:name="outcomes"/>
-    <w:p>
-      <w:pPr>
-        <w:pStyle w:val="Heading3"/>
-      </w:pPr>
-      <w:r>
-        <w:t xml:space="preserve">Outcomes</w:t>
-      </w:r>
-    </w:p>
-    <w:p>
-      <w:pPr>
-        <w:pStyle w:val="FirstParagraph"/>
-      </w:pPr>
-      <w:r>
-        <w:t xml:space="preserve">Two outcomes were analyzed as a two-part (hurdle) process. The first,</w:t>
-      </w:r>
-      <w:r>
-        <w:t xml:space="preserve"> </w:t>
-      </w:r>
-      <w:r>
-        <w:rPr>
-          <w:i/>
-          <w:iCs/>
-        </w:rPr>
-        <w:t xml:space="preserve">access</w:t>
-      </w:r>
-      <w:r>
-        <w:t xml:space="preserve">, was whether the office offered a new-patient appointment with the sampled physician (binary). The second,</w:t>
-      </w:r>
-      <w:r>
-        <w:t xml:space="preserve"> </w:t>
-      </w:r>
-      <w:r>
-        <w:rPr>
-          <w:i/>
-          <w:iCs/>
-        </w:rPr>
-        <w:t xml:space="preserve">timeliness</w:t>
-      </w:r>
-      <w:r>
-        <w:t xml:space="preserve">, was the number of</w:t>
-      </w:r>
-      <w:r>
-        <w:t xml:space="preserve"> </w:t>
-      </w:r>
-      <w:r>
-        <w:rPr>
-          <w:b/>
-          <w:bCs/>
-        </w:rPr>
-        <w:t xml:space="preserve">business days</w:t>
-      </w:r>
-      <w:r>
-        <w:t xml:space="preserve"> </w:t>
-      </w:r>
-      <w:r>
-        <w:t xml:space="preserve">from the call to the next available appointment, counted excluding weekends and U.S. federal holidays, and defined only for calls in which an appointment was offered. We recorded the</w:t>
-      </w:r>
-      <w:r>
-        <w:t xml:space="preserve"> </w:t>
-      </w:r>
-      <w:r>
-        <w:rPr>
-          <w:i/>
-          <w:iCs/>
-        </w:rPr>
-        <w:t xml:space="preserve">first</w:t>
-      </w:r>
-      <w:r>
-        <w:t xml:space="preserve">-available appointment; prior simulated-patient work has shown that the more elaborate third-next-available metric adds little beyond first-available while reducing reliability</w:t>
-      </w:r>
-      <w:hyperlink w:anchor="ref-campbell2013">
         <w:r>
           <w:rPr>
             <w:rStyle w:val="Hyperlink"/>
@@ -600,27 +522,9 @@
         </w:r>
       </w:hyperlink>
       <w:r>
-        <w:t xml:space="preserve">.</w:t>
-      </w:r>
-    </w:p>
-    <w:bookmarkEnd w:id="23"/>
-    <w:bookmarkStart w:id="24" w:name="geographic-covariates"/>
-    <w:p>
-      <w:pPr>
-        <w:pStyle w:val="Heading3"/>
-      </w:pPr>
-      <w:r>
-        <w:t xml:space="preserve">Geographic covariates</w:t>
-      </w:r>
-    </w:p>
-    <w:p>
-      <w:pPr>
-        <w:pStyle w:val="FirstParagraph"/>
-      </w:pPr>
-      <w:r>
-        <w:t xml:space="preserve">Each practice was linked to contextual covariates by practice ZIP code and state. County was assigned from a 2020 Census ZCTA-to-county crosswalk (dominant county by land area). Covariates comprised: county otolaryngologist supply per 100,000 population; the state Medicaid-to-Medicare fee index (Kaiser Family Foundation, 2024, all services)</w:t>
-      </w:r>
-      <w:hyperlink w:anchor="ref-kfffee">
+        <w:t xml:space="preserve">. Aggregate, market-level findings will be made available through specialty-society and state channels as a benefit to participating communities, in the spirit of the participant-feedback provisions used in prior covert simulated-patient studies</w:t>
+      </w:r>
+      <w:hyperlink w:anchor="ref-lungfiel2023">
         <w:r>
           <w:rPr>
             <w:rStyle w:val="Hyperlink"/>
@@ -630,9 +534,90 @@
         </w:r>
       </w:hyperlink>
       <w:r>
-        <w:t xml:space="preserve">; the CDC/ATSDR Social Vulnerability Index (SVI, 2022, tract-level, population-weighted to the practice ZIP)</w:t>
-      </w:r>
-      <w:hyperlink w:anchor="ref-cdcsvi">
+        <w:t xml:space="preserve">.</w:t>
+      </w:r>
+    </w:p>
+    <w:p>
+      <w:pPr>
+        <w:pStyle w:val="BodyText"/>
+      </w:pPr>
+      <w:r>
+        <w:t xml:space="preserve">Analyses were restricted to calls with a completed data-collection record and a determinable physician subspecialty. This study did not manipulate patient insurance; the exposures of interest were the requested subspecialty and the geographic context of the practice.</w:t>
+      </w:r>
+    </w:p>
+    <w:bookmarkEnd w:id="22"/>
+    <w:bookmarkStart w:id="23" w:name="outcomes"/>
+    <w:p>
+      <w:pPr>
+        <w:pStyle w:val="Heading3"/>
+      </w:pPr>
+      <w:r>
+        <w:t xml:space="preserve">Outcomes</w:t>
+      </w:r>
+    </w:p>
+    <w:p>
+      <w:pPr>
+        <w:pStyle w:val="FirstParagraph"/>
+      </w:pPr>
+      <w:r>
+        <w:t xml:space="preserve">Two outcomes were analyzed as a two-part (hurdle) process. The first,</w:t>
+      </w:r>
+      <w:r>
+        <w:t xml:space="preserve"> </w:t>
+      </w:r>
+      <w:r>
+        <w:rPr>
+          <w:i/>
+          <w:iCs/>
+        </w:rPr>
+        <w:t xml:space="preserve">access</w:t>
+      </w:r>
+      <w:r>
+        <w:t xml:space="preserve">, was whether the office offered a new-patient appointment with the sampled physician (binary). The second,</w:t>
+      </w:r>
+      <w:r>
+        <w:t xml:space="preserve"> </w:t>
+      </w:r>
+      <w:r>
+        <w:rPr>
+          <w:i/>
+          <w:iCs/>
+        </w:rPr>
+        <w:t xml:space="preserve">timeliness</w:t>
+      </w:r>
+      <w:r>
+        <w:t xml:space="preserve">, was the number of</w:t>
+      </w:r>
+      <w:r>
+        <w:t xml:space="preserve"> </w:t>
+      </w:r>
+      <w:r>
+        <w:rPr>
+          <w:b/>
+          <w:bCs/>
+        </w:rPr>
+        <w:t xml:space="preserve">business days</w:t>
+      </w:r>
+      <w:r>
+        <w:t xml:space="preserve"> </w:t>
+      </w:r>
+      <w:r>
+        <w:t xml:space="preserve">from the call to the next available appointment, counted excluding weekends and U.S. federal holidays, and defined only for calls in which an appointment was offered. We recorded the</w:t>
+      </w:r>
+      <w:r>
+        <w:t xml:space="preserve"> </w:t>
+      </w:r>
+      <w:r>
+        <w:rPr>
+          <w:i/>
+          <w:iCs/>
+        </w:rPr>
+        <w:t xml:space="preserve">first</w:t>
+      </w:r>
+      <w:r>
+        <w:t xml:space="preserve">-available appointment; prior simulated-patient work has shown that the more elaborate third-next-available metric adds little beyond first-available while reducing reliability</w:t>
+      </w:r>
+      <w:hyperlink w:anchor="ref-campbell2013">
         <w:r>
           <w:rPr>
             <w:rStyle w:val="Hyperlink"/>
@@ -642,17 +627,17 @@
         </w:r>
       </w:hyperlink>
       <w:r>
-        <w:t xml:space="preserve">; the county fraction of Medicare beneficiaries dual-eligible for Medicaid (CMS); metropolitan hospital-market concentration (Herfindahl–Hirschman Index [HHI], KFF 2024; available for metropolitan areas only); rurality, dichotomized from Rural–Urban Commuting Area (RUCA) codes as urban (RUCA 1–3) versus rural (RUCA 4–10); and the American Academy of Otolaryngology–Head and Neck Surgery (AAO-HNS) Board of Governors region.</w:t>
+        <w:t xml:space="preserve">.</w:t>
       </w:r>
     </w:p>
-    <w:bookmarkEnd w:id="24"/>
-    <w:bookmarkStart w:id="25" w:name="statistical-analysis"/>
+    <w:bookmarkEnd w:id="23"/>
+    <w:bookmarkStart w:id="24" w:name="geographic-covariates"/>
     <w:p>
       <w:pPr>
         <w:pStyle w:val="Heading3"/>
       </w:pPr>
       <w:r>
-        <w:t xml:space="preserve">Statistical analysis</w:t>
+        <w:t xml:space="preserve">Geographic covariates</w:t>
       </w:r>
     </w:p>
     <w:p>
@@ -660,49 +645,9 @@
         <w:pStyle w:val="FirstParagraph"/>
       </w:pPr>
       <w:r>
-        <w:t xml:space="preserve">Because business-day wait time is observed only when an appointment is offered, we modeled access and timeliness separately to avoid conditioning wait-time estimates on the offer.</w:t>
-      </w:r>
-      <w:r>
-        <w:t xml:space="preserve"> </w:t>
-      </w:r>
-      <w:r>
-        <w:rPr>
-          <w:i/>
-          <w:iCs/>
-        </w:rPr>
-        <w:t xml:space="preserve">Access</w:t>
-      </w:r>
-      <w:r>
-        <w:t xml:space="preserve"> </w:t>
-      </w:r>
-      <w:r>
-        <w:t xml:space="preserve">was modeled with a mixed-effects logistic regression over all analytic calls;</w:t>
-      </w:r>
-      <w:r>
-        <w:t xml:space="preserve"> </w:t>
-      </w:r>
-      <w:r>
-        <w:rPr>
-          <w:i/>
-          <w:iCs/>
-        </w:rPr>
-        <w:t xml:space="preserve">timeliness</w:t>
-      </w:r>
-      <w:r>
-        <w:t xml:space="preserve"> </w:t>
-      </w:r>
-      <w:r>
-        <w:t xml:space="preserve">with a mixed-effects negative binomial regression over the offered subset. The negative binomial distribution was selected over Poisson on the basis of substantial overdispersion (Pearson φ = 6.22). Both models included a random intercept for core-based statistical area (CBSA; county FIPS where CBSA was undefined) to account for within-market correlation, and adjusted for the requested subspecialty (reference: general otolaryngology), county ENT supply, Medicaid fee index, SVI, dual-eligible fraction, and rurality (reference: urban). The identity of the caller (research assistant) was included as a fixed nuisance term to adjust for operator-level differences in call handling. Continuous covariates were standardized and, for the few missing values (&lt;3%), median-imputed.</w:t>
-      </w:r>
-    </w:p>
-    <w:p>
-      <w:pPr>
-        <w:pStyle w:val="BodyText"/>
-      </w:pPr>
-      <w:r>
-        <w:t xml:space="preserve">Effects are reported as odds ratios (access) and incidence rate ratios (timeliness) with 95% Wald confidence intervals. Pairwise differences between subspecialties were estimated with Tukey-adjusted estimated marginal means</w:t>
-      </w:r>
-      <w:hyperlink w:anchor="ref-emmeans">
+        <w:t xml:space="preserve">Each practice was linked to contextual covariates by practice ZIP code and state. County was assigned from a 2020 Census ZCTA-to-county crosswalk (dominant county by land area). Covariates comprised: county otolaryngologist supply per 100,000 population; the state Medicaid-to-Medicare fee index (Kaiser Family Foundation, 2024, all services)</w:t>
+      </w:r>
+      <w:hyperlink w:anchor="ref-kfffee">
         <w:r>
           <w:rPr>
             <w:rStyle w:val="Hyperlink"/>
@@ -712,9 +657,9 @@
         </w:r>
       </w:hyperlink>
       <w:r>
-        <w:t xml:space="preserve">. Effect modification of the geographic covariates by subspecialty was tested by likelihood-ratio tests. Market-level clustering was summarized by the intraclass correlation coefficient (ICC). Because the HHI is defined only in metropolitan areas, its association with timeliness was assessed in a sensitivity model restricted to the metropolitan subset. Two additional sensitivity analyses were performed: a three-level rurality specification (urban, RUCA 1–3; suburban, 4–6; rural, 7–10) in place of the binary contrast, and a complete-case refit that excluded records with any missing covariate rather than median-imputing them. Whether call incompleteness was related to the measured covariates was assessed with chi-square and Wilcoxon rank-sum tests. Analyses used R 4.4.2</w:t>
-      </w:r>
-      <w:hyperlink w:anchor="ref-rcoreteam">
+        <w:t xml:space="preserve">; the CDC/ATSDR Social Vulnerability Index (SVI, 2022, tract-level, population-weighted to the practice ZIP)</w:t>
+      </w:r>
+      <w:hyperlink w:anchor="ref-cdcsvi">
         <w:r>
           <w:rPr>
             <w:rStyle w:val="Hyperlink"/>
@@ -724,21 +669,67 @@
         </w:r>
       </w:hyperlink>
       <w:r>
+        <w:t xml:space="preserve">; the county fraction of Medicare beneficiaries dual-eligible for Medicaid (CMS); metropolitan hospital-market concentration (Herfindahl–Hirschman Index [HHI], KFF 2024; available for metropolitan areas only); rurality, dichotomized from Rural–Urban Commuting Area (RUCA) codes as urban (RUCA 1–3) versus rural (RUCA 4–10); and the American Academy of Otolaryngology–Head and Neck Surgery (AAO-HNS) Board of Governors region.</w:t>
+      </w:r>
+    </w:p>
+    <w:bookmarkEnd w:id="24"/>
+    <w:bookmarkStart w:id="25" w:name="statistical-analysis"/>
+    <w:p>
+      <w:pPr>
+        <w:pStyle w:val="Heading3"/>
+      </w:pPr>
+      <w:r>
+        <w:t xml:space="preserve">Statistical analysis</w:t>
+      </w:r>
+    </w:p>
+    <w:p>
+      <w:pPr>
+        <w:pStyle w:val="FirstParagraph"/>
+      </w:pPr>
+      <w:r>
+        <w:t xml:space="preserve">Because business-day wait time is observed only when an appointment is offered, we modeled access and timeliness separately to avoid conditioning wait-time estimates on the offer.</w:t>
+      </w:r>
+      <w:r>
         <w:t xml:space="preserve"> </w:t>
       </w:r>
       <w:r>
-        <w:t xml:space="preserve">(packages</w:t>
+        <w:rPr>
+          <w:i/>
+          <w:iCs/>
+        </w:rPr>
+        <w:t xml:space="preserve">Access</w:t>
       </w:r>
       <w:r>
         <w:t xml:space="preserve"> </w:t>
       </w:r>
       <w:r>
+        <w:t xml:space="preserve">was modeled with a mixed-effects logistic regression over all analytic calls;</w:t>
+      </w:r>
+      <w:r>
+        <w:t xml:space="preserve"> </w:t>
+      </w:r>
+      <w:r>
         <w:rPr>
-          <w:rStyle w:val="VerbatimChar"/>
+          <w:i/>
+          <w:iCs/>
         </w:rPr>
-        <w:t xml:space="preserve">glmmTMB</w:t>
-      </w:r>
-      <w:hyperlink w:anchor="ref-glmmTMB">
+        <w:t xml:space="preserve">timeliness</w:t>
+      </w:r>
+      <w:r>
+        <w:t xml:space="preserve"> </w:t>
+      </w:r>
+      <w:r>
+        <w:t xml:space="preserve">with a mixed-effects negative binomial regression over the offered subset. The negative binomial distribution was selected over Poisson on the basis of substantial overdispersion (Pearson φ = 6.22). Both models included a random intercept for core-based statistical area (CBSA; county FIPS where CBSA was undefined) to account for within-market correlation, and adjusted for the requested subspecialty (reference: general otolaryngology), county ENT supply, Medicaid fee index, SVI, dual-eligible fraction, and rurality (reference: urban). The identity of the caller (research assistant) was included as a fixed nuisance term to adjust for operator-level differences in call handling. Continuous covariates were standardized and, for the few missing values (&lt;3%), median-imputed.</w:t>
+      </w:r>
+    </w:p>
+    <w:p>
+      <w:pPr>
+        <w:pStyle w:val="BodyText"/>
+      </w:pPr>
+      <w:r>
+        <w:t xml:space="preserve">Effects are reported as odds ratios (access) and incidence rate ratios (timeliness) with 95% Wald confidence intervals. Pairwise differences between subspecialties were estimated with Tukey-adjusted estimated marginal means</w:t>
+      </w:r>
+      <w:hyperlink w:anchor="ref-emmeans">
         <w:r>
           <w:rPr>
             <w:rStyle w:val="Hyperlink"/>
@@ -748,42 +739,9 @@
         </w:r>
       </w:hyperlink>
       <w:r>
-        <w:t xml:space="preserve">,</w:t>
-      </w:r>
-      <w:r>
-        <w:t xml:space="preserve"> </w:t>
-      </w:r>
-      <w:r>
-        <w:rPr>
-          <w:rStyle w:val="VerbatimChar"/>
-        </w:rPr>
-        <w:t xml:space="preserve">emmeans</w:t>
-      </w:r>
-      <w:hyperlink w:anchor="ref-emmeans">
-        <w:r>
-          <w:rPr>
-            <w:rStyle w:val="Hyperlink"/>
-            <w:vertAlign w:val="superscript"/>
-          </w:rPr>
-          <w:t xml:space="preserve">12</w:t>
-        </w:r>
-      </w:hyperlink>
-      <w:r>
-        <w:t xml:space="preserve">, and the study package</w:t>
-      </w:r>
-      <w:r>
-        <w:t xml:space="preserve"> </w:t>
-      </w:r>
-      <w:r>
-        <w:rPr>
-          <w:rStyle w:val="VerbatimChar"/>
-        </w:rPr>
-        <w:t xml:space="preserve">mysterycall</w:t>
-      </w:r>
-      <w:r>
-        <w:t xml:space="preserve">); two-sided α = 0.05. Reporting follows the STROBE guideline for observational studies</w:t>
-      </w:r>
-      <w:hyperlink w:anchor="ref-strobe">
+        <w:t xml:space="preserve">. Effect modification of the geographic covariates by subspecialty was tested by likelihood-ratio tests. Market-level clustering was summarized by the intraclass correlation coefficient (ICC). Because the HHI is defined only in metropolitan areas, its association with timeliness was assessed in a sensitivity model restricted to the metropolitan subset. Two additional sensitivity analyses were performed: a three-level rurality specification (urban, RUCA 1–3; suburban, 4–6; rural, 7–10) in place of the binary contrast, and a complete-case refit that excluded records with any missing covariate rather than median-imputing them. Whether call incompleteness was related to the measured covariates was assessed with chi-square and Wilcoxon rank-sum tests. Analyses used R 4.4.2</w:t>
+      </w:r>
+      <w:hyperlink w:anchor="ref-rcoreteam">
         <w:r>
           <w:rPr>
             <w:rStyle w:val="Hyperlink"/>
@@ -796,9 +754,18 @@
         <w:t xml:space="preserve"> </w:t>
       </w:r>
       <w:r>
-        <w:t xml:space="preserve">and the simulated-patient–specific CRiSP/CRiSPHe reporting checklist</w:t>
-      </w:r>
-      <w:hyperlink w:anchor="ref-crisp2021">
+        <w:t xml:space="preserve">(packages</w:t>
+      </w:r>
+      <w:r>
+        <w:t xml:space="preserve"> </w:t>
+      </w:r>
+      <w:r>
+        <w:rPr>
+          <w:rStyle w:val="VerbatimChar"/>
+        </w:rPr>
+        <w:t xml:space="preserve">glmmTMB</w:t>
+      </w:r>
+      <w:hyperlink w:anchor="ref-glmmTMB">
         <w:r>
           <w:rPr>
             <w:rStyle w:val="Hyperlink"/>
@@ -808,12 +775,42 @@
         </w:r>
       </w:hyperlink>
       <w:r>
+        <w:t xml:space="preserve">,</w:t>
+      </w:r>
+      <w:r>
+        <w:t xml:space="preserve"> </w:t>
+      </w:r>
+      <w:r>
         <w:rPr>
-          <w:vertAlign w:val="superscript"/>
+          <w:rStyle w:val="VerbatimChar"/>
         </w:rPr>
-        <w:t xml:space="preserve">,</w:t>
-      </w:r>
-      <w:hyperlink w:anchor="ref-crisphe2024">
+        <w:t xml:space="preserve">emmeans</w:t>
+      </w:r>
+      <w:hyperlink w:anchor="ref-emmeans">
+        <w:r>
+          <w:rPr>
+            <w:rStyle w:val="Hyperlink"/>
+            <w:vertAlign w:val="superscript"/>
+          </w:rPr>
+          <w:t xml:space="preserve">14</w:t>
+        </w:r>
+      </w:hyperlink>
+      <w:r>
+        <w:t xml:space="preserve">, and the study package</w:t>
+      </w:r>
+      <w:r>
+        <w:t xml:space="preserve"> </w:t>
+      </w:r>
+      <w:r>
+        <w:rPr>
+          <w:rStyle w:val="VerbatimChar"/>
+        </w:rPr>
+        <w:t xml:space="preserve">mysterycall</w:t>
+      </w:r>
+      <w:r>
+        <w:t xml:space="preserve">); two-sided α = 0.05. Reporting follows the STROBE guideline for observational studies</w:t>
+      </w:r>
+      <w:hyperlink w:anchor="ref-strobe">
         <w:r>
           <w:rPr>
             <w:rStyle w:val="Hyperlink"/>
@@ -823,43 +820,12 @@
         </w:r>
       </w:hyperlink>
       <w:r>
-        <w:t xml:space="preserve">.</w:t>
-      </w:r>
-    </w:p>
-    <w:bookmarkEnd w:id="25"/>
-    <w:bookmarkStart w:id="26" w:name="sample-size-and-power"/>
-    <w:p>
-      <w:pPr>
-        <w:pStyle w:val="Heading3"/>
-      </w:pPr>
-      <w:r>
-        <w:t xml:space="preserve">Sample size and power</w:t>
-      </w:r>
-    </w:p>
-    <w:p>
-      <w:pPr>
-        <w:pStyle w:val="FirstParagraph"/>
-      </w:pPr>
-      <w:r>
-        <w:t xml:space="preserve">The sample size was fixed</w:t>
-      </w:r>
-      <w:r>
         <w:t xml:space="preserve"> </w:t>
       </w:r>
       <w:r>
-        <w:rPr>
-          <w:i/>
-          <w:iCs/>
-        </w:rPr>
-        <w:t xml:space="preserve">a priori</w:t>
-      </w:r>
-      <w:r>
-        <w:t xml:space="preserve"> </w:t>
-      </w:r>
-      <w:r>
-        <w:t xml:space="preserve">by a call budget of 800, with the rural-versus-urban difference in business-day wait time as the primary contrast. The power analysis was pre-specified before data collection and implemented in a purpose-built simulation application. Its assumptions were anchored to empirical data rather than convention: the expected rural wait penalty, the negative binomial dispersion (φ = 1.7), and the state-level intraclass correlation (ICC = 0.08) were estimated by pooling 273 rural otolaryngology observations from two published access series</w:t>
-      </w:r>
-      <w:hyperlink w:anchor="ref-corbisiero2024">
+        <w:t xml:space="preserve">and the simulated-patient–specific CRiSP/CRiSPHe reporting checklist</w:t>
+      </w:r>
+      <w:hyperlink w:anchor="ref-crisp2021">
         <w:r>
           <w:rPr>
             <w:rStyle w:val="Hyperlink"/>
@@ -874,13 +840,74 @@
         </w:rPr>
         <w:t xml:space="preserve">,</w:t>
       </w:r>
+      <w:hyperlink w:anchor="ref-crisphe2024">
+        <w:r>
+          <w:rPr>
+            <w:rStyle w:val="Hyperlink"/>
+            <w:vertAlign w:val="superscript"/>
+          </w:rPr>
+          <w:t xml:space="preserve">19</w:t>
+        </w:r>
+      </w:hyperlink>
+      <w:r>
+        <w:t xml:space="preserve">.</w:t>
+      </w:r>
+    </w:p>
+    <w:bookmarkEnd w:id="25"/>
+    <w:bookmarkStart w:id="26" w:name="sample-size-and-power"/>
+    <w:p>
+      <w:pPr>
+        <w:pStyle w:val="Heading3"/>
+      </w:pPr>
+      <w:r>
+        <w:t xml:space="preserve">Sample size and power</w:t>
+      </w:r>
+    </w:p>
+    <w:p>
+      <w:pPr>
+        <w:pStyle w:val="FirstParagraph"/>
+      </w:pPr>
+      <w:r>
+        <w:t xml:space="preserve">The sample size was fixed</w:t>
+      </w:r>
+      <w:r>
+        <w:t xml:space="preserve"> </w:t>
+      </w:r>
+      <w:r>
+        <w:rPr>
+          <w:i/>
+          <w:iCs/>
+        </w:rPr>
+        <w:t xml:space="preserve">a priori</w:t>
+      </w:r>
+      <w:r>
+        <w:t xml:space="preserve"> </w:t>
+      </w:r>
+      <w:r>
+        <w:t xml:space="preserve">by a call budget of 800, with the rural-versus-urban difference in business-day wait time as the primary contrast. The power analysis was pre-specified before data collection and implemented in a purpose-built simulation application. Its assumptions were anchored to empirical data rather than convention: the expected rural wait penalty, the negative binomial dispersion (φ = 1.7), and the state-level intraclass correlation (ICC = 0.08) were estimated by pooling 273 rural otolaryngology observations from two published access series</w:t>
+      </w:r>
+      <w:hyperlink w:anchor="ref-corbisiero2024">
+        <w:r>
+          <w:rPr>
+            <w:rStyle w:val="Hyperlink"/>
+            <w:vertAlign w:val="superscript"/>
+          </w:rPr>
+          <w:t xml:space="preserve">20</w:t>
+        </w:r>
+      </w:hyperlink>
+      <w:r>
+        <w:rPr>
+          <w:vertAlign w:val="superscript"/>
+        </w:rPr>
+        <w:t xml:space="preserve">,</w:t>
+      </w:r>
       <w:hyperlink w:anchor="ref-saeedi2025">
         <w:r>
           <w:rPr>
             <w:rStyle w:val="Hyperlink"/>
             <w:vertAlign w:val="superscript"/>
           </w:rPr>
-          <w:t xml:space="preserve">19</w:t>
+          <w:t xml:space="preserve">21</w:t>
         </w:r>
       </w:hyperlink>
       <w:r>
@@ -12986,7 +13013,7 @@
             <w:rStyle w:val="Hyperlink"/>
             <w:vertAlign w:val="superscript"/>
           </w:rPr>
-          <w:t xml:space="preserve">20</w:t>
+          <w:t xml:space="preserve">22</w:t>
         </w:r>
       </w:hyperlink>
       <w:r>
@@ -12998,7 +13025,7 @@
             <w:rStyle w:val="Hyperlink"/>
             <w:vertAlign w:val="superscript"/>
           </w:rPr>
-          <w:t xml:space="preserve">20</w:t>
+          <w:t xml:space="preserve">22</w:t>
         </w:r>
       </w:hyperlink>
       <w:r>
@@ -13016,7 +13043,7 @@
             <w:rStyle w:val="Hyperlink"/>
             <w:vertAlign w:val="superscript"/>
           </w:rPr>
-          <w:t xml:space="preserve">21</w:t>
+          <w:t xml:space="preserve">23</w:t>
         </w:r>
       </w:hyperlink>
       <w:r>
@@ -13028,7 +13055,7 @@
             <w:rStyle w:val="Hyperlink"/>
             <w:vertAlign w:val="superscript"/>
           </w:rPr>
-          <w:t xml:space="preserve">7</w:t>
+          <w:t xml:space="preserve">9</w:t>
         </w:r>
       </w:hyperlink>
       <w:r>
@@ -13052,7 +13079,7 @@
             <w:rStyle w:val="Hyperlink"/>
             <w:vertAlign w:val="superscript"/>
           </w:rPr>
-          <w:t xml:space="preserve">6</w:t>
+          <w:t xml:space="preserve">8</w:t>
         </w:r>
       </w:hyperlink>
       <w:r>
@@ -25126,7 +25153,7 @@
     </w:p>
     <w:bookmarkEnd w:id="69"/>
     <w:bookmarkEnd w:id="70"/>
-    <w:bookmarkStart w:id="111" w:name="references"/>
+    <w:bookmarkStart w:id="115" w:name="references"/>
     <w:p>
       <w:pPr>
         <w:pStyle w:val="Heading1"/>
@@ -25135,7 +25162,7 @@
         <w:t xml:space="preserve">References</w:t>
       </w:r>
     </w:p>
-    <w:bookmarkStart w:id="110" w:name="refs"/>
+    <w:bookmarkStart w:id="114" w:name="refs"/>
     <w:bookmarkStart w:id="72" w:name="ref-graboyes2019"/>
     <w:p>
       <w:pPr>
@@ -25305,13 +25332,105 @@
       </w:hyperlink>
     </w:p>
     <w:bookmarkEnd w:id="78"/>
-    <w:bookmarkStart w:id="80" w:name="ref-rhodesmiller2012"/>
+    <w:bookmarkStart w:id="80" w:name="ref-rhodes2011"/>
     <w:p>
       <w:pPr>
         <w:pStyle w:val="Bibliography"/>
       </w:pPr>
       <w:r>
         <w:t xml:space="preserve">5.</w:t>
+      </w:r>
+      <w:r>
+        <w:t xml:space="preserve"> </w:t>
+      </w:r>
+      <w:r>
+        <w:t xml:space="preserve">	</w:t>
+      </w:r>
+      <w:r>
+        <w:t xml:space="preserve">Rhodes KV. Taking the mystery out of</w:t>
+      </w:r>
+      <w:r>
+        <w:t xml:space="preserve"> </w:t>
+      </w:r>
+      <w:r>
+        <w:t xml:space="preserve">“mystery shopper”</w:t>
+      </w:r>
+      <w:r>
+        <w:t xml:space="preserve"> </w:t>
+      </w:r>
+      <w:r>
+        <w:t xml:space="preserve">studies.</w:t>
+      </w:r>
+      <w:r>
+        <w:t xml:space="preserve"> </w:t>
+      </w:r>
+      <w:r>
+        <w:rPr>
+          <w:i/>
+          <w:iCs/>
+        </w:rPr>
+        <w:t xml:space="preserve">New England Journal of Medicine</w:t>
+      </w:r>
+      <w:r>
+        <w:t xml:space="preserve">. 2011;365(6):484-486. doi:</w:t>
+      </w:r>
+      <w:hyperlink r:id="rId79">
+        <w:r>
+          <w:rPr>
+            <w:rStyle w:val="Hyperlink"/>
+          </w:rPr>
+          <w:t xml:space="preserve">10.1056/NEJMp1107779</w:t>
+        </w:r>
+      </w:hyperlink>
+    </w:p>
+    <w:bookmarkEnd w:id="80"/>
+    <w:bookmarkStart w:id="82" w:name="ref-blinkhorn2013"/>
+    <w:p>
+      <w:pPr>
+        <w:pStyle w:val="Bibliography"/>
+      </w:pPr>
+      <w:r>
+        <w:t xml:space="preserve">6.</w:t>
+      </w:r>
+      <w:r>
+        <w:t xml:space="preserve"> </w:t>
+      </w:r>
+      <w:r>
+        <w:t xml:space="preserve">	</w:t>
+      </w:r>
+      <w:r>
+        <w:t xml:space="preserve">Blinkhorn L. Secret shoppers and conflicts of interest.</w:t>
+      </w:r>
+      <w:r>
+        <w:t xml:space="preserve"> </w:t>
+      </w:r>
+      <w:r>
+        <w:rPr>
+          <w:i/>
+          <w:iCs/>
+        </w:rPr>
+        <w:t xml:space="preserve">AMA Journal of Ethics (Virtual Mentor)</w:t>
+      </w:r>
+      <w:r>
+        <w:t xml:space="preserve">. 2013;15(2):119-124. doi:</w:t>
+      </w:r>
+      <w:hyperlink r:id="rId81">
+        <w:r>
+          <w:rPr>
+            <w:rStyle w:val="Hyperlink"/>
+          </w:rPr>
+          <w:t xml:space="preserve">10.1001/virtualmentor.2013.15.2.bndr1-1302</w:t>
+        </w:r>
+      </w:hyperlink>
+    </w:p>
+    <w:bookmarkEnd w:id="82"/>
+    <w:bookmarkStart w:id="84" w:name="ref-rhodesmiller2012"/>
+    <w:p>
+      <w:pPr>
+        <w:pStyle w:val="Bibliography"/>
+      </w:pPr>
+      <w:r>
+        <w:t xml:space="preserve">7.</w:t>
       </w:r>
       <w:r>
         <w:t xml:space="preserve"> </w:t>
@@ -25335,7 +25454,7 @@
       <w:r>
         <w:t xml:space="preserve">. 2012;90(4):706-724. doi:</w:t>
       </w:r>
-      <w:hyperlink r:id="rId79">
+      <w:hyperlink r:id="rId83">
         <w:r>
           <w:rPr>
             <w:rStyle w:val="Hyperlink"/>
@@ -25344,14 +25463,14 @@
         </w:r>
       </w:hyperlink>
     </w:p>
-    <w:bookmarkEnd w:id="80"/>
-    <w:bookmarkStart w:id="81" w:name="ref-moriarty2003"/>
+    <w:bookmarkEnd w:id="84"/>
+    <w:bookmarkStart w:id="85" w:name="ref-moriarty2003"/>
     <w:p>
       <w:pPr>
         <w:pStyle w:val="Bibliography"/>
       </w:pPr>
       <w:r>
-        <w:t xml:space="preserve">6.</w:t>
+        <w:t xml:space="preserve">8.</w:t>
       </w:r>
       <w:r>
         <w:t xml:space="preserve"> </w:t>
@@ -25376,14 +25495,14 @@
         <w:t xml:space="preserve">. 2003;53(497):942-946.</w:t>
       </w:r>
     </w:p>
-    <w:bookmarkEnd w:id="81"/>
-    <w:bookmarkStart w:id="83" w:name="ref-hodson2025"/>
+    <w:bookmarkEnd w:id="85"/>
+    <w:bookmarkStart w:id="87" w:name="ref-hodson2025"/>
     <w:p>
       <w:pPr>
         <w:pStyle w:val="Bibliography"/>
       </w:pPr>
       <w:r>
-        <w:t xml:space="preserve">7.</w:t>
+        <w:t xml:space="preserve">9.</w:t>
       </w:r>
       <w:r>
         <w:t xml:space="preserve"> </w:t>
@@ -25419,7 +25538,7 @@
       <w:r>
         <w:t xml:space="preserve">. 2025;15:e100719. doi:</w:t>
       </w:r>
-      <w:hyperlink r:id="rId82">
+      <w:hyperlink r:id="rId86">
         <w:r>
           <w:rPr>
             <w:rStyle w:val="Hyperlink"/>
@@ -25428,14 +25547,14 @@
         </w:r>
       </w:hyperlink>
     </w:p>
-    <w:bookmarkEnd w:id="83"/>
-    <w:bookmarkStart w:id="85" w:name="ref-lungfiel2023"/>
+    <w:bookmarkEnd w:id="87"/>
+    <w:bookmarkStart w:id="89" w:name="ref-lungfiel2023"/>
     <w:p>
       <w:pPr>
         <w:pStyle w:val="Bibliography"/>
       </w:pPr>
       <w:r>
-        <w:t xml:space="preserve">8.</w:t>
+        <w:t xml:space="preserve">10.</w:t>
       </w:r>
       <w:r>
         <w:t xml:space="preserve"> </w:t>
@@ -25477,7 +25596,7 @@
       <w:r>
         <w:t xml:space="preserve">. 2023;16(1):68. doi:</w:t>
       </w:r>
-      <w:hyperlink r:id="rId84">
+      <w:hyperlink r:id="rId88">
         <w:r>
           <w:rPr>
             <w:rStyle w:val="Hyperlink"/>
@@ -25486,14 +25605,14 @@
         </w:r>
       </w:hyperlink>
     </w:p>
-    <w:bookmarkEnd w:id="85"/>
-    <w:bookmarkStart w:id="87" w:name="ref-campbell2013"/>
+    <w:bookmarkEnd w:id="89"/>
+    <w:bookmarkStart w:id="91" w:name="ref-campbell2013"/>
     <w:p>
       <w:pPr>
         <w:pStyle w:val="Bibliography"/>
       </w:pPr>
       <w:r>
-        <w:t xml:space="preserve">9.</w:t>
+        <w:t xml:space="preserve">11.</w:t>
       </w:r>
       <w:r>
         <w:t xml:space="preserve"> </w:t>
@@ -25517,7 +25636,7 @@
       <w:r>
         <w:t xml:space="preserve">. 2013;63(608):e171-e176. doi:</w:t>
       </w:r>
-      <w:hyperlink r:id="rId86">
+      <w:hyperlink r:id="rId90">
         <w:r>
           <w:rPr>
             <w:rStyle w:val="Hyperlink"/>
@@ -25526,14 +25645,14 @@
         </w:r>
       </w:hyperlink>
     </w:p>
-    <w:bookmarkEnd w:id="87"/>
-    <w:bookmarkStart w:id="88" w:name="ref-kfffee"/>
+    <w:bookmarkEnd w:id="91"/>
+    <w:bookmarkStart w:id="92" w:name="ref-kfffee"/>
     <w:p>
       <w:pPr>
         <w:pStyle w:val="Bibliography"/>
       </w:pPr>
       <w:r>
-        <w:t xml:space="preserve">10.</w:t>
+        <w:t xml:space="preserve">12.</w:t>
       </w:r>
       <w:r>
         <w:t xml:space="preserve"> </w:t>
@@ -25545,14 +25664,14 @@
         <w:t xml:space="preserve">Kaiser Family Foundation. Medicaid-to-medicare fee index. Published online 2024.</w:t>
       </w:r>
     </w:p>
-    <w:bookmarkEnd w:id="88"/>
-    <w:bookmarkStart w:id="89" w:name="ref-cdcsvi"/>
+    <w:bookmarkEnd w:id="92"/>
+    <w:bookmarkStart w:id="93" w:name="ref-cdcsvi"/>
     <w:p>
       <w:pPr>
         <w:pStyle w:val="Bibliography"/>
       </w:pPr>
       <w:r>
-        <w:t xml:space="preserve">11.</w:t>
+        <w:t xml:space="preserve">13.</w:t>
       </w:r>
       <w:r>
         <w:t xml:space="preserve"> </w:t>
@@ -25576,14 +25695,14 @@
         <w:t xml:space="preserve">social vulnerability index (2022 database). Published online 2022.</w:t>
       </w:r>
     </w:p>
-    <w:bookmarkEnd w:id="89"/>
-    <w:bookmarkStart w:id="91" w:name="ref-emmeans"/>
+    <w:bookmarkEnd w:id="93"/>
+    <w:bookmarkStart w:id="95" w:name="ref-emmeans"/>
     <w:p>
       <w:pPr>
         <w:pStyle w:val="Bibliography"/>
       </w:pPr>
       <w:r>
-        <w:t xml:space="preserve">12.</w:t>
+        <w:t xml:space="preserve">14.</w:t>
       </w:r>
       <w:r>
         <w:t xml:space="preserve"> </w:t>
@@ -25610,7 +25729,7 @@
       <w:r>
         <w:t xml:space="preserve"> </w:t>
       </w:r>
-      <w:hyperlink r:id="rId90">
+      <w:hyperlink r:id="rId94">
         <w:r>
           <w:rPr>
             <w:rStyle w:val="Hyperlink"/>
@@ -25619,14 +25738,14 @@
         </w:r>
       </w:hyperlink>
     </w:p>
-    <w:bookmarkEnd w:id="91"/>
-    <w:bookmarkStart w:id="93" w:name="ref-rcoreteam"/>
+    <w:bookmarkEnd w:id="95"/>
+    <w:bookmarkStart w:id="97" w:name="ref-rcoreteam"/>
     <w:p>
       <w:pPr>
         <w:pStyle w:val="Bibliography"/>
       </w:pPr>
       <w:r>
-        <w:t xml:space="preserve">13.</w:t>
+        <w:t xml:space="preserve">15.</w:t>
       </w:r>
       <w:r>
         <w:t xml:space="preserve"> </w:t>
@@ -25653,7 +25772,7 @@
       <w:r>
         <w:t xml:space="preserve"> </w:t>
       </w:r>
-      <w:hyperlink r:id="rId92">
+      <w:hyperlink r:id="rId96">
         <w:r>
           <w:rPr>
             <w:rStyle w:val="Hyperlink"/>
@@ -25662,14 +25781,14 @@
         </w:r>
       </w:hyperlink>
     </w:p>
-    <w:bookmarkEnd w:id="93"/>
-    <w:bookmarkStart w:id="95" w:name="ref-glmmTMB"/>
+    <w:bookmarkEnd w:id="97"/>
+    <w:bookmarkStart w:id="99" w:name="ref-glmmTMB"/>
     <w:p>
       <w:pPr>
         <w:pStyle w:val="Bibliography"/>
       </w:pPr>
       <w:r>
-        <w:t xml:space="preserve">14.</w:t>
+        <w:t xml:space="preserve">16.</w:t>
       </w:r>
       <w:r>
         <w:t xml:space="preserve"> </w:t>
@@ -25705,7 +25824,7 @@
       <w:r>
         <w:t xml:space="preserve">. 2017;9(2):378-400. doi:</w:t>
       </w:r>
-      <w:hyperlink r:id="rId94">
+      <w:hyperlink r:id="rId98">
         <w:r>
           <w:rPr>
             <w:rStyle w:val="Hyperlink"/>
@@ -25714,14 +25833,14 @@
         </w:r>
       </w:hyperlink>
     </w:p>
-    <w:bookmarkEnd w:id="95"/>
-    <w:bookmarkStart w:id="97" w:name="ref-strobe"/>
+    <w:bookmarkEnd w:id="99"/>
+    <w:bookmarkStart w:id="101" w:name="ref-strobe"/>
     <w:p>
       <w:pPr>
         <w:pStyle w:val="Bibliography"/>
       </w:pPr>
       <w:r>
-        <w:t xml:space="preserve">15.</w:t>
+        <w:t xml:space="preserve">17.</w:t>
       </w:r>
       <w:r>
         <w:t xml:space="preserve"> </w:t>
@@ -25805,7 +25924,7 @@
       <w:r>
         <w:t xml:space="preserve">. 2007;147(8):573-577. doi:</w:t>
       </w:r>
-      <w:hyperlink r:id="rId96">
+      <w:hyperlink r:id="rId100">
         <w:r>
           <w:rPr>
             <w:rStyle w:val="Hyperlink"/>
@@ -25814,14 +25933,14 @@
         </w:r>
       </w:hyperlink>
     </w:p>
-    <w:bookmarkEnd w:id="97"/>
-    <w:bookmarkStart w:id="99" w:name="ref-crisp2021"/>
+    <w:bookmarkEnd w:id="101"/>
+    <w:bookmarkStart w:id="103" w:name="ref-crisp2021"/>
     <w:p>
       <w:pPr>
         <w:pStyle w:val="Bibliography"/>
       </w:pPr>
       <w:r>
-        <w:t xml:space="preserve">16.</w:t>
+        <w:t xml:space="preserve">18.</w:t>
       </w:r>
       <w:r>
         <w:t xml:space="preserve"> </w:t>
@@ -25851,7 +25970,7 @@
       <w:r>
         <w:t xml:space="preserve">. 2021;29(3):218-227. doi:</w:t>
       </w:r>
-      <w:hyperlink r:id="rId98">
+      <w:hyperlink r:id="rId102">
         <w:r>
           <w:rPr>
             <w:rStyle w:val="Hyperlink"/>
@@ -25860,14 +25979,14 @@
         </w:r>
       </w:hyperlink>
     </w:p>
-    <w:bookmarkEnd w:id="99"/>
-    <w:bookmarkStart w:id="101" w:name="ref-crisphe2024"/>
+    <w:bookmarkEnd w:id="103"/>
+    <w:bookmarkStart w:id="105" w:name="ref-crisphe2024"/>
     <w:p>
       <w:pPr>
         <w:pStyle w:val="Bibliography"/>
       </w:pPr>
       <w:r>
-        <w:t xml:space="preserve">17.</w:t>
+        <w:t xml:space="preserve">19.</w:t>
       </w:r>
       <w:r>
         <w:t xml:space="preserve"> </w:t>
@@ -25915,7 +26034,7 @@
       <w:r>
         <w:t xml:space="preserve">. 2024;32(4):322-328. doi:</w:t>
       </w:r>
-      <w:hyperlink r:id="rId100">
+      <w:hyperlink r:id="rId104">
         <w:r>
           <w:rPr>
             <w:rStyle w:val="Hyperlink"/>
@@ -25924,14 +26043,14 @@
         </w:r>
       </w:hyperlink>
     </w:p>
-    <w:bookmarkEnd w:id="101"/>
-    <w:bookmarkStart w:id="103" w:name="ref-corbisiero2024"/>
+    <w:bookmarkEnd w:id="105"/>
+    <w:bookmarkStart w:id="107" w:name="ref-corbisiero2024"/>
     <w:p>
       <w:pPr>
         <w:pStyle w:val="Bibliography"/>
       </w:pPr>
       <w:r>
-        <w:t xml:space="preserve">18.</w:t>
+        <w:t xml:space="preserve">20.</w:t>
       </w:r>
       <w:r>
         <w:t xml:space="preserve"> </w:t>
@@ -25964,7 +26083,7 @@
       <w:r>
         <w:t xml:space="preserve">. 2024;171(1):98-108. doi:</w:t>
       </w:r>
-      <w:hyperlink r:id="rId102">
+      <w:hyperlink r:id="rId106">
         <w:r>
           <w:rPr>
             <w:rStyle w:val="Hyperlink"/>
@@ -25973,14 +26092,14 @@
         </w:r>
       </w:hyperlink>
     </w:p>
-    <w:bookmarkEnd w:id="103"/>
-    <w:bookmarkStart w:id="105" w:name="ref-saeedi2025"/>
+    <w:bookmarkEnd w:id="107"/>
+    <w:bookmarkStart w:id="109" w:name="ref-saeedi2025"/>
     <w:p>
       <w:pPr>
         <w:pStyle w:val="Bibliography"/>
       </w:pPr>
       <w:r>
-        <w:t xml:space="preserve">19.</w:t>
+        <w:t xml:space="preserve">21.</w:t>
       </w:r>
       <w:r>
         <w:t xml:space="preserve"> </w:t>
@@ -26013,7 +26132,7 @@
       <w:r>
         <w:t xml:space="preserve">. 2025;17(9):e91744. doi:</w:t>
       </w:r>
-      <w:hyperlink r:id="rId104">
+      <w:hyperlink r:id="rId108">
         <w:r>
           <w:rPr>
             <w:rStyle w:val="Hyperlink"/>
@@ -26022,14 +26141,14 @@
         </w:r>
       </w:hyperlink>
     </w:p>
-    <w:bookmarkEnd w:id="105"/>
-    <w:bookmarkStart w:id="107" w:name="ref-pollack2016"/>
+    <w:bookmarkEnd w:id="109"/>
+    <w:bookmarkStart w:id="111" w:name="ref-pollack2016"/>
     <w:p>
       <w:pPr>
         <w:pStyle w:val="Bibliography"/>
       </w:pPr>
       <w:r>
-        <w:t xml:space="preserve">20.</w:t>
+        <w:t xml:space="preserve">22.</w:t>
       </w:r>
       <w:r>
         <w:t xml:space="preserve"> </w:t>
@@ -26062,7 +26181,7 @@
       <w:r>
         <w:t xml:space="preserve">. 2016;11(10):e0164411. doi:</w:t>
       </w:r>
-      <w:hyperlink r:id="rId106">
+      <w:hyperlink r:id="rId110">
         <w:r>
           <w:rPr>
             <w:rStyle w:val="Hyperlink"/>
@@ -26071,14 +26190,14 @@
         </w:r>
       </w:hyperlink>
     </w:p>
-    <w:bookmarkEnd w:id="107"/>
-    <w:bookmarkStart w:id="109" w:name="ref-wilkinson2018"/>
+    <w:bookmarkEnd w:id="111"/>
+    <w:bookmarkStart w:id="113" w:name="ref-wilkinson2018"/>
     <w:p>
       <w:pPr>
         <w:pStyle w:val="Bibliography"/>
       </w:pPr>
       <w:r>
-        <w:t xml:space="preserve">21.</w:t>
+        <w:t xml:space="preserve">23.</w:t>
       </w:r>
       <w:r>
         <w:t xml:space="preserve"> </w:t>
@@ -26102,7 +26221,7 @@
       <w:r>
         <w:t xml:space="preserve">. 2018;63(1):32-36. doi:</w:t>
       </w:r>
-      <w:hyperlink r:id="rId108">
+      <w:hyperlink r:id="rId112">
         <w:r>
           <w:rPr>
             <w:rStyle w:val="Hyperlink"/>
@@ -26111,9 +26230,9 @@
         </w:r>
       </w:hyperlink>
     </w:p>
-    <w:bookmarkEnd w:id="109"/>
-    <w:bookmarkEnd w:id="110"/>
-    <w:bookmarkEnd w:id="111"/>
+    <w:bookmarkEnd w:id="113"/>
+    <w:bookmarkEnd w:id="114"/>
+    <w:bookmarkEnd w:id="115"/>
     <w:sectPr>
       <w:footnotePr>
         <w:numRestart w:val="eachSect"/>

</xml_diff>

<commit_message>
Fill in author byline, corresponding author, and disclosures
Per author guidance: Grace E. Falk first author; research-assistant callers as
middle authors (full names/degrees still to confirm); Cristina Cabrera-Muffly, MD
and Tyler M. Muffly, MD as senior authors; Cabrera-Muffly corresponding. Added
affiliations (Falk: ODU/EVMS; Cabrera-Muffly: CU Otolaryngology; Muffly: Denver
Health + CU OB/GYN), mapped CRediT roles to the named authors, and finalized the
Funding ('no specific grant...') and Conflicts ('no competing interests')
statements. Remaining brackets are only the RA co-authors' full names/degrees/
affiliations and the corresponding-author contact line.

Co-Authored-By: Claude Opus 4.8 (1M context) <noreply@anthropic.com>
</commit_message>
<xml_diff>
--- a/manuscript_output/manuscript_mystery_caller.docx
+++ b/manuscript_output/manuscript_mystery_caller.docx
@@ -15,7 +15,7 @@
         <w:pStyle w:val="Author"/>
       </w:pPr>
       <w:r>
-        <w:t xml:space="preserve">[Author list]</w:t>
+        <w:t xml:space="preserve">Grace E. Falk; [RA co-authors — full names &amp; degrees to confirm: Chin, Deol, Gregg, Kim, Roesch, Walsh]; Cristina Cabrera-Muffly, MD; Tyler M. Muffly, MD</w:t>
       </w:r>
     </w:p>
     <w:p>
@@ -190,14 +190,54 @@
         <w:t xml:space="preserve"> </w:t>
       </w:r>
       <w:r>
+        <w:t xml:space="preserve">Cristina Cabrera-Muffly, MD; Department of Otolaryngology–Head and Neck Surgery, University of Colorado School of Medicine, Aurora, CO;</w:t>
+      </w:r>
+      <w:r>
+        <w:t xml:space="preserve"> </w:t>
+      </w:r>
+      <w:r>
         <w:rPr>
           <w:i/>
           <w:iCs/>
         </w:rPr>
-        <w:t xml:space="preserve">[Name, degree; institution; address; email; telephone]</w:t>
+        <w:t xml:space="preserve">[address; email; telephone]</w:t>
       </w:r>
       <w:r>
         <w:t xml:space="preserve">.</w:t>
+      </w:r>
+    </w:p>
+    <w:p>
+      <w:pPr>
+        <w:pStyle w:val="BodyText"/>
+      </w:pPr>
+      <w:r>
+        <w:rPr>
+          <w:b/>
+          <w:bCs/>
+        </w:rPr>
+        <w:t xml:space="preserve">Affiliations:</w:t>
+      </w:r>
+      <w:r>
+        <w:t xml:space="preserve"> </w:t>
+      </w:r>
+      <w:r>
+        <w:t xml:space="preserve">Grace E. Falk, Old Dominion University / Eastern Virginia Medical School, Norfolk, VA.</w:t>
+      </w:r>
+      <w:r>
+        <w:t xml:space="preserve"> </w:t>
+      </w:r>
+      <w:r>
+        <w:rPr>
+          <w:i/>
+          <w:iCs/>
+        </w:rPr>
+        <w:t xml:space="preserve">[Research-assistant co-authors — affiliations to confirm.]</w:t>
+      </w:r>
+      <w:r>
+        <w:t xml:space="preserve"> </w:t>
+      </w:r>
+      <w:r>
+        <w:t xml:space="preserve">Cristina Cabrera-Muffly, Department of Otolaryngology–Head and Neck Surgery, University of Colorado School of Medicine, Aurora, CO. Tyler M. Muffly, Denver Health and Hospital Authority, Denver, CO; Department of Obstetrics and Gynecology, University of Colorado School of Medicine, Aurora, CO.</w:t>
       </w:r>
     </w:p>
     <w:p>
@@ -13120,10 +13160,16 @@
       </w:pPr>
       <w:r>
         <w:rPr>
-          <w:i/>
-          <w:iCs/>
+          <w:b/>
+          <w:bCs/>
         </w:rPr>
-        <w:t xml:space="preserve">[CRediT taxonomy — complete for the final author list.]</w:t>
+        <w:t xml:space="preserve">Grace E. Falk:</w:t>
+      </w:r>
+      <w:r>
+        <w:t xml:space="preserve"> </w:t>
+      </w:r>
+      <w:r>
+        <w:t xml:space="preserve">Investigation, Data curation, Project administration, Writing – original draft.</w:t>
       </w:r>
       <w:r>
         <w:t xml:space="preserve"> </w:t>
@@ -13133,13 +13179,13 @@
           <w:b/>
           <w:bCs/>
         </w:rPr>
-        <w:t xml:space="preserve">[Author 1]:</w:t>
+        <w:t xml:space="preserve">[Research-assistant co-authors: Chin, Deol, Gregg, Kim, Roesch, Walsh]:</w:t>
       </w:r>
       <w:r>
         <w:t xml:space="preserve"> </w:t>
       </w:r>
       <w:r>
-        <w:t xml:space="preserve">Conceptualization, Methodology, Formal analysis, Writing – original draft.</w:t>
+        <w:t xml:space="preserve">Investigation (mystery-caller data collection).</w:t>
       </w:r>
       <w:r>
         <w:t xml:space="preserve"> </w:t>
@@ -13149,13 +13195,13 @@
           <w:b/>
           <w:bCs/>
         </w:rPr>
-        <w:t xml:space="preserve">[Author 2]:</w:t>
+        <w:t xml:space="preserve">Cristina Cabrera-Muffly:</w:t>
       </w:r>
       <w:r>
         <w:t xml:space="preserve"> </w:t>
       </w:r>
       <w:r>
-        <w:t xml:space="preserve">Investigation, Data curation, Writing – review &amp; editing.</w:t>
+        <w:t xml:space="preserve">Conceptualization, Supervision, Writing – review &amp; editing.</w:t>
       </w:r>
       <w:r>
         <w:t xml:space="preserve"> </w:t>
@@ -13165,29 +13211,13 @@
           <w:b/>
           <w:bCs/>
         </w:rPr>
-        <w:t xml:space="preserve">[Author 3]:</w:t>
+        <w:t xml:space="preserve">Tyler M. Muffly:</w:t>
       </w:r>
       <w:r>
         <w:t xml:space="preserve"> </w:t>
       </w:r>
       <w:r>
-        <w:t xml:space="preserve">Investigation, Project administration.</w:t>
-      </w:r>
-      <w:r>
-        <w:t xml:space="preserve"> </w:t>
-      </w:r>
-      <w:r>
-        <w:rPr>
-          <w:b/>
-          <w:bCs/>
-        </w:rPr>
-        <w:t xml:space="preserve">[Senior author]:</w:t>
-      </w:r>
-      <w:r>
-        <w:t xml:space="preserve"> </w:t>
-      </w:r>
-      <w:r>
-        <w:t xml:space="preserve">Conceptualization, Supervision, Writing – review &amp; editing. All authors reviewed and approved the final manuscript and accept responsibility for its submission.</w:t>
+        <w:t xml:space="preserve">Conceptualization, Methodology, Formal analysis, Software, Writing – review &amp; editing. All authors reviewed and approved the final manuscript and accept responsibility for its submission.</w:t>
       </w:r>
     </w:p>
     <w:bookmarkEnd w:id="35"/>
@@ -13205,16 +13235,6 @@
         <w:pStyle w:val="FirstParagraph"/>
       </w:pPr>
       <w:r>
-        <w:rPr>
-          <w:i/>
-          <w:iCs/>
-        </w:rPr>
-        <w:t xml:space="preserve">[State the funding source and grant number, or the following if none:]</w:t>
-      </w:r>
-      <w:r>
-        <w:t xml:space="preserve"> </w:t>
-      </w:r>
-      <w:r>
         <w:t xml:space="preserve">This research received no specific grant from any funding agency in the public, commercial, or not-for-profit sectors.</w:t>
       </w:r>
     </w:p>
@@ -13232,16 +13252,6 @@
       <w:pPr>
         <w:pStyle w:val="FirstParagraph"/>
       </w:pPr>
-      <w:r>
-        <w:rPr>
-          <w:i/>
-          <w:iCs/>
-        </w:rPr>
-        <w:t xml:space="preserve">[Declare any competing interests for each author, or the following if none:]</w:t>
-      </w:r>
-      <w:r>
-        <w:t xml:space="preserve"> </w:t>
-      </w:r>
       <w:r>
         <w:t xml:space="preserve">The authors declare no competing interests.</w:t>
       </w:r>

</xml_diff>

<commit_message>
Add Eric J. Dobratz, MD as senior author
Adds the IRB principal investigator (ODU/EVMS #24-12-NH-0285) as senior/last
author: byline, affiliation (Department of Otolaryngology-Head and Neck Surgery,
Eastern Virginia Medical School at Old Dominion University), and CRediT roles
(Conceptualization, Supervision, Resources, Project administration, Writing -
review & editing).

Co-Authored-By: Claude Opus 4.8 (1M context) <noreply@anthropic.com>
</commit_message>
<xml_diff>
--- a/manuscript_output/manuscript_mystery_caller.docx
+++ b/manuscript_output/manuscript_mystery_caller.docx
@@ -15,7 +15,7 @@
         <w:pStyle w:val="Author"/>
       </w:pPr>
       <w:r>
-        <w:t xml:space="preserve">Grace E. Falk; [RA co-authors — full names &amp; degrees to confirm: Chin, Deol, Gregg, Kim, Roesch, Walsh]; Cristina Cabrera-Muffly, MD; Tyler M. Muffly, MD</w:t>
+        <w:t xml:space="preserve">Grace E. Falk; [RA co-authors — full names &amp; degrees to confirm: Chin, Deol, Gregg, Kim, Roesch, Walsh]; Cristina Cabrera-Muffly, MD; Tyler M. Muffly, MD; Eric J. Dobratz, MD</w:t>
       </w:r>
     </w:p>
     <w:p>
@@ -237,7 +237,7 @@
         <w:t xml:space="preserve"> </w:t>
       </w:r>
       <w:r>
-        <w:t xml:space="preserve">Cristina Cabrera-Muffly, Department of Otolaryngology–Head and Neck Surgery, University of Colorado School of Medicine, Aurora, CO. Tyler M. Muffly, Denver Health and Hospital Authority, Denver, CO; Department of Obstetrics and Gynecology, University of Colorado School of Medicine, Aurora, CO.</w:t>
+        <w:t xml:space="preserve">Cristina Cabrera-Muffly, Department of Otolaryngology–Head and Neck Surgery, University of Colorado School of Medicine, Aurora, CO. Tyler M. Muffly, Denver Health and Hospital Authority, Denver, CO; Department of Obstetrics and Gynecology, University of Colorado School of Medicine, Aurora, CO. Eric J. Dobratz, Department of Otolaryngology–Head and Neck Surgery, Eastern Virginia Medical School at Old Dominion University, Norfolk, VA.</w:t>
       </w:r>
     </w:p>
     <w:p>
@@ -13217,7 +13217,23 @@
         <w:t xml:space="preserve"> </w:t>
       </w:r>
       <w:r>
-        <w:t xml:space="preserve">Conceptualization, Methodology, Formal analysis, Software, Writing – review &amp; editing. All authors reviewed and approved the final manuscript and accept responsibility for its submission.</w:t>
+        <w:t xml:space="preserve">Conceptualization, Methodology, Formal analysis, Software, Writing – review &amp; editing.</w:t>
+      </w:r>
+      <w:r>
+        <w:t xml:space="preserve"> </w:t>
+      </w:r>
+      <w:r>
+        <w:rPr>
+          <w:b/>
+          <w:bCs/>
+        </w:rPr>
+        <w:t xml:space="preserve">Eric J. Dobratz:</w:t>
+      </w:r>
+      <w:r>
+        <w:t xml:space="preserve"> </w:t>
+      </w:r>
+      <w:r>
+        <w:t xml:space="preserve">Conceptualization, Supervision, Resources, Project administration, Writing – review &amp; editing. All authors reviewed and approved the final manuscript and accept responsibility for its submission.</w:t>
       </w:r>
     </w:p>
     <w:bookmarkEnd w:id="35"/>

</xml_diff>

<commit_message>
Reorder byline: Dobratz second author, Cabrera-Muffly senior (last) author
New order: Falk (first); Dobratz (second); RA co-authors; Muffly; Cabrera-Muffly
(senior/last, corresponding). Affiliations and CRediT roles reordered to match.

Co-Authored-By: Claude Opus 4.8 (1M context) <noreply@anthropic.com>
</commit_message>
<xml_diff>
--- a/manuscript_output/manuscript_mystery_caller.docx
+++ b/manuscript_output/manuscript_mystery_caller.docx
@@ -15,7 +15,7 @@
         <w:pStyle w:val="Author"/>
       </w:pPr>
       <w:r>
-        <w:t xml:space="preserve">Grace E. Falk; [RA co-authors — full names &amp; degrees to confirm: Chin, Deol, Gregg, Kim, Roesch, Walsh]; Cristina Cabrera-Muffly, MD; Tyler M. Muffly, MD; Eric J. Dobratz, MD</w:t>
+        <w:t xml:space="preserve">Grace E. Falk; Eric J. Dobratz, MD; [RA co-authors — full names &amp; degrees to confirm: Chin, Deol, Gregg, Kim, Roesch, Walsh]; Tyler M. Muffly, MD; Cristina Cabrera-Muffly, MD</w:t>
       </w:r>
     </w:p>
     <w:p>
@@ -221,7 +221,7 @@
         <w:t xml:space="preserve"> </w:t>
       </w:r>
       <w:r>
-        <w:t xml:space="preserve">Grace E. Falk, Old Dominion University / Eastern Virginia Medical School, Norfolk, VA.</w:t>
+        <w:t xml:space="preserve">Grace E. Falk, Old Dominion University / Eastern Virginia Medical School, Norfolk, VA. Eric J. Dobratz, Department of Otolaryngology–Head and Neck Surgery, Eastern Virginia Medical School at Old Dominion University, Norfolk, VA.</w:t>
       </w:r>
       <w:r>
         <w:t xml:space="preserve"> </w:t>
@@ -237,7 +237,7 @@
         <w:t xml:space="preserve"> </w:t>
       </w:r>
       <w:r>
-        <w:t xml:space="preserve">Cristina Cabrera-Muffly, Department of Otolaryngology–Head and Neck Surgery, University of Colorado School of Medicine, Aurora, CO. Tyler M. Muffly, Denver Health and Hospital Authority, Denver, CO; Department of Obstetrics and Gynecology, University of Colorado School of Medicine, Aurora, CO. Eric J. Dobratz, Department of Otolaryngology–Head and Neck Surgery, Eastern Virginia Medical School at Old Dominion University, Norfolk, VA.</w:t>
+        <w:t xml:space="preserve">Tyler M. Muffly, Denver Health and Hospital Authority, Denver, CO; Department of Obstetrics and Gynecology, University of Colorado School of Medicine, Aurora, CO. Cristina Cabrera-Muffly, Department of Otolaryngology–Head and Neck Surgery, University of Colorado School of Medicine, Aurora, CO.</w:t>
       </w:r>
     </w:p>
     <w:p>
@@ -13179,6 +13179,22 @@
           <w:b/>
           <w:bCs/>
         </w:rPr>
+        <w:t xml:space="preserve">Eric J. Dobratz:</w:t>
+      </w:r>
+      <w:r>
+        <w:t xml:space="preserve"> </w:t>
+      </w:r>
+      <w:r>
+        <w:t xml:space="preserve">Conceptualization, Supervision, Resources, Project administration, Writing – review &amp; editing.</w:t>
+      </w:r>
+      <w:r>
+        <w:t xml:space="preserve"> </w:t>
+      </w:r>
+      <w:r>
+        <w:rPr>
+          <w:b/>
+          <w:bCs/>
+        </w:rPr>
         <w:t xml:space="preserve">[Research-assistant co-authors: Chin, Deol, Gregg, Kim, Roesch, Walsh]:</w:t>
       </w:r>
       <w:r>
@@ -13186,6 +13202,22 @@
       </w:r>
       <w:r>
         <w:t xml:space="preserve">Investigation (mystery-caller data collection).</w:t>
+      </w:r>
+      <w:r>
+        <w:t xml:space="preserve"> </w:t>
+      </w:r>
+      <w:r>
+        <w:rPr>
+          <w:b/>
+          <w:bCs/>
+        </w:rPr>
+        <w:t xml:space="preserve">Tyler M. Muffly:</w:t>
+      </w:r>
+      <w:r>
+        <w:t xml:space="preserve"> </w:t>
+      </w:r>
+      <w:r>
+        <w:t xml:space="preserve">Conceptualization, Methodology, Formal analysis, Software, Writing – review &amp; editing.</w:t>
       </w:r>
       <w:r>
         <w:t xml:space="preserve"> </w:t>
@@ -13201,39 +13233,7 @@
         <w:t xml:space="preserve"> </w:t>
       </w:r>
       <w:r>
-        <w:t xml:space="preserve">Conceptualization, Supervision, Writing – review &amp; editing.</w:t>
-      </w:r>
-      <w:r>
-        <w:t xml:space="preserve"> </w:t>
-      </w:r>
-      <w:r>
-        <w:rPr>
-          <w:b/>
-          <w:bCs/>
-        </w:rPr>
-        <w:t xml:space="preserve">Tyler M. Muffly:</w:t>
-      </w:r>
-      <w:r>
-        <w:t xml:space="preserve"> </w:t>
-      </w:r>
-      <w:r>
-        <w:t xml:space="preserve">Conceptualization, Methodology, Formal analysis, Software, Writing – review &amp; editing.</w:t>
-      </w:r>
-      <w:r>
-        <w:t xml:space="preserve"> </w:t>
-      </w:r>
-      <w:r>
-        <w:rPr>
-          <w:b/>
-          <w:bCs/>
-        </w:rPr>
-        <w:t xml:space="preserve">Eric J. Dobratz:</w:t>
-      </w:r>
-      <w:r>
-        <w:t xml:space="preserve"> </w:t>
-      </w:r>
-      <w:r>
-        <w:t xml:space="preserve">Conceptualization, Supervision, Resources, Project administration, Writing – review &amp; editing. All authors reviewed and approved the final manuscript and accept responsibility for its submission.</w:t>
+        <w:t xml:space="preserve">Conceptualization, Supervision, Writing – review &amp; editing. All authors reviewed and approved the final manuscript and accept responsibility for its submission.</w:t>
       </w:r>
     </w:p>
     <w:bookmarkEnd w:id="35"/>

</xml_diff>

<commit_message>
Fix Table S7 layout, KM y-axis label, and label choropleth regions
- Table S7: mysterycall packs 'estimate\np=...' into each cell; the embedded
  newline broke the pandoc pipe table (p-values spilled to their own rows). Flatten
  to single-line 'estimate, p=...'.
- Figure S1 (KM): replace the package's confusing y-label ('Probability of
  Appointment Not Yet Received') with 'Proportion still without an appointment',
  preserving the percent axis.
- Figure S4a/b (choropleths): label each AAO-HNS BoG region at its centroid so the
  colored blocks are identifiable (Pacific, Central, Midwest, Southeast, Mid-
  Atlantic/Southeast, Middle Atlantic, New England, Mountain/Southwest).

Co-Authored-By: Claude Opus 4.8 (1M context) <noreply@anthropic.com>
</commit_message>
<xml_diff>
--- a/manuscript_output/manuscript_mystery_caller.docx
+++ b/manuscript_output/manuscript_mystery_caller.docx
@@ -19241,9 +19241,9 @@
         <w:tblCaption w:val="Table S7. Access vs. timeliness models, side by side."/>
       </w:tblPr>
       <w:tblGrid>
-        <w:gridCol w:w="3315"/>
-        <w:gridCol w:w="2394"/>
-        <w:gridCol w:w="2210"/>
+        <w:gridCol w:w="3168"/>
+        <w:gridCol w:w="2464"/>
+        <w:gridCol w:w="2288"/>
       </w:tblGrid>
       <w:tr>
         <w:trPr>
@@ -19345,16 +19345,20 @@
               <w:jc w:val="left"/>
             </w:pPr>
             <w:r>
-              <w:t xml:space="preserve">1.00 (0.59-1.69)</w:t>
-            </w:r>
-          </w:p>
-        </w:tc>
-        <w:tc>
-          <w:tcPr/>
-          <w:p>
-            <w:pPr>
-              <w:pStyle w:val="Compact"/>
-            </w:pPr>
+              <w:t xml:space="preserve">1.00 (0.59-1.69), p=0.995</w:t>
+            </w:r>
+          </w:p>
+        </w:tc>
+        <w:tc>
+          <w:tcPr/>
+          <w:p>
+            <w:pPr>
+              <w:pStyle w:val="Compact"/>
+              <w:jc w:val="left"/>
+            </w:pPr>
+            <w:r>
+              <w:t xml:space="preserve">1.06 (0.74-1.52), p=0.743</w:t>
+            </w:r>
           </w:p>
         </w:tc>
       </w:tr>
@@ -19367,28 +19371,32 @@
               <w:jc w:val="left"/>
             </w:pPr>
             <w:r>
-              <w:t xml:space="preserve">p=0.995</w:t>
-            </w:r>
-          </w:p>
-        </w:tc>
-        <w:tc>
-          <w:tcPr/>
-          <w:p>
-            <w:pPr>
-              <w:pStyle w:val="Compact"/>
-              <w:jc w:val="left"/>
-            </w:pPr>
-            <w:r>
-              <w:t xml:space="preserve">1.06 (0.74-1.52)</w:t>
-            </w:r>
-          </w:p>
-        </w:tc>
-        <w:tc>
-          <w:tcPr/>
-          <w:p>
-            <w:pPr>
-              <w:pStyle w:val="Compact"/>
-            </w:pPr>
+              <w:t xml:space="preserve">Head and neck oncology</w:t>
+            </w:r>
+          </w:p>
+        </w:tc>
+        <w:tc>
+          <w:tcPr/>
+          <w:p>
+            <w:pPr>
+              <w:pStyle w:val="Compact"/>
+              <w:jc w:val="left"/>
+            </w:pPr>
+            <w:r>
+              <w:t xml:space="preserve">0.82 (0.36-1.90), p=0.650</w:t>
+            </w:r>
+          </w:p>
+        </w:tc>
+        <w:tc>
+          <w:tcPr/>
+          <w:p>
+            <w:pPr>
+              <w:pStyle w:val="Compact"/>
+              <w:jc w:val="left"/>
+            </w:pPr>
+            <w:r>
+              <w:t xml:space="preserve">1.29 (0.74-2.26), p=0.369</w:t>
+            </w:r>
           </w:p>
         </w:tc>
       </w:tr>
@@ -19401,24 +19409,32 @@
               <w:jc w:val="left"/>
             </w:pPr>
             <w:r>
-              <w:t xml:space="preserve">p=0.743</w:t>
-            </w:r>
-          </w:p>
-        </w:tc>
-        <w:tc>
-          <w:tcPr/>
-          <w:p>
-            <w:pPr>
-              <w:pStyle w:val="Compact"/>
-            </w:pPr>
-          </w:p>
-        </w:tc>
-        <w:tc>
-          <w:tcPr/>
-          <w:p>
-            <w:pPr>
-              <w:pStyle w:val="Compact"/>
-            </w:pPr>
+              <w:t xml:space="preserve">Laryngology</w:t>
+            </w:r>
+          </w:p>
+        </w:tc>
+        <w:tc>
+          <w:tcPr/>
+          <w:p>
+            <w:pPr>
+              <w:pStyle w:val="Compact"/>
+              <w:jc w:val="left"/>
+            </w:pPr>
+            <w:r>
+              <w:t xml:space="preserve">1.80 (0.51-6.32), p=0.357</w:t>
+            </w:r>
+          </w:p>
+        </w:tc>
+        <w:tc>
+          <w:tcPr/>
+          <w:p>
+            <w:pPr>
+              <w:pStyle w:val="Compact"/>
+              <w:jc w:val="left"/>
+            </w:pPr>
+            <w:r>
+              <w:t xml:space="preserve">2.24 (1.13-4.41), p=0.020</w:t>
+            </w:r>
           </w:p>
         </w:tc>
       </w:tr>
@@ -19431,28 +19447,32 @@
               <w:jc w:val="left"/>
             </w:pPr>
             <w:r>
-              <w:t xml:space="preserve">Head and neck oncology</w:t>
-            </w:r>
-          </w:p>
-        </w:tc>
-        <w:tc>
-          <w:tcPr/>
-          <w:p>
-            <w:pPr>
-              <w:pStyle w:val="Compact"/>
-              <w:jc w:val="left"/>
-            </w:pPr>
-            <w:r>
-              <w:t xml:space="preserve">0.82 (0.36-1.90)</w:t>
-            </w:r>
-          </w:p>
-        </w:tc>
-        <w:tc>
-          <w:tcPr/>
-          <w:p>
-            <w:pPr>
-              <w:pStyle w:val="Compact"/>
-            </w:pPr>
+              <w:t xml:space="preserve">Otology/neurotology</w:t>
+            </w:r>
+          </w:p>
+        </w:tc>
+        <w:tc>
+          <w:tcPr/>
+          <w:p>
+            <w:pPr>
+              <w:pStyle w:val="Compact"/>
+              <w:jc w:val="left"/>
+            </w:pPr>
+            <w:r>
+              <w:t xml:space="preserve">0.58 (0.27-1.25), p=0.167</w:t>
+            </w:r>
+          </w:p>
+        </w:tc>
+        <w:tc>
+          <w:tcPr/>
+          <w:p>
+            <w:pPr>
+              <w:pStyle w:val="Compact"/>
+              <w:jc w:val="left"/>
+            </w:pPr>
+            <w:r>
+              <w:t xml:space="preserve">1.31 (0.72-2.41), p=0.377</w:t>
+            </w:r>
           </w:p>
         </w:tc>
       </w:tr>
@@ -19465,28 +19485,32 @@
               <w:jc w:val="left"/>
             </w:pPr>
             <w:r>
-              <w:t xml:space="preserve">p=0.650</w:t>
-            </w:r>
-          </w:p>
-        </w:tc>
-        <w:tc>
-          <w:tcPr/>
-          <w:p>
-            <w:pPr>
-              <w:pStyle w:val="Compact"/>
-              <w:jc w:val="left"/>
-            </w:pPr>
-            <w:r>
-              <w:t xml:space="preserve">1.29 (0.74-2.26)</w:t>
-            </w:r>
-          </w:p>
-        </w:tc>
-        <w:tc>
-          <w:tcPr/>
-          <w:p>
-            <w:pPr>
-              <w:pStyle w:val="Compact"/>
-            </w:pPr>
+              <w:t xml:space="preserve">Pediatric otolaryngology</w:t>
+            </w:r>
+          </w:p>
+        </w:tc>
+        <w:tc>
+          <w:tcPr/>
+          <w:p>
+            <w:pPr>
+              <w:pStyle w:val="Compact"/>
+              <w:jc w:val="left"/>
+            </w:pPr>
+            <w:r>
+              <w:t xml:space="preserve">2.29 (1.09-4.80), p=0.028</w:t>
+            </w:r>
+          </w:p>
+        </w:tc>
+        <w:tc>
+          <w:tcPr/>
+          <w:p>
+            <w:pPr>
+              <w:pStyle w:val="Compact"/>
+              <w:jc w:val="left"/>
+            </w:pPr>
+            <w:r>
+              <w:t xml:space="preserve">1.62 (1.11-2.38), p=0.013</w:t>
+            </w:r>
           </w:p>
         </w:tc>
       </w:tr>
@@ -19499,24 +19523,32 @@
               <w:jc w:val="left"/>
             </w:pPr>
             <w:r>
-              <w:t xml:space="preserve">p=0.369</w:t>
-            </w:r>
-          </w:p>
-        </w:tc>
-        <w:tc>
-          <w:tcPr/>
-          <w:p>
-            <w:pPr>
-              <w:pStyle w:val="Compact"/>
-            </w:pPr>
-          </w:p>
-        </w:tc>
-        <w:tc>
-          <w:tcPr/>
-          <w:p>
-            <w:pPr>
-              <w:pStyle w:val="Compact"/>
-            </w:pPr>
+              <w:t xml:space="preserve">Rhinology</w:t>
+            </w:r>
+          </w:p>
+        </w:tc>
+        <w:tc>
+          <w:tcPr/>
+          <w:p>
+            <w:pPr>
+              <w:pStyle w:val="Compact"/>
+              <w:jc w:val="left"/>
+            </w:pPr>
+            <w:r>
+              <w:t xml:space="preserve">2.21 (0.75-6.50), p=0.151</w:t>
+            </w:r>
+          </w:p>
+        </w:tc>
+        <w:tc>
+          <w:tcPr/>
+          <w:p>
+            <w:pPr>
+              <w:pStyle w:val="Compact"/>
+              <w:jc w:val="left"/>
+            </w:pPr>
+            <w:r>
+              <w:t xml:space="preserve">1.56 (0.90-2.68), p=0.110</w:t>
+            </w:r>
           </w:p>
         </w:tc>
       </w:tr>
@@ -19529,28 +19561,32 @@
               <w:jc w:val="left"/>
             </w:pPr>
             <w:r>
-              <w:t xml:space="preserve">Laryngology</w:t>
-            </w:r>
-          </w:p>
-        </w:tc>
-        <w:tc>
-          <w:tcPr/>
-          <w:p>
-            <w:pPr>
-              <w:pStyle w:val="Compact"/>
-              <w:jc w:val="left"/>
-            </w:pPr>
-            <w:r>
-              <w:t xml:space="preserve">1.80 (0.51-6.32)</w:t>
-            </w:r>
-          </w:p>
-        </w:tc>
-        <w:tc>
-          <w:tcPr/>
-          <w:p>
-            <w:pPr>
-              <w:pStyle w:val="Compact"/>
-            </w:pPr>
+              <w:t xml:space="preserve">Sleep medicine</w:t>
+            </w:r>
+          </w:p>
+        </w:tc>
+        <w:tc>
+          <w:tcPr/>
+          <w:p>
+            <w:pPr>
+              <w:pStyle w:val="Compact"/>
+              <w:jc w:val="left"/>
+            </w:pPr>
+            <w:r>
+              <w:t xml:space="preserve">1.71 (0.56-5.21), p=0.344</w:t>
+            </w:r>
+          </w:p>
+        </w:tc>
+        <w:tc>
+          <w:tcPr/>
+          <w:p>
+            <w:pPr>
+              <w:pStyle w:val="Compact"/>
+              <w:jc w:val="left"/>
+            </w:pPr>
+            <w:r>
+              <w:t xml:space="preserve">1.21 (0.64-2.30), p=0.551</w:t>
+            </w:r>
           </w:p>
         </w:tc>
       </w:tr>
@@ -19563,28 +19599,32 @@
               <w:jc w:val="left"/>
             </w:pPr>
             <w:r>
-              <w:t xml:space="preserve">p=0.357</w:t>
-            </w:r>
-          </w:p>
-        </w:tc>
-        <w:tc>
-          <w:tcPr/>
-          <w:p>
-            <w:pPr>
-              <w:pStyle w:val="Compact"/>
-              <w:jc w:val="left"/>
-            </w:pPr>
-            <w:r>
-              <w:t xml:space="preserve">2.24 (1.13-4.41)</w:t>
-            </w:r>
-          </w:p>
-        </w:tc>
-        <w:tc>
-          <w:tcPr/>
-          <w:p>
-            <w:pPr>
-              <w:pStyle w:val="Compact"/>
-            </w:pPr>
+              <w:t xml:space="preserve">Otolaryngologist density (per SD)</w:t>
+            </w:r>
+          </w:p>
+        </w:tc>
+        <w:tc>
+          <w:tcPr/>
+          <w:p>
+            <w:pPr>
+              <w:pStyle w:val="Compact"/>
+              <w:jc w:val="left"/>
+            </w:pPr>
+            <w:r>
+              <w:t xml:space="preserve">0.96 (0.81-1.13), p=0.617</w:t>
+            </w:r>
+          </w:p>
+        </w:tc>
+        <w:tc>
+          <w:tcPr/>
+          <w:p>
+            <w:pPr>
+              <w:pStyle w:val="Compact"/>
+              <w:jc w:val="left"/>
+            </w:pPr>
+            <w:r>
+              <w:t xml:space="preserve">0.94 (0.82-1.08), p=0.391</w:t>
+            </w:r>
           </w:p>
         </w:tc>
       </w:tr>
@@ -19597,24 +19637,32 @@
               <w:jc w:val="left"/>
             </w:pPr>
             <w:r>
-              <w:t xml:space="preserve">p=0.020</w:t>
-            </w:r>
-          </w:p>
-        </w:tc>
-        <w:tc>
-          <w:tcPr/>
-          <w:p>
-            <w:pPr>
-              <w:pStyle w:val="Compact"/>
-            </w:pPr>
-          </w:p>
-        </w:tc>
-        <w:tc>
-          <w:tcPr/>
-          <w:p>
-            <w:pPr>
-              <w:pStyle w:val="Compact"/>
-            </w:pPr>
+              <w:t xml:space="preserve">Medicaid fee index (per SD)</w:t>
+            </w:r>
+          </w:p>
+        </w:tc>
+        <w:tc>
+          <w:tcPr/>
+          <w:p>
+            <w:pPr>
+              <w:pStyle w:val="Compact"/>
+              <w:jc w:val="left"/>
+            </w:pPr>
+            <w:r>
+              <w:t xml:space="preserve">0.90 (0.76-1.06), p=0.191</w:t>
+            </w:r>
+          </w:p>
+        </w:tc>
+        <w:tc>
+          <w:tcPr/>
+          <w:p>
+            <w:pPr>
+              <w:pStyle w:val="Compact"/>
+              <w:jc w:val="left"/>
+            </w:pPr>
+            <w:r>
+              <w:t xml:space="preserve">0.94 (0.83-1.06), p=0.318</w:t>
+            </w:r>
           </w:p>
         </w:tc>
       </w:tr>
@@ -19627,28 +19675,32 @@
               <w:jc w:val="left"/>
             </w:pPr>
             <w:r>
-              <w:t xml:space="preserve">Otology/neurotology</w:t>
-            </w:r>
-          </w:p>
-        </w:tc>
-        <w:tc>
-          <w:tcPr/>
-          <w:p>
-            <w:pPr>
-              <w:pStyle w:val="Compact"/>
-              <w:jc w:val="left"/>
-            </w:pPr>
-            <w:r>
-              <w:t xml:space="preserve">0.58 (0.27-1.25)</w:t>
-            </w:r>
-          </w:p>
-        </w:tc>
-        <w:tc>
-          <w:tcPr/>
-          <w:p>
-            <w:pPr>
-              <w:pStyle w:val="Compact"/>
-            </w:pPr>
+              <w:t xml:space="preserve">Social Vulnerability Index (per SD)</w:t>
+            </w:r>
+          </w:p>
+        </w:tc>
+        <w:tc>
+          <w:tcPr/>
+          <w:p>
+            <w:pPr>
+              <w:pStyle w:val="Compact"/>
+              <w:jc w:val="left"/>
+            </w:pPr>
+            <w:r>
+              <w:t xml:space="preserve">0.93 (0.78-1.11), p=0.425</w:t>
+            </w:r>
+          </w:p>
+        </w:tc>
+        <w:tc>
+          <w:tcPr/>
+          <w:p>
+            <w:pPr>
+              <w:pStyle w:val="Compact"/>
+              <w:jc w:val="left"/>
+            </w:pPr>
+            <w:r>
+              <w:t xml:space="preserve">0.96 (0.85-1.08), p=0.489</w:t>
+            </w:r>
           </w:p>
         </w:tc>
       </w:tr>
@@ -19661,28 +19713,32 @@
               <w:jc w:val="left"/>
             </w:pPr>
             <w:r>
-              <w:t xml:space="preserve">p=0.167</w:t>
-            </w:r>
-          </w:p>
-        </w:tc>
-        <w:tc>
-          <w:tcPr/>
-          <w:p>
-            <w:pPr>
-              <w:pStyle w:val="Compact"/>
-              <w:jc w:val="left"/>
-            </w:pPr>
-            <w:r>
-              <w:t xml:space="preserve">1.31 (0.72-2.41)</w:t>
-            </w:r>
-          </w:p>
-        </w:tc>
-        <w:tc>
-          <w:tcPr/>
-          <w:p>
-            <w:pPr>
-              <w:pStyle w:val="Compact"/>
-            </w:pPr>
+              <w:t xml:space="preserve">Dual-eligible share (per SD)</w:t>
+            </w:r>
+          </w:p>
+        </w:tc>
+        <w:tc>
+          <w:tcPr/>
+          <w:p>
+            <w:pPr>
+              <w:pStyle w:val="Compact"/>
+              <w:jc w:val="left"/>
+            </w:pPr>
+            <w:r>
+              <w:t xml:space="preserve">0.98 (0.82-1.17), p=0.816</w:t>
+            </w:r>
+          </w:p>
+        </w:tc>
+        <w:tc>
+          <w:tcPr/>
+          <w:p>
+            <w:pPr>
+              <w:pStyle w:val="Compact"/>
+              <w:jc w:val="left"/>
+            </w:pPr>
+            <w:r>
+              <w:t xml:space="preserve">0.99 (0.87-1.12), p=0.832</w:t>
+            </w:r>
           </w:p>
         </w:tc>
       </w:tr>
@@ -19695,24 +19751,32 @@
               <w:jc w:val="left"/>
             </w:pPr>
             <w:r>
-              <w:t xml:space="preserve">p=0.377</w:t>
-            </w:r>
-          </w:p>
-        </w:tc>
-        <w:tc>
-          <w:tcPr/>
-          <w:p>
-            <w:pPr>
-              <w:pStyle w:val="Compact"/>
-            </w:pPr>
-          </w:p>
-        </w:tc>
-        <w:tc>
-          <w:tcPr/>
-          <w:p>
-            <w:pPr>
-              <w:pStyle w:val="Compact"/>
-            </w:pPr>
+              <w:t xml:space="preserve">ruralUrban</w:t>
+            </w:r>
+          </w:p>
+        </w:tc>
+        <w:tc>
+          <w:tcPr/>
+          <w:p>
+            <w:pPr>
+              <w:pStyle w:val="Compact"/>
+              <w:jc w:val="left"/>
+            </w:pPr>
+            <w:r>
+              <w:t xml:space="preserve">Ref.</w:t>
+            </w:r>
+          </w:p>
+        </w:tc>
+        <w:tc>
+          <w:tcPr/>
+          <w:p>
+            <w:pPr>
+              <w:pStyle w:val="Compact"/>
+              <w:jc w:val="left"/>
+            </w:pPr>
+            <w:r>
+              <w:t xml:space="preserve">Ref.</w:t>
+            </w:r>
           </w:p>
         </w:tc>
       </w:tr>
@@ -19725,28 +19789,32 @@
               <w:jc w:val="left"/>
             </w:pPr>
             <w:r>
-              <w:t xml:space="preserve">Pediatric otolaryngology</w:t>
-            </w:r>
-          </w:p>
-        </w:tc>
-        <w:tc>
-          <w:tcPr/>
-          <w:p>
-            <w:pPr>
-              <w:pStyle w:val="Compact"/>
-              <w:jc w:val="left"/>
-            </w:pPr>
-            <w:r>
-              <w:t xml:space="preserve">2.29 (1.09-4.80)</w:t>
-            </w:r>
-          </w:p>
-        </w:tc>
-        <w:tc>
-          <w:tcPr/>
-          <w:p>
-            <w:pPr>
-              <w:pStyle w:val="Compact"/>
-            </w:pPr>
+              <w:t xml:space="preserve">Rural (vs urban)</w:t>
+            </w:r>
+          </w:p>
+        </w:tc>
+        <w:tc>
+          <w:tcPr/>
+          <w:p>
+            <w:pPr>
+              <w:pStyle w:val="Compact"/>
+              <w:jc w:val="left"/>
+            </w:pPr>
+            <w:r>
+              <w:t xml:space="preserve">1.04 (0.73-1.49), p=0.830</w:t>
+            </w:r>
+          </w:p>
+        </w:tc>
+        <w:tc>
+          <w:tcPr/>
+          <w:p>
+            <w:pPr>
+              <w:pStyle w:val="Compact"/>
+              <w:jc w:val="left"/>
+            </w:pPr>
+            <w:r>
+              <w:t xml:space="preserve">1.19 (0.92-1.53), p=0.191</w:t>
+            </w:r>
           </w:p>
         </w:tc>
       </w:tr>
@@ -19759,28 +19827,32 @@
               <w:jc w:val="left"/>
             </w:pPr>
             <w:r>
-              <w:t xml:space="preserve">p=0.028</w:t>
-            </w:r>
-          </w:p>
-        </w:tc>
-        <w:tc>
-          <w:tcPr/>
-          <w:p>
-            <w:pPr>
-              <w:pStyle w:val="Compact"/>
-              <w:jc w:val="left"/>
-            </w:pPr>
-            <w:r>
-              <w:t xml:space="preserve">1.62 (1.11-2.38)</w:t>
-            </w:r>
-          </w:p>
-        </w:tc>
-        <w:tc>
-          <w:tcPr/>
-          <w:p>
-            <w:pPr>
-              <w:pStyle w:val="Compact"/>
-            </w:pPr>
+              <w:t xml:space="preserve">Caller: Roesch</w:t>
+            </w:r>
+          </w:p>
+        </w:tc>
+        <w:tc>
+          <w:tcPr/>
+          <w:p>
+            <w:pPr>
+              <w:pStyle w:val="Compact"/>
+              <w:jc w:val="left"/>
+            </w:pPr>
+            <w:r>
+              <w:t xml:space="preserve">Ref.</w:t>
+            </w:r>
+          </w:p>
+        </w:tc>
+        <w:tc>
+          <w:tcPr/>
+          <w:p>
+            <w:pPr>
+              <w:pStyle w:val="Compact"/>
+              <w:jc w:val="left"/>
+            </w:pPr>
+            <w:r>
+              <w:t xml:space="preserve">Ref.</w:t>
+            </w:r>
           </w:p>
         </w:tc>
       </w:tr>
@@ -19793,24 +19865,32 @@
               <w:jc w:val="left"/>
             </w:pPr>
             <w:r>
-              <w:t xml:space="preserve">p=0.013</w:t>
-            </w:r>
-          </w:p>
-        </w:tc>
-        <w:tc>
-          <w:tcPr/>
-          <w:p>
-            <w:pPr>
-              <w:pStyle w:val="Compact"/>
-            </w:pPr>
-          </w:p>
-        </w:tc>
-        <w:tc>
-          <w:tcPr/>
-          <w:p>
-            <w:pPr>
-              <w:pStyle w:val="Compact"/>
-            </w:pPr>
+              <w:t xml:space="preserve">Caller: Deol</w:t>
+            </w:r>
+          </w:p>
+        </w:tc>
+        <w:tc>
+          <w:tcPr/>
+          <w:p>
+            <w:pPr>
+              <w:pStyle w:val="Compact"/>
+              <w:jc w:val="left"/>
+            </w:pPr>
+            <w:r>
+              <w:t xml:space="preserve">2.25 (1.37-3.71), p=0.001</w:t>
+            </w:r>
+          </w:p>
+        </w:tc>
+        <w:tc>
+          <w:tcPr/>
+          <w:p>
+            <w:pPr>
+              <w:pStyle w:val="Compact"/>
+              <w:jc w:val="left"/>
+            </w:pPr>
+            <w:r>
+              <w:t xml:space="preserve">0.83 (0.60-1.14), p=0.258</w:t>
+            </w:r>
           </w:p>
         </w:tc>
       </w:tr>
@@ -19823,28 +19903,32 @@
               <w:jc w:val="left"/>
             </w:pPr>
             <w:r>
-              <w:t xml:space="preserve">Rhinology</w:t>
-            </w:r>
-          </w:p>
-        </w:tc>
-        <w:tc>
-          <w:tcPr/>
-          <w:p>
-            <w:pPr>
-              <w:pStyle w:val="Compact"/>
-              <w:jc w:val="left"/>
-            </w:pPr>
-            <w:r>
-              <w:t xml:space="preserve">2.21 (0.75-6.50)</w:t>
-            </w:r>
-          </w:p>
-        </w:tc>
-        <w:tc>
-          <w:tcPr/>
-          <w:p>
-            <w:pPr>
-              <w:pStyle w:val="Compact"/>
-            </w:pPr>
+              <w:t xml:space="preserve">Caller: Falk</w:t>
+            </w:r>
+          </w:p>
+        </w:tc>
+        <w:tc>
+          <w:tcPr/>
+          <w:p>
+            <w:pPr>
+              <w:pStyle w:val="Compact"/>
+              <w:jc w:val="left"/>
+            </w:pPr>
+            <w:r>
+              <w:t xml:space="preserve">1.88 (1.07-3.31), p=0.029</w:t>
+            </w:r>
+          </w:p>
+        </w:tc>
+        <w:tc>
+          <w:tcPr/>
+          <w:p>
+            <w:pPr>
+              <w:pStyle w:val="Compact"/>
+              <w:jc w:val="left"/>
+            </w:pPr>
+            <w:r>
+              <w:t xml:space="preserve">0.64 (0.43-0.93), p=0.020</w:t>
+            </w:r>
           </w:p>
         </w:tc>
       </w:tr>
@@ -19857,28 +19941,32 @@
               <w:jc w:val="left"/>
             </w:pPr>
             <w:r>
-              <w:t xml:space="preserve">p=0.151</w:t>
-            </w:r>
-          </w:p>
-        </w:tc>
-        <w:tc>
-          <w:tcPr/>
-          <w:p>
-            <w:pPr>
-              <w:pStyle w:val="Compact"/>
-              <w:jc w:val="left"/>
-            </w:pPr>
-            <w:r>
-              <w:t xml:space="preserve">1.56 (0.90-2.68)</w:t>
-            </w:r>
-          </w:p>
-        </w:tc>
-        <w:tc>
-          <w:tcPr/>
-          <w:p>
-            <w:pPr>
-              <w:pStyle w:val="Compact"/>
-            </w:pPr>
+              <w:t xml:space="preserve">Caller: Gregg</w:t>
+            </w:r>
+          </w:p>
+        </w:tc>
+        <w:tc>
+          <w:tcPr/>
+          <w:p>
+            <w:pPr>
+              <w:pStyle w:val="Compact"/>
+              <w:jc w:val="left"/>
+            </w:pPr>
+            <w:r>
+              <w:t xml:space="preserve">1.89 (1.14-3.11), p=0.013</w:t>
+            </w:r>
+          </w:p>
+        </w:tc>
+        <w:tc>
+          <w:tcPr/>
+          <w:p>
+            <w:pPr>
+              <w:pStyle w:val="Compact"/>
+              <w:jc w:val="left"/>
+            </w:pPr>
+            <w:r>
+              <w:t xml:space="preserve">0.90 (0.65-1.25), p=0.528</w:t>
+            </w:r>
           </w:p>
         </w:tc>
       </w:tr>
@@ -19891,24 +19979,32 @@
               <w:jc w:val="left"/>
             </w:pPr>
             <w:r>
-              <w:t xml:space="preserve">p=0.110</w:t>
-            </w:r>
-          </w:p>
-        </w:tc>
-        <w:tc>
-          <w:tcPr/>
-          <w:p>
-            <w:pPr>
-              <w:pStyle w:val="Compact"/>
-            </w:pPr>
-          </w:p>
-        </w:tc>
-        <w:tc>
-          <w:tcPr/>
-          <w:p>
-            <w:pPr>
-              <w:pStyle w:val="Compact"/>
-            </w:pPr>
+              <w:t xml:space="preserve">Caller: Kim</w:t>
+            </w:r>
+          </w:p>
+        </w:tc>
+        <w:tc>
+          <w:tcPr/>
+          <w:p>
+            <w:pPr>
+              <w:pStyle w:val="Compact"/>
+              <w:jc w:val="left"/>
+            </w:pPr>
+            <w:r>
+              <w:t xml:space="preserve">2.06 (1.25-3.41), p=0.005</w:t>
+            </w:r>
+          </w:p>
+        </w:tc>
+        <w:tc>
+          <w:tcPr/>
+          <w:p>
+            <w:pPr>
+              <w:pStyle w:val="Compact"/>
+              <w:jc w:val="left"/>
+            </w:pPr>
+            <w:r>
+              <w:t xml:space="preserve">0.98 (0.70-1.37), p=0.896</w:t>
+            </w:r>
           </w:p>
         </w:tc>
       </w:tr>
@@ -19921,28 +20017,32 @@
               <w:jc w:val="left"/>
             </w:pPr>
             <w:r>
-              <w:t xml:space="preserve">Sleep medicine</w:t>
-            </w:r>
-          </w:p>
-        </w:tc>
-        <w:tc>
-          <w:tcPr/>
-          <w:p>
-            <w:pPr>
-              <w:pStyle w:val="Compact"/>
-              <w:jc w:val="left"/>
-            </w:pPr>
-            <w:r>
-              <w:t xml:space="preserve">1.71 (0.56-5.21)</w:t>
-            </w:r>
-          </w:p>
-        </w:tc>
-        <w:tc>
-          <w:tcPr/>
-          <w:p>
-            <w:pPr>
-              <w:pStyle w:val="Compact"/>
-            </w:pPr>
+              <w:t xml:space="preserve">Caller: Other</w:t>
+            </w:r>
+          </w:p>
+        </w:tc>
+        <w:tc>
+          <w:tcPr/>
+          <w:p>
+            <w:pPr>
+              <w:pStyle w:val="Compact"/>
+              <w:jc w:val="left"/>
+            </w:pPr>
+            <w:r>
+              <w:t xml:space="preserve">1.31 (0.41-4.21), p=0.648</w:t>
+            </w:r>
+          </w:p>
+        </w:tc>
+        <w:tc>
+          <w:tcPr/>
+          <w:p>
+            <w:pPr>
+              <w:pStyle w:val="Compact"/>
+              <w:jc w:val="left"/>
+            </w:pPr>
+            <w:r>
+              <w:t xml:space="preserve">0.66 (0.23-1.87), p=0.436</w:t>
+            </w:r>
           </w:p>
         </w:tc>
       </w:tr>
@@ -19955,1126 +20055,6 @@
               <w:jc w:val="left"/>
             </w:pPr>
             <w:r>
-              <w:t xml:space="preserve">p=0.344</w:t>
-            </w:r>
-          </w:p>
-        </w:tc>
-        <w:tc>
-          <w:tcPr/>
-          <w:p>
-            <w:pPr>
-              <w:pStyle w:val="Compact"/>
-              <w:jc w:val="left"/>
-            </w:pPr>
-            <w:r>
-              <w:t xml:space="preserve">1.21 (0.64-2.30)</w:t>
-            </w:r>
-          </w:p>
-        </w:tc>
-        <w:tc>
-          <w:tcPr/>
-          <w:p>
-            <w:pPr>
-              <w:pStyle w:val="Compact"/>
-            </w:pPr>
-          </w:p>
-        </w:tc>
-      </w:tr>
-      <w:tr>
-        <w:tc>
-          <w:tcPr/>
-          <w:p>
-            <w:pPr>
-              <w:pStyle w:val="Compact"/>
-              <w:jc w:val="left"/>
-            </w:pPr>
-            <w:r>
-              <w:t xml:space="preserve">p=0.551</w:t>
-            </w:r>
-          </w:p>
-        </w:tc>
-        <w:tc>
-          <w:tcPr/>
-          <w:p>
-            <w:pPr>
-              <w:pStyle w:val="Compact"/>
-            </w:pPr>
-          </w:p>
-        </w:tc>
-        <w:tc>
-          <w:tcPr/>
-          <w:p>
-            <w:pPr>
-              <w:pStyle w:val="Compact"/>
-            </w:pPr>
-          </w:p>
-        </w:tc>
-      </w:tr>
-      <w:tr>
-        <w:tc>
-          <w:tcPr/>
-          <w:p>
-            <w:pPr>
-              <w:pStyle w:val="Compact"/>
-              <w:jc w:val="left"/>
-            </w:pPr>
-            <w:r>
-              <w:t xml:space="preserve">Otolaryngologist density (per SD)</w:t>
-            </w:r>
-          </w:p>
-        </w:tc>
-        <w:tc>
-          <w:tcPr/>
-          <w:p>
-            <w:pPr>
-              <w:pStyle w:val="Compact"/>
-              <w:jc w:val="left"/>
-            </w:pPr>
-            <w:r>
-              <w:t xml:space="preserve">0.96 (0.81-1.13)</w:t>
-            </w:r>
-          </w:p>
-        </w:tc>
-        <w:tc>
-          <w:tcPr/>
-          <w:p>
-            <w:pPr>
-              <w:pStyle w:val="Compact"/>
-            </w:pPr>
-          </w:p>
-        </w:tc>
-      </w:tr>
-      <w:tr>
-        <w:tc>
-          <w:tcPr/>
-          <w:p>
-            <w:pPr>
-              <w:pStyle w:val="Compact"/>
-              <w:jc w:val="left"/>
-            </w:pPr>
-            <w:r>
-              <w:t xml:space="preserve">p=0.617</w:t>
-            </w:r>
-          </w:p>
-        </w:tc>
-        <w:tc>
-          <w:tcPr/>
-          <w:p>
-            <w:pPr>
-              <w:pStyle w:val="Compact"/>
-              <w:jc w:val="left"/>
-            </w:pPr>
-            <w:r>
-              <w:t xml:space="preserve">0.94 (0.82-1.08)</w:t>
-            </w:r>
-          </w:p>
-        </w:tc>
-        <w:tc>
-          <w:tcPr/>
-          <w:p>
-            <w:pPr>
-              <w:pStyle w:val="Compact"/>
-            </w:pPr>
-          </w:p>
-        </w:tc>
-      </w:tr>
-      <w:tr>
-        <w:tc>
-          <w:tcPr/>
-          <w:p>
-            <w:pPr>
-              <w:pStyle w:val="Compact"/>
-              <w:jc w:val="left"/>
-            </w:pPr>
-            <w:r>
-              <w:t xml:space="preserve">p=0.391</w:t>
-            </w:r>
-          </w:p>
-        </w:tc>
-        <w:tc>
-          <w:tcPr/>
-          <w:p>
-            <w:pPr>
-              <w:pStyle w:val="Compact"/>
-            </w:pPr>
-          </w:p>
-        </w:tc>
-        <w:tc>
-          <w:tcPr/>
-          <w:p>
-            <w:pPr>
-              <w:pStyle w:val="Compact"/>
-            </w:pPr>
-          </w:p>
-        </w:tc>
-      </w:tr>
-      <w:tr>
-        <w:tc>
-          <w:tcPr/>
-          <w:p>
-            <w:pPr>
-              <w:pStyle w:val="Compact"/>
-              <w:jc w:val="left"/>
-            </w:pPr>
-            <w:r>
-              <w:t xml:space="preserve">Medicaid fee index (per SD)</w:t>
-            </w:r>
-          </w:p>
-        </w:tc>
-        <w:tc>
-          <w:tcPr/>
-          <w:p>
-            <w:pPr>
-              <w:pStyle w:val="Compact"/>
-              <w:jc w:val="left"/>
-            </w:pPr>
-            <w:r>
-              <w:t xml:space="preserve">0.90 (0.76-1.06)</w:t>
-            </w:r>
-          </w:p>
-        </w:tc>
-        <w:tc>
-          <w:tcPr/>
-          <w:p>
-            <w:pPr>
-              <w:pStyle w:val="Compact"/>
-            </w:pPr>
-          </w:p>
-        </w:tc>
-      </w:tr>
-      <w:tr>
-        <w:tc>
-          <w:tcPr/>
-          <w:p>
-            <w:pPr>
-              <w:pStyle w:val="Compact"/>
-              <w:jc w:val="left"/>
-            </w:pPr>
-            <w:r>
-              <w:t xml:space="preserve">p=0.191</w:t>
-            </w:r>
-          </w:p>
-        </w:tc>
-        <w:tc>
-          <w:tcPr/>
-          <w:p>
-            <w:pPr>
-              <w:pStyle w:val="Compact"/>
-              <w:jc w:val="left"/>
-            </w:pPr>
-            <w:r>
-              <w:t xml:space="preserve">0.94 (0.83-1.06)</w:t>
-            </w:r>
-          </w:p>
-        </w:tc>
-        <w:tc>
-          <w:tcPr/>
-          <w:p>
-            <w:pPr>
-              <w:pStyle w:val="Compact"/>
-            </w:pPr>
-          </w:p>
-        </w:tc>
-      </w:tr>
-      <w:tr>
-        <w:tc>
-          <w:tcPr/>
-          <w:p>
-            <w:pPr>
-              <w:pStyle w:val="Compact"/>
-              <w:jc w:val="left"/>
-            </w:pPr>
-            <w:r>
-              <w:t xml:space="preserve">p=0.318</w:t>
-            </w:r>
-          </w:p>
-        </w:tc>
-        <w:tc>
-          <w:tcPr/>
-          <w:p>
-            <w:pPr>
-              <w:pStyle w:val="Compact"/>
-            </w:pPr>
-          </w:p>
-        </w:tc>
-        <w:tc>
-          <w:tcPr/>
-          <w:p>
-            <w:pPr>
-              <w:pStyle w:val="Compact"/>
-            </w:pPr>
-          </w:p>
-        </w:tc>
-      </w:tr>
-      <w:tr>
-        <w:tc>
-          <w:tcPr/>
-          <w:p>
-            <w:pPr>
-              <w:pStyle w:val="Compact"/>
-              <w:jc w:val="left"/>
-            </w:pPr>
-            <w:r>
-              <w:t xml:space="preserve">Social Vulnerability Index (per SD)</w:t>
-            </w:r>
-          </w:p>
-        </w:tc>
-        <w:tc>
-          <w:tcPr/>
-          <w:p>
-            <w:pPr>
-              <w:pStyle w:val="Compact"/>
-              <w:jc w:val="left"/>
-            </w:pPr>
-            <w:r>
-              <w:t xml:space="preserve">0.93 (0.78-1.11)</w:t>
-            </w:r>
-          </w:p>
-        </w:tc>
-        <w:tc>
-          <w:tcPr/>
-          <w:p>
-            <w:pPr>
-              <w:pStyle w:val="Compact"/>
-            </w:pPr>
-          </w:p>
-        </w:tc>
-      </w:tr>
-      <w:tr>
-        <w:tc>
-          <w:tcPr/>
-          <w:p>
-            <w:pPr>
-              <w:pStyle w:val="Compact"/>
-              <w:jc w:val="left"/>
-            </w:pPr>
-            <w:r>
-              <w:t xml:space="preserve">p=0.425</w:t>
-            </w:r>
-          </w:p>
-        </w:tc>
-        <w:tc>
-          <w:tcPr/>
-          <w:p>
-            <w:pPr>
-              <w:pStyle w:val="Compact"/>
-              <w:jc w:val="left"/>
-            </w:pPr>
-            <w:r>
-              <w:t xml:space="preserve">0.96 (0.85-1.08)</w:t>
-            </w:r>
-          </w:p>
-        </w:tc>
-        <w:tc>
-          <w:tcPr/>
-          <w:p>
-            <w:pPr>
-              <w:pStyle w:val="Compact"/>
-            </w:pPr>
-          </w:p>
-        </w:tc>
-      </w:tr>
-      <w:tr>
-        <w:tc>
-          <w:tcPr/>
-          <w:p>
-            <w:pPr>
-              <w:pStyle w:val="Compact"/>
-              <w:jc w:val="left"/>
-            </w:pPr>
-            <w:r>
-              <w:t xml:space="preserve">p=0.489</w:t>
-            </w:r>
-          </w:p>
-        </w:tc>
-        <w:tc>
-          <w:tcPr/>
-          <w:p>
-            <w:pPr>
-              <w:pStyle w:val="Compact"/>
-            </w:pPr>
-          </w:p>
-        </w:tc>
-        <w:tc>
-          <w:tcPr/>
-          <w:p>
-            <w:pPr>
-              <w:pStyle w:val="Compact"/>
-            </w:pPr>
-          </w:p>
-        </w:tc>
-      </w:tr>
-      <w:tr>
-        <w:tc>
-          <w:tcPr/>
-          <w:p>
-            <w:pPr>
-              <w:pStyle w:val="Compact"/>
-              <w:jc w:val="left"/>
-            </w:pPr>
-            <w:r>
-              <w:t xml:space="preserve">Dual-eligible share (per SD)</w:t>
-            </w:r>
-          </w:p>
-        </w:tc>
-        <w:tc>
-          <w:tcPr/>
-          <w:p>
-            <w:pPr>
-              <w:pStyle w:val="Compact"/>
-              <w:jc w:val="left"/>
-            </w:pPr>
-            <w:r>
-              <w:t xml:space="preserve">0.98 (0.82-1.17)</w:t>
-            </w:r>
-          </w:p>
-        </w:tc>
-        <w:tc>
-          <w:tcPr/>
-          <w:p>
-            <w:pPr>
-              <w:pStyle w:val="Compact"/>
-            </w:pPr>
-          </w:p>
-        </w:tc>
-      </w:tr>
-      <w:tr>
-        <w:tc>
-          <w:tcPr/>
-          <w:p>
-            <w:pPr>
-              <w:pStyle w:val="Compact"/>
-              <w:jc w:val="left"/>
-            </w:pPr>
-            <w:r>
-              <w:t xml:space="preserve">p=0.816</w:t>
-            </w:r>
-          </w:p>
-        </w:tc>
-        <w:tc>
-          <w:tcPr/>
-          <w:p>
-            <w:pPr>
-              <w:pStyle w:val="Compact"/>
-              <w:jc w:val="left"/>
-            </w:pPr>
-            <w:r>
-              <w:t xml:space="preserve">0.99 (0.87-1.12)</w:t>
-            </w:r>
-          </w:p>
-        </w:tc>
-        <w:tc>
-          <w:tcPr/>
-          <w:p>
-            <w:pPr>
-              <w:pStyle w:val="Compact"/>
-            </w:pPr>
-          </w:p>
-        </w:tc>
-      </w:tr>
-      <w:tr>
-        <w:tc>
-          <w:tcPr/>
-          <w:p>
-            <w:pPr>
-              <w:pStyle w:val="Compact"/>
-              <w:jc w:val="left"/>
-            </w:pPr>
-            <w:r>
-              <w:t xml:space="preserve">p=0.832</w:t>
-            </w:r>
-          </w:p>
-        </w:tc>
-        <w:tc>
-          <w:tcPr/>
-          <w:p>
-            <w:pPr>
-              <w:pStyle w:val="Compact"/>
-            </w:pPr>
-          </w:p>
-        </w:tc>
-        <w:tc>
-          <w:tcPr/>
-          <w:p>
-            <w:pPr>
-              <w:pStyle w:val="Compact"/>
-            </w:pPr>
-          </w:p>
-        </w:tc>
-      </w:tr>
-      <w:tr>
-        <w:tc>
-          <w:tcPr/>
-          <w:p>
-            <w:pPr>
-              <w:pStyle w:val="Compact"/>
-              <w:jc w:val="left"/>
-            </w:pPr>
-            <w:r>
-              <w:t xml:space="preserve">ruralUrban</w:t>
-            </w:r>
-          </w:p>
-        </w:tc>
-        <w:tc>
-          <w:tcPr/>
-          <w:p>
-            <w:pPr>
-              <w:pStyle w:val="Compact"/>
-              <w:jc w:val="left"/>
-            </w:pPr>
-            <w:r>
-              <w:t xml:space="preserve">Ref.</w:t>
-            </w:r>
-          </w:p>
-        </w:tc>
-        <w:tc>
-          <w:tcPr/>
-          <w:p>
-            <w:pPr>
-              <w:pStyle w:val="Compact"/>
-              <w:jc w:val="left"/>
-            </w:pPr>
-            <w:r>
-              <w:t xml:space="preserve">Ref.</w:t>
-            </w:r>
-          </w:p>
-        </w:tc>
-      </w:tr>
-      <w:tr>
-        <w:tc>
-          <w:tcPr/>
-          <w:p>
-            <w:pPr>
-              <w:pStyle w:val="Compact"/>
-              <w:jc w:val="left"/>
-            </w:pPr>
-            <w:r>
-              <w:t xml:space="preserve">Rural (vs urban)</w:t>
-            </w:r>
-          </w:p>
-        </w:tc>
-        <w:tc>
-          <w:tcPr/>
-          <w:p>
-            <w:pPr>
-              <w:pStyle w:val="Compact"/>
-              <w:jc w:val="left"/>
-            </w:pPr>
-            <w:r>
-              <w:t xml:space="preserve">1.04 (0.73-1.49)</w:t>
-            </w:r>
-          </w:p>
-        </w:tc>
-        <w:tc>
-          <w:tcPr/>
-          <w:p>
-            <w:pPr>
-              <w:pStyle w:val="Compact"/>
-            </w:pPr>
-          </w:p>
-        </w:tc>
-      </w:tr>
-      <w:tr>
-        <w:tc>
-          <w:tcPr/>
-          <w:p>
-            <w:pPr>
-              <w:pStyle w:val="Compact"/>
-              <w:jc w:val="left"/>
-            </w:pPr>
-            <w:r>
-              <w:t xml:space="preserve">p=0.830</w:t>
-            </w:r>
-          </w:p>
-        </w:tc>
-        <w:tc>
-          <w:tcPr/>
-          <w:p>
-            <w:pPr>
-              <w:pStyle w:val="Compact"/>
-              <w:jc w:val="left"/>
-            </w:pPr>
-            <w:r>
-              <w:t xml:space="preserve">1.19 (0.92-1.53)</w:t>
-            </w:r>
-          </w:p>
-        </w:tc>
-        <w:tc>
-          <w:tcPr/>
-          <w:p>
-            <w:pPr>
-              <w:pStyle w:val="Compact"/>
-            </w:pPr>
-          </w:p>
-        </w:tc>
-      </w:tr>
-      <w:tr>
-        <w:tc>
-          <w:tcPr/>
-          <w:p>
-            <w:pPr>
-              <w:pStyle w:val="Compact"/>
-              <w:jc w:val="left"/>
-            </w:pPr>
-            <w:r>
-              <w:t xml:space="preserve">p=0.191</w:t>
-            </w:r>
-          </w:p>
-        </w:tc>
-        <w:tc>
-          <w:tcPr/>
-          <w:p>
-            <w:pPr>
-              <w:pStyle w:val="Compact"/>
-            </w:pPr>
-          </w:p>
-        </w:tc>
-        <w:tc>
-          <w:tcPr/>
-          <w:p>
-            <w:pPr>
-              <w:pStyle w:val="Compact"/>
-            </w:pPr>
-          </w:p>
-        </w:tc>
-      </w:tr>
-      <w:tr>
-        <w:tc>
-          <w:tcPr/>
-          <w:p>
-            <w:pPr>
-              <w:pStyle w:val="Compact"/>
-              <w:jc w:val="left"/>
-            </w:pPr>
-            <w:r>
-              <w:t xml:space="preserve">Caller: Roesch</w:t>
-            </w:r>
-          </w:p>
-        </w:tc>
-        <w:tc>
-          <w:tcPr/>
-          <w:p>
-            <w:pPr>
-              <w:pStyle w:val="Compact"/>
-              <w:jc w:val="left"/>
-            </w:pPr>
-            <w:r>
-              <w:t xml:space="preserve">Ref.</w:t>
-            </w:r>
-          </w:p>
-        </w:tc>
-        <w:tc>
-          <w:tcPr/>
-          <w:p>
-            <w:pPr>
-              <w:pStyle w:val="Compact"/>
-              <w:jc w:val="left"/>
-            </w:pPr>
-            <w:r>
-              <w:t xml:space="preserve">Ref.</w:t>
-            </w:r>
-          </w:p>
-        </w:tc>
-      </w:tr>
-      <w:tr>
-        <w:tc>
-          <w:tcPr/>
-          <w:p>
-            <w:pPr>
-              <w:pStyle w:val="Compact"/>
-              <w:jc w:val="left"/>
-            </w:pPr>
-            <w:r>
-              <w:t xml:space="preserve">Caller: Deol</w:t>
-            </w:r>
-          </w:p>
-        </w:tc>
-        <w:tc>
-          <w:tcPr/>
-          <w:p>
-            <w:pPr>
-              <w:pStyle w:val="Compact"/>
-              <w:jc w:val="left"/>
-            </w:pPr>
-            <w:r>
-              <w:t xml:space="preserve">2.25 (1.37-3.71)</w:t>
-            </w:r>
-          </w:p>
-        </w:tc>
-        <w:tc>
-          <w:tcPr/>
-          <w:p>
-            <w:pPr>
-              <w:pStyle w:val="Compact"/>
-            </w:pPr>
-          </w:p>
-        </w:tc>
-      </w:tr>
-      <w:tr>
-        <w:tc>
-          <w:tcPr/>
-          <w:p>
-            <w:pPr>
-              <w:pStyle w:val="Compact"/>
-              <w:jc w:val="left"/>
-            </w:pPr>
-            <w:r>
-              <w:t xml:space="preserve">p=0.001</w:t>
-            </w:r>
-          </w:p>
-        </w:tc>
-        <w:tc>
-          <w:tcPr/>
-          <w:p>
-            <w:pPr>
-              <w:pStyle w:val="Compact"/>
-              <w:jc w:val="left"/>
-            </w:pPr>
-            <w:r>
-              <w:t xml:space="preserve">0.83 (0.60-1.14)</w:t>
-            </w:r>
-          </w:p>
-        </w:tc>
-        <w:tc>
-          <w:tcPr/>
-          <w:p>
-            <w:pPr>
-              <w:pStyle w:val="Compact"/>
-            </w:pPr>
-          </w:p>
-        </w:tc>
-      </w:tr>
-      <w:tr>
-        <w:tc>
-          <w:tcPr/>
-          <w:p>
-            <w:pPr>
-              <w:pStyle w:val="Compact"/>
-              <w:jc w:val="left"/>
-            </w:pPr>
-            <w:r>
-              <w:t xml:space="preserve">p=0.258</w:t>
-            </w:r>
-          </w:p>
-        </w:tc>
-        <w:tc>
-          <w:tcPr/>
-          <w:p>
-            <w:pPr>
-              <w:pStyle w:val="Compact"/>
-            </w:pPr>
-          </w:p>
-        </w:tc>
-        <w:tc>
-          <w:tcPr/>
-          <w:p>
-            <w:pPr>
-              <w:pStyle w:val="Compact"/>
-            </w:pPr>
-          </w:p>
-        </w:tc>
-      </w:tr>
-      <w:tr>
-        <w:tc>
-          <w:tcPr/>
-          <w:p>
-            <w:pPr>
-              <w:pStyle w:val="Compact"/>
-              <w:jc w:val="left"/>
-            </w:pPr>
-            <w:r>
-              <w:t xml:space="preserve">Caller: Falk</w:t>
-            </w:r>
-          </w:p>
-        </w:tc>
-        <w:tc>
-          <w:tcPr/>
-          <w:p>
-            <w:pPr>
-              <w:pStyle w:val="Compact"/>
-              <w:jc w:val="left"/>
-            </w:pPr>
-            <w:r>
-              <w:t xml:space="preserve">1.88 (1.07-3.31)</w:t>
-            </w:r>
-          </w:p>
-        </w:tc>
-        <w:tc>
-          <w:tcPr/>
-          <w:p>
-            <w:pPr>
-              <w:pStyle w:val="Compact"/>
-            </w:pPr>
-          </w:p>
-        </w:tc>
-      </w:tr>
-      <w:tr>
-        <w:tc>
-          <w:tcPr/>
-          <w:p>
-            <w:pPr>
-              <w:pStyle w:val="Compact"/>
-              <w:jc w:val="left"/>
-            </w:pPr>
-            <w:r>
-              <w:t xml:space="preserve">p=0.029</w:t>
-            </w:r>
-          </w:p>
-        </w:tc>
-        <w:tc>
-          <w:tcPr/>
-          <w:p>
-            <w:pPr>
-              <w:pStyle w:val="Compact"/>
-              <w:jc w:val="left"/>
-            </w:pPr>
-            <w:r>
-              <w:t xml:space="preserve">0.64 (0.43-0.93)</w:t>
-            </w:r>
-          </w:p>
-        </w:tc>
-        <w:tc>
-          <w:tcPr/>
-          <w:p>
-            <w:pPr>
-              <w:pStyle w:val="Compact"/>
-            </w:pPr>
-          </w:p>
-        </w:tc>
-      </w:tr>
-      <w:tr>
-        <w:tc>
-          <w:tcPr/>
-          <w:p>
-            <w:pPr>
-              <w:pStyle w:val="Compact"/>
-              <w:jc w:val="left"/>
-            </w:pPr>
-            <w:r>
-              <w:t xml:space="preserve">p=0.020</w:t>
-            </w:r>
-          </w:p>
-        </w:tc>
-        <w:tc>
-          <w:tcPr/>
-          <w:p>
-            <w:pPr>
-              <w:pStyle w:val="Compact"/>
-            </w:pPr>
-          </w:p>
-        </w:tc>
-        <w:tc>
-          <w:tcPr/>
-          <w:p>
-            <w:pPr>
-              <w:pStyle w:val="Compact"/>
-            </w:pPr>
-          </w:p>
-        </w:tc>
-      </w:tr>
-      <w:tr>
-        <w:tc>
-          <w:tcPr/>
-          <w:p>
-            <w:pPr>
-              <w:pStyle w:val="Compact"/>
-              <w:jc w:val="left"/>
-            </w:pPr>
-            <w:r>
-              <w:t xml:space="preserve">Caller: Gregg</w:t>
-            </w:r>
-          </w:p>
-        </w:tc>
-        <w:tc>
-          <w:tcPr/>
-          <w:p>
-            <w:pPr>
-              <w:pStyle w:val="Compact"/>
-              <w:jc w:val="left"/>
-            </w:pPr>
-            <w:r>
-              <w:t xml:space="preserve">1.89 (1.14-3.11)</w:t>
-            </w:r>
-          </w:p>
-        </w:tc>
-        <w:tc>
-          <w:tcPr/>
-          <w:p>
-            <w:pPr>
-              <w:pStyle w:val="Compact"/>
-            </w:pPr>
-          </w:p>
-        </w:tc>
-      </w:tr>
-      <w:tr>
-        <w:tc>
-          <w:tcPr/>
-          <w:p>
-            <w:pPr>
-              <w:pStyle w:val="Compact"/>
-              <w:jc w:val="left"/>
-            </w:pPr>
-            <w:r>
-              <w:t xml:space="preserve">p=0.013</w:t>
-            </w:r>
-          </w:p>
-        </w:tc>
-        <w:tc>
-          <w:tcPr/>
-          <w:p>
-            <w:pPr>
-              <w:pStyle w:val="Compact"/>
-              <w:jc w:val="left"/>
-            </w:pPr>
-            <w:r>
-              <w:t xml:space="preserve">0.90 (0.65-1.25)</w:t>
-            </w:r>
-          </w:p>
-        </w:tc>
-        <w:tc>
-          <w:tcPr/>
-          <w:p>
-            <w:pPr>
-              <w:pStyle w:val="Compact"/>
-            </w:pPr>
-          </w:p>
-        </w:tc>
-      </w:tr>
-      <w:tr>
-        <w:tc>
-          <w:tcPr/>
-          <w:p>
-            <w:pPr>
-              <w:pStyle w:val="Compact"/>
-              <w:jc w:val="left"/>
-            </w:pPr>
-            <w:r>
-              <w:t xml:space="preserve">p=0.528</w:t>
-            </w:r>
-          </w:p>
-        </w:tc>
-        <w:tc>
-          <w:tcPr/>
-          <w:p>
-            <w:pPr>
-              <w:pStyle w:val="Compact"/>
-            </w:pPr>
-          </w:p>
-        </w:tc>
-        <w:tc>
-          <w:tcPr/>
-          <w:p>
-            <w:pPr>
-              <w:pStyle w:val="Compact"/>
-            </w:pPr>
-          </w:p>
-        </w:tc>
-      </w:tr>
-      <w:tr>
-        <w:tc>
-          <w:tcPr/>
-          <w:p>
-            <w:pPr>
-              <w:pStyle w:val="Compact"/>
-              <w:jc w:val="left"/>
-            </w:pPr>
-            <w:r>
-              <w:t xml:space="preserve">Caller: Kim</w:t>
-            </w:r>
-          </w:p>
-        </w:tc>
-        <w:tc>
-          <w:tcPr/>
-          <w:p>
-            <w:pPr>
-              <w:pStyle w:val="Compact"/>
-              <w:jc w:val="left"/>
-            </w:pPr>
-            <w:r>
-              <w:t xml:space="preserve">2.06 (1.25-3.41)</w:t>
-            </w:r>
-          </w:p>
-        </w:tc>
-        <w:tc>
-          <w:tcPr/>
-          <w:p>
-            <w:pPr>
-              <w:pStyle w:val="Compact"/>
-            </w:pPr>
-          </w:p>
-        </w:tc>
-      </w:tr>
-      <w:tr>
-        <w:tc>
-          <w:tcPr/>
-          <w:p>
-            <w:pPr>
-              <w:pStyle w:val="Compact"/>
-              <w:jc w:val="left"/>
-            </w:pPr>
-            <w:r>
-              <w:t xml:space="preserve">p=0.005</w:t>
-            </w:r>
-          </w:p>
-        </w:tc>
-        <w:tc>
-          <w:tcPr/>
-          <w:p>
-            <w:pPr>
-              <w:pStyle w:val="Compact"/>
-              <w:jc w:val="left"/>
-            </w:pPr>
-            <w:r>
-              <w:t xml:space="preserve">0.98 (0.70-1.37)</w:t>
-            </w:r>
-          </w:p>
-        </w:tc>
-        <w:tc>
-          <w:tcPr/>
-          <w:p>
-            <w:pPr>
-              <w:pStyle w:val="Compact"/>
-            </w:pPr>
-          </w:p>
-        </w:tc>
-      </w:tr>
-      <w:tr>
-        <w:tc>
-          <w:tcPr/>
-          <w:p>
-            <w:pPr>
-              <w:pStyle w:val="Compact"/>
-              <w:jc w:val="left"/>
-            </w:pPr>
-            <w:r>
-              <w:t xml:space="preserve">p=0.896</w:t>
-            </w:r>
-          </w:p>
-        </w:tc>
-        <w:tc>
-          <w:tcPr/>
-          <w:p>
-            <w:pPr>
-              <w:pStyle w:val="Compact"/>
-            </w:pPr>
-          </w:p>
-        </w:tc>
-        <w:tc>
-          <w:tcPr/>
-          <w:p>
-            <w:pPr>
-              <w:pStyle w:val="Compact"/>
-            </w:pPr>
-          </w:p>
-        </w:tc>
-      </w:tr>
-      <w:tr>
-        <w:tc>
-          <w:tcPr/>
-          <w:p>
-            <w:pPr>
-              <w:pStyle w:val="Compact"/>
-              <w:jc w:val="left"/>
-            </w:pPr>
-            <w:r>
-              <w:t xml:space="preserve">Caller: Other</w:t>
-            </w:r>
-          </w:p>
-        </w:tc>
-        <w:tc>
-          <w:tcPr/>
-          <w:p>
-            <w:pPr>
-              <w:pStyle w:val="Compact"/>
-              <w:jc w:val="left"/>
-            </w:pPr>
-            <w:r>
-              <w:t xml:space="preserve">1.31 (0.41-4.21)</w:t>
-            </w:r>
-          </w:p>
-        </w:tc>
-        <w:tc>
-          <w:tcPr/>
-          <w:p>
-            <w:pPr>
-              <w:pStyle w:val="Compact"/>
-            </w:pPr>
-          </w:p>
-        </w:tc>
-      </w:tr>
-      <w:tr>
-        <w:tc>
-          <w:tcPr/>
-          <w:p>
-            <w:pPr>
-              <w:pStyle w:val="Compact"/>
-              <w:jc w:val="left"/>
-            </w:pPr>
-            <w:r>
-              <w:t xml:space="preserve">p=0.648</w:t>
-            </w:r>
-          </w:p>
-        </w:tc>
-        <w:tc>
-          <w:tcPr/>
-          <w:p>
-            <w:pPr>
-              <w:pStyle w:val="Compact"/>
-              <w:jc w:val="left"/>
-            </w:pPr>
-            <w:r>
-              <w:t xml:space="preserve">0.66 (0.23-1.87)</w:t>
-            </w:r>
-          </w:p>
-        </w:tc>
-        <w:tc>
-          <w:tcPr/>
-          <w:p>
-            <w:pPr>
-              <w:pStyle w:val="Compact"/>
-            </w:pPr>
-          </w:p>
-        </w:tc>
-      </w:tr>
-      <w:tr>
-        <w:tc>
-          <w:tcPr/>
-          <w:p>
-            <w:pPr>
-              <w:pStyle w:val="Compact"/>
-              <w:jc w:val="left"/>
-            </w:pPr>
-            <w:r>
-              <w:t xml:space="preserve">p=0.436</w:t>
-            </w:r>
-          </w:p>
-        </w:tc>
-        <w:tc>
-          <w:tcPr/>
-          <w:p>
-            <w:pPr>
-              <w:pStyle w:val="Compact"/>
-            </w:pPr>
-          </w:p>
-        </w:tc>
-        <w:tc>
-          <w:tcPr/>
-          <w:p>
-            <w:pPr>
-              <w:pStyle w:val="Compact"/>
-            </w:pPr>
-          </w:p>
-        </w:tc>
-      </w:tr>
-      <w:tr>
-        <w:tc>
-          <w:tcPr/>
-          <w:p>
-            <w:pPr>
-              <w:pStyle w:val="Compact"/>
-              <w:jc w:val="left"/>
-            </w:pPr>
-            <w:r>
               <w:t xml:space="preserve">Caller: Walsh</w:t>
             </w:r>
           </w:p>
@@ -21087,80 +20067,20 @@
               <w:jc w:val="left"/>
             </w:pPr>
             <w:r>
-              <w:t xml:space="preserve">2.32 (1.42-3.80)</w:t>
-            </w:r>
-          </w:p>
-        </w:tc>
-        <w:tc>
-          <w:tcPr/>
-          <w:p>
-            <w:pPr>
-              <w:pStyle w:val="Compact"/>
-            </w:pPr>
-          </w:p>
-        </w:tc>
-      </w:tr>
-      <w:tr>
-        <w:tc>
-          <w:tcPr/>
-          <w:p>
-            <w:pPr>
-              <w:pStyle w:val="Compact"/>
-              <w:jc w:val="left"/>
-            </w:pPr>
-            <w:r>
-              <w:t xml:space="preserve">p=&lt; 0.001</w:t>
-            </w:r>
-          </w:p>
-        </w:tc>
-        <w:tc>
-          <w:tcPr/>
-          <w:p>
-            <w:pPr>
-              <w:pStyle w:val="Compact"/>
-              <w:jc w:val="left"/>
-            </w:pPr>
-            <w:r>
-              <w:t xml:space="preserve">0.89 (0.64-1.23)</w:t>
-            </w:r>
-          </w:p>
-        </w:tc>
-        <w:tc>
-          <w:tcPr/>
-          <w:p>
-            <w:pPr>
-              <w:pStyle w:val="Compact"/>
-            </w:pPr>
-          </w:p>
-        </w:tc>
-      </w:tr>
-      <w:tr>
-        <w:tc>
-          <w:tcPr/>
-          <w:p>
-            <w:pPr>
-              <w:pStyle w:val="Compact"/>
-              <w:jc w:val="left"/>
-            </w:pPr>
-            <w:r>
-              <w:t xml:space="preserve">p=0.465</w:t>
-            </w:r>
-          </w:p>
-        </w:tc>
-        <w:tc>
-          <w:tcPr/>
-          <w:p>
-            <w:pPr>
-              <w:pStyle w:val="Compact"/>
-            </w:pPr>
-          </w:p>
-        </w:tc>
-        <w:tc>
-          <w:tcPr/>
-          <w:p>
-            <w:pPr>
-              <w:pStyle w:val="Compact"/>
-            </w:pPr>
+              <w:t xml:space="preserve">2.32 (1.42-3.80), p=&lt; 0.001</w:t>
+            </w:r>
+          </w:p>
+        </w:tc>
+        <w:tc>
+          <w:tcPr/>
+          <w:p>
+            <w:pPr>
+              <w:pStyle w:val="Compact"/>
+              <w:jc w:val="left"/>
+            </w:pPr>
+            <w:r>
+              <w:t xml:space="preserve">0.89 (0.64-1.23), p=0.465</w:t>
+            </w:r>
           </w:p>
         </w:tc>
       </w:tr>

</xml_diff>

<commit_message>
Polish the AAO-HNS choropleths
Bold title + explanatory subtitle; white-pill region labels legible over any fill;
bottom horizontal colourbar legend with a titled scale (percent / 'N d'); crisper
white state borders; 200 dpi. Applied to both offer-rate and median-wait maps.

Co-Authored-By: Claude Opus 4.8 (1M context) <noreply@anthropic.com>
</commit_message>
<xml_diff>
--- a/manuscript_output/manuscript_mystery_caller.docx
+++ b/manuscript_output/manuscript_mystery_caller.docx
@@ -23352,7 +23352,7 @@
       <w:r>
         <w:drawing>
           <wp:inline>
-            <wp:extent cx="5334000" cy="3333750"/>
+            <wp:extent cx="5334000" cy="3514164"/>
             <wp:effectExtent b="0" l="0" r="0" t="0"/>
             <wp:docPr descr="" title="" id="57" name="Picture"/>
             <a:graphic>
@@ -23373,7 +23373,7 @@
                   <pic:spPr bwMode="auto">
                     <a:xfrm>
                       <a:off x="0" y="0"/>
-                      <a:ext cx="5334000" cy="3333750"/>
+                      <a:ext cx="5334000" cy="3514164"/>
                     </a:xfrm>
                     <a:prstGeom prst="rect">
                       <a:avLst/>
@@ -23411,7 +23411,7 @@
       <w:r>
         <w:drawing>
           <wp:inline>
-            <wp:extent cx="5334000" cy="3333750"/>
+            <wp:extent cx="5334000" cy="3514164"/>
             <wp:effectExtent b="0" l="0" r="0" t="0"/>
             <wp:docPr descr="" title="" id="60" name="Picture"/>
             <a:graphic>
@@ -23432,7 +23432,7 @@
                   <pic:spPr bwMode="auto">
                     <a:xfrm>
                       <a:off x="0" y="0"/>
-                      <a:ext cx="5334000" cy="3333750"/>
+                      <a:ext cx="5334000" cy="3514164"/>
                     </a:xfrm>
                     <a:prstGeom prst="rect">
                       <a:avLst/>

</xml_diff>

<commit_message>
Polish figS2/figS7; remove em dashes from manuscript prose
- Figure S2 (wait distribution): rebuilt with independent y-axes so every
  subspecialty's shape is visible (a shared scale flattened all but general),
  spelled-out labels, panels ordered by median wait, per-facet median line, and
  a clean minimal theme.
- Figure S7 (access cascade): viridis-graded bars over faint funnel tracks, bold
  value labels, title/subtitle, percent axis, 200 dpi.
- Replaced all 39 em dashes (U+2014) in the manuscript prose with commas
  (en dashes for page ranges / journal name preserved).

Co-Authored-By: Claude Opus 4.8 (1M context) <noreply@anthropic.com>
</commit_message>
<xml_diff>
--- a/manuscript_output/manuscript_mystery_caller.docx
+++ b/manuscript_output/manuscript_mystery_caller.docx
@@ -15,7 +15,7 @@
         <w:pStyle w:val="Author"/>
       </w:pPr>
       <w:r>
-        <w:t xml:space="preserve">Grace E. Falk; Eric J. Dobratz, MD; [RA co-authors — full names &amp; degrees to confirm: Chin, Deol, Gregg, Kim, Roesch, Walsh]; Tyler M. Muffly, MD; Cristina Cabrera-Muffly, MD</w:t>
+        <w:t xml:space="preserve">Grace E. Falk; Eric J. Dobratz, MD; [RA co-authors, full names &amp; degrees to confirm: Chin, Deol, Gregg, Kim, Roesch, Walsh]; Tyler M. Muffly, MD; Cristina Cabrera-Muffly, MD</w:t>
       </w:r>
     </w:p>
     <w:p>
@@ -118,7 +118,7 @@
         <w:t xml:space="preserve"> </w:t>
       </w:r>
       <w:r>
-        <w:t xml:space="preserve">Of 960 calls, 731 complete calls with a known subspecialty were analyzed; an appointment was offered in 436 (59.6%), with a median wait of 14 business days (IQR 5–30). Requested subspecialty was the dominant determinant: pediatric otolaryngology had higher odds of an offer (OR 2.29 (95% CI 1.09–4.80; p = 0.028)), and waits were longer for laryngology (IRR 2.24 (95% CI 1.13–4.41; p = 0.020)) and pediatric otolaryngology (IRR 1.62 (95% CI 1.11–2.38; p = 0.013)). No geographic covariate—supply, Medicaid fee generosity, social vulnerability, dual-eligibility, or rurality—was associated with either outcome.</w:t>
+        <w:t xml:space="preserve">Of 960 calls, 731 complete calls with a known subspecialty were analyzed; an appointment was offered in 436 (59.6%), with a median wait of 14 business days (IQR 5–30). Requested subspecialty was the dominant determinant: pediatric otolaryngology had higher odds of an offer (OR 2.29 (95% CI 1.09–4.80; p = 0.028)), and waits were longer for laryngology (IRR 2.24 (95% CI 1.13–4.41; p = 0.020)) and pediatric otolaryngology (IRR 1.62 (95% CI 1.11–2.38; p = 0.013)). No geographic covariate, supply, Medicaid fee generosity, social vulnerability, dual-eligibility, or rurality, was associated with either outcome.</w:t>
       </w:r>
     </w:p>
     <w:p>
@@ -231,7 +231,7 @@
           <w:i/>
           <w:iCs/>
         </w:rPr>
-        <w:t xml:space="preserve">[Research-assistant co-authors — affiliations to confirm.]</w:t>
+        <w:t xml:space="preserve">[Research-assistant co-authors, affiliations to confirm.]</w:t>
       </w:r>
       <w:r>
         <w:t xml:space="preserve"> </w:t>
@@ -284,7 +284,7 @@
         <w:pStyle w:val="FirstParagraph"/>
       </w:pPr>
       <w:r>
-        <w:t xml:space="preserve">Otolaryngologic conditions—from chronic rhinosinusitis and otitis media to airway disorders and head-and-neck malignancy—are among the most common reasons patients seek specialty care, and for many of these conditions timely evaluation influences diagnosis and outcome, with delays in the diagnosis-to-treatment interval associated with worse survival in head-and-neck cancer</w:t>
+        <w:t xml:space="preserve">Otolaryngologic conditions, from chronic rhinosinusitis and otitis media to airway disorders and head-and-neck malignancy, are among the most common reasons patients seek specialty care, and for many of these conditions timely evaluation influences diagnosis and outcome, with delays in the diagnosis-to-treatment interval associated with worse survival in head-and-neck cancer</w:t>
       </w:r>
       <w:hyperlink w:anchor="ref-graboyes2019">
         <w:r>
@@ -317,7 +317,7 @@
         <w:t xml:space="preserve">availability</w:t>
       </w:r>
       <w:r>
-        <w:t xml:space="preserve">—whether a new-patient appointment is offered at all—and</w:t>
+        <w:t xml:space="preserve">, whether a new-patient appointment is offered at all, and</w:t>
       </w:r>
       <w:r>
         <w:t xml:space="preserve"> </w:t>
@@ -330,7 +330,7 @@
         <w:t xml:space="preserve">timeliness</w:t>
       </w:r>
       <w:r>
-        <w:t xml:space="preserve">—how quickly the patient is seen. These dimensions can move independently: an office that readily books new patients may nonetheless carry a long queue, and measuring only one can mislead. Administrative and survey data capture both imperfectly, reflecting patients who have already navigated the system and remaining subject to recall and reporting bias.</w:t>
+        <w:t xml:space="preserve">, how quickly the patient is seen. These dimensions can move independently: an office that readily books new patients may nonetheless carry a long queue, and measuring only one can mislead. Administrative and survey data capture both imperfectly, reflecting patients who have already navigated the system and remaining subject to recall and reporting bias.</w:t>
       </w:r>
     </w:p>
     <w:p>
@@ -372,7 +372,7 @@
         <w:t xml:space="preserve"> </w:t>
       </w:r>
       <w:r>
-        <w:t xml:space="preserve">nature of the request—the requested subspecialty (general otolaryngology versus pediatric otolaryngology, laryngology, head-and-neck oncology, and others)—and the</w:t>
+        <w:t xml:space="preserve">nature of the request, the requested subspecialty (general otolaryngology versus pediatric otolaryngology, laryngology, head-and-neck oncology, and others), and the</w:t>
       </w:r>
       <w:r>
         <w:t xml:space="preserve"> </w:t>
@@ -388,7 +388,7 @@
         <w:t xml:space="preserve"> </w:t>
       </w:r>
       <w:r>
-        <w:t xml:space="preserve">environment of the practice—local physician supply, the generosity of the state Medicaid fee schedule, community social vulnerability, the share of dual-eligible beneficiaries, and rurality</w:t>
+        <w:t xml:space="preserve">environment of the practice, local physician supply, the generosity of the state Medicaid fee schedule, community social vulnerability, the share of dual-eligible beneficiaries, and rurality</w:t>
       </w:r>
       <w:hyperlink w:anchor="ref-vickery2016">
         <w:r>
@@ -479,7 +479,7 @@
         <w:t xml:space="preserve"> </w:t>
       </w:r>
       <w:r>
-        <w:t xml:space="preserve">The Human Subjects Protection Program at Old Dominion University (Macon &amp; Joan Brock Virginia Health Sciences / Eastern Virginia Medical School) determined that this project (IRB #24-12-NH-0285) does not involve human subjects research and is therefore not subject to IRB review; informed consent was not required. The covert measurement of clinician behavior has been debated—most publicly when a 2011 federally commissioned</w:t>
+        <w:t xml:space="preserve">The Human Subjects Protection Program at Old Dominion University (Macon &amp; Joan Brock Virginia Health Sciences / Eastern Virginia Medical School) determined that this project (IRB #24-12-NH-0285) does not involve human subjects research and is therefore not subject to IRB review; informed consent was not required. The covert measurement of clinician behavior has been debated, most publicly when a 2011 federally commissioned</w:t>
       </w:r>
       <w:r>
         <w:t xml:space="preserve"> </w:t>
@@ -518,7 +518,7 @@
         </w:r>
       </w:hyperlink>
       <w:r>
-        <w:t xml:space="preserve">—but a formal ethical analysis has since established that simulated-patient research without prior consent is justified when risks and burdens are minimal, a consent waiver is necessary for scientifically valid data, and the study carries substantial social value</w:t>
+        <w:t xml:space="preserve">, but a formal ethical analysis has since established that simulated-patient research without prior consent is justified when risks and burdens are minimal, a consent waiver is necessary for scientifically valid data, and the study carries substantial social value</w:t>
       </w:r>
       <w:hyperlink w:anchor="ref-rhodesmiller2012">
         <w:r>
@@ -530,7 +530,7 @@
         </w:r>
       </w:hyperlink>
       <w:r>
-        <w:t xml:space="preserve">. This study was designed to satisfy those conditions. Consistent with established simulated-patient practice, the covert design incorporated several safeguards: no protected health information was collected and no calls were recorded; each contact was a single brief call that booked no real appointment and imposed minimal burden on office staff; and identifying information about individual staff members was neither requested nor stored. Covert simulated calling was necessary because non-covert methods—for example, surveys of offices aware of being observed—would systematically bias access estimates through social desirability, the same rationale that underlies the design’s measurement validity</w:t>
+        <w:t xml:space="preserve">. This study was designed to satisfy those conditions. Consistent with established simulated-patient practice, the covert design incorporated several safeguards: no protected health information was collected and no calls were recorded; each contact was a single brief call that booked no real appointment and imposed minimal burden on office staff; and identifying information about individual staff members was neither requested nor stored. Covert simulated calling was necessary because non-covert methods, for example, surveys of offices aware of being observed, would systematically bias access estimates through social desirability, the same rationale that underlies the design’s measurement validity</w:t>
       </w:r>
       <w:hyperlink w:anchor="ref-rankin2022">
         <w:r>
@@ -8307,7 +8307,7 @@
         <w:pStyle w:val="FirstParagraph"/>
       </w:pPr>
       <w:r>
-        <w:t xml:space="preserve">Among offering offices, waits again varied by subspecialty and not geography. Relative to general otolaryngology, waits were longer for laryngology (IRR 2.24 (95% CI 1.13–4.41; p = 0.020)) and pediatric otolaryngology (IRR 1.62 (95% CI 1.11–2.38; p = 0.013)). Anchored to the roughly two-week median wait for general otolaryngology (14 business days), these rate ratios correspond to a substantially longer typical wait—on the order of an additional two to three weeks for laryngology and about one to one-and-a-half weeks for pediatric otolaryngology—consistent with the observed subspecialty medians (Table S3). No geographic covariate was associated with wait time (</w:t>
+        <w:t xml:space="preserve">Among offering offices, waits again varied by subspecialty and not geography. Relative to general otolaryngology, waits were longer for laryngology (IRR 2.24 (95% CI 1.13–4.41; p = 0.020)) and pediatric otolaryngology (IRR 1.62 (95% CI 1.11–2.38; p = 0.013)). Anchored to the roughly two-week median wait for general otolaryngology (14 business days), these rate ratios correspond to a substantially longer typical wait, on the order of an additional two to three weeks for laryngology and about one to one-and-a-half weeks for pediatric otolaryngology, consistent with the observed subspecialty medians (Table S3). No geographic covariate was associated with wait time (</w:t>
       </w:r>
       <w:r>
         <w:rPr>
@@ -12788,7 +12788,7 @@
         <w:t xml:space="preserve">with the specific board-certified otolaryngologist requested</w:t>
       </w:r>
       <w:r>
-        <w:t xml:space="preserve">: among the 436 offers, 58 (13%) were with a different physician and 9 with an advanced practice provider only. Two front-desk barriers stood out: 25 practices stated they do not see the presented complaint despite the sampled physician’s matched subspecialty, and among practices not accepting new patients the most common documented reasons were that the physician had retired or left (81) or an unspecified closure (104)—a signal that provider directories overstate the reachable workforce.</w:t>
+        <w:t xml:space="preserve">: among the 436 offers, 58 (13%) were with a different physician and 9 with an advanced practice provider only. Two front-desk barriers stood out: 25 practices stated they do not see the presented complaint despite the sampled physician’s matched subspecialty, and among practices not accepting new patients the most common documented reasons were that the physician had retired or left (81) or an unspecified closure (104), a signal that provider directories overstate the reachable workforce.</w:t>
       </w:r>
     </w:p>
     <w:bookmarkEnd w:id="31"/>
@@ -12816,7 +12816,7 @@
         <w:t xml:space="preserve">Table S8</w:t>
       </w:r>
       <w:r>
-        <w:t xml:space="preserve">). Under a three-level rurality specification (urban, RUCA 1–3; suburban, 4–6; rural, 7–10), no urban-to-rural gradient emerged—neither suburban (wait IRR 1.15) nor the sparse rural stratum (IRR 1.29) differed significantly from urban—while the subspecialty effects were unchanged. A complete-case analysis without imputation (n = 412 recorded waits) likewise reproduced the longer waits for laryngology (IRR 2.51) and pediatric otolaryngology (IRR 1.52) and the null rural–urban contrast (IRR 1.14).</w:t>
+        <w:t xml:space="preserve">). Under a three-level rurality specification (urban, RUCA 1–3; suburban, 4–6; rural, 7–10), no urban-to-rural gradient emerged, neither suburban (wait IRR 1.15) nor the sparse rural stratum (IRR 1.29) differed significantly from urban, while the subspecialty effects were unchanged. A complete-case analysis without imputation (n = 412 recorded waits) likewise reproduced the longer waits for laryngology (IRR 2.51) and pediatric otolaryngology (IRR 1.52) and the null rural–urban contrast (IRR 1.14).</w:t>
       </w:r>
     </w:p>
     <w:bookmarkEnd w:id="32"/>
@@ -12835,7 +12835,7 @@
         <w:pStyle w:val="FirstParagraph"/>
       </w:pPr>
       <w:r>
-        <w:t xml:space="preserve">In this national simulated-patient study of otolaryngology access, the requested subspecialty was the dominant determinant of both whether a new-patient appointment was offered and how long the patient waited, whereas none of the measured contextual factors—county physician supply, Medicaid fee generosity, social vulnerability, dual-eligibility, or rurality—was associated with either outcome.</w:t>
+        <w:t xml:space="preserve">In this national simulated-patient study of otolaryngology access, the requested subspecialty was the dominant determinant of both whether a new-patient appointment was offered and how long the patient waited, whereas none of the measured contextual factors, county physician supply, Medicaid fee generosity, social vulnerability, dual-eligibility, or rurality, was associated with either outcome.</w:t>
       </w:r>
     </w:p>
     <w:p>
@@ -12859,7 +12859,7 @@
         <w:t xml:space="preserve"> </w:t>
       </w:r>
       <w:r>
-        <w:t xml:space="preserve">After adjustment, subspecialty effects were substantial—pediatric otolaryngology carried more than twice the odds of an appointment offer—while the contextual covariates clustered tightly around the null. This suggests that, among the practices reachable in this sample, the decision to accept a new patient is governed more by practice-level factors tied to the clinical request than by the socioeconomic or supply characteristics of the surrounding area. This parallels an emerging pattern in other access studies, in which disparities track the</w:t>
+        <w:t xml:space="preserve">After adjustment, subspecialty effects were substantial, pediatric otolaryngology carried more than twice the odds of an appointment offer, while the contextual covariates clustered tightly around the null. This suggests that, among the practices reachable in this sample, the decision to accept a new patient is governed more by practice-level factors tied to the clinical request than by the socioeconomic or supply characteristics of the surrounding area. This parallels an emerging pattern in other access studies, in which disparities track the</w:t>
       </w:r>
       <w:r>
         <w:t xml:space="preserve"> </w:t>
@@ -12967,7 +12967,7 @@
         <w:t xml:space="preserve"> </w:t>
       </w:r>
       <w:r>
-        <w:t xml:space="preserve">They argue against a simple supply-gradient model in which access improves smoothly with local otolaryngologist density or payer generosity. Several explanations are compatible with this pattern: practices may operate similarly across diverse local contexts; the relevant barriers may act at the level of the individual practice—scheduling policy, subspecialty scope—rather than the community; or the study may be underpowered for modest contextual gradients, particularly in the sparse rural stratum. Distinguishing the</w:t>
+        <w:t xml:space="preserve">They argue against a simple supply-gradient model in which access improves smoothly with local otolaryngologist density or payer generosity. Several explanations are compatible with this pattern: practices may operate similarly across diverse local contexts; the relevant barriers may act at the level of the individual practice, scheduling policy, subspecialty scope, rather than the community; or the study may be underpowered for modest contextual gradients, particularly in the sparse rural stratum. Distinguishing the</w:t>
       </w:r>
       <w:r>
         <w:t xml:space="preserve"> </w:t>
@@ -12999,7 +12999,7 @@
         <w:t xml:space="preserve"> </w:t>
       </w:r>
       <w:r>
-        <w:t xml:space="preserve">of care—the travel burden a patient must overcome to arrive at a practice at all—is the subject of a companion geospatial analysis.</w:t>
+        <w:t xml:space="preserve">of care, the travel burden a patient must overcome to arrive at a practice at all, is the subject of a companion geospatial analysis.</w:t>
       </w:r>
     </w:p>
     <w:p>
@@ -13007,7 +13007,7 @@
         <w:pStyle w:val="BodyText"/>
       </w:pPr>
       <w:r>
-        <w:t xml:space="preserve">These findings carry practical implications. Subspecialty-specific bottlenecks—prolonged waits for laryngology and pediatric otolaryngology—are concrete targets for referral triage, capacity planning, and telehealth, independent of where the patient lives. That contextual factors did not predict access is reassuring against one form of disparity but does not exclude others not measured here, including patient insurance type, which this phase did not vary.</w:t>
+        <w:t xml:space="preserve">These findings carry practical implications. Subspecialty-specific bottlenecks, prolonged waits for laryngology and pediatric otolaryngology, are concrete targets for referral triage, capacity planning, and telehealth, independent of where the patient lives. That contextual factors did not predict access is reassuring against one form of disparity but does not exclude others not measured here, including patient insurance type, which this phase did not vary.</w:t>
       </w:r>
     </w:p>
     <w:p>
@@ -13037,7 +13037,7 @@
         </w:r>
       </w:hyperlink>
       <w:r>
-        <w:t xml:space="preserve">. The realized sample achieved the pre-specified, near-optimal urban/rural balance (approximately 50/50 under the RUCA 1–3 vs 4–10 dichotomy) and exceeded the planned call budget. One appointment with an implausible date—a wait exceeding two years attributable to a data-entry error in the appointment year—was excluded from the timeliness analysis. Even so, the study was modestly underpowered for its primary rural-versus-urban timeliness contrast: the pre-specified target was a minimum detectable gap of about six business days, whereas the realized sample (426 recorded waits, reflecting an appointment-offer rate near three-fifths) supports detection of roughly a ten-day gap at 90% power and provides about 70% power for the originally anticipated eight-day gap. Reaching the six-day target would require on the order of 130 additional calls (approximately 1,090 total) at 80% power, or 490 additional calls (approximately 1,450 total) at 90% power. The observed rural–urban difference was small (about two business days) and non-significant. Each physician was contacted once, precluding within-physician inference; each call captured the response of a single office representative, whose account may not reflect the practice’s full scheduling behavior; contextual covariates were linked at the ZIP-code or county level and thus approximate a practice’s true environment; patient insurance was held constant (not varied) in this phase; and appointment availability reflects a single point in time.</w:t>
+        <w:t xml:space="preserve">. The realized sample achieved the pre-specified, near-optimal urban/rural balance (approximately 50/50 under the RUCA 1–3 vs 4–10 dichotomy) and exceeded the planned call budget. One appointment with an implausible date, a wait exceeding two years attributable to a data-entry error in the appointment year, was excluded from the timeliness analysis. Even so, the study was modestly underpowered for its primary rural-versus-urban timeliness contrast: the pre-specified target was a minimum detectable gap of about six business days, whereas the realized sample (426 recorded waits, reflecting an appointment-offer rate near three-fifths) supports detection of roughly a ten-day gap at 90% power and provides about 70% power for the originally anticipated eight-day gap. Reaching the six-day target would require on the order of 130 additional calls (approximately 1,090 total) at 80% power, or 490 additional calls (approximately 1,450 total) at 90% power. The observed rural–urban difference was small (about two business days) and non-significant. Each physician was contacted once, precluding within-physician inference; each call captured the response of a single office representative, whose account may not reflect the practice’s full scheduling behavior; contextual covariates were linked at the ZIP-code or county level and thus approximate a practice’s true environment; patient insurance was held constant (not varied) in this phase; and appointment availability reflects a single point in time.</w:t>
       </w:r>
     </w:p>
     <w:p>
@@ -13079,7 +13079,7 @@
         </w:r>
       </w:hyperlink>
       <w:r>
-        <w:t xml:space="preserve">. Third, our secondary measures hint at an information-quality dimension we did not fully model—whether front-desk statements (that a practice does not see a complaint, or that a physician is unavailable) are accurate—which simulated-patient studies increasingly treat as a distinct outcome,</w:t>
+        <w:t xml:space="preserve">. Third, our secondary measures hint at an information-quality dimension we did not fully model, whether front-desk statements (that a practice does not see a complaint, or that a physician is unavailable) are accurate, which simulated-patient studies increasingly treat as a distinct outcome,</w:t>
       </w:r>
       <w:r>
         <w:t xml:space="preserve"> </w:t>
@@ -13121,7 +13121,7 @@
         <w:t xml:space="preserve"> </w:t>
       </w:r>
       <w:r>
-        <w:t xml:space="preserve">responses in our data suggests provider directories materially overstate the reachable workforce. Finally, whether schedulers appropriately triage clinically urgent presentations—head-and-neck cancer red flags, for instance—is an access-quality axis beyond the offer and wait we measured</w:t>
+        <w:t xml:space="preserve">responses in our data suggests provider directories materially overstate the reachable workforce. Finally, whether schedulers appropriately triage clinically urgent presentations, head-and-neck cancer red flags, for instance, is an access-quality axis beyond the offer and wait we measured</w:t>
       </w:r>
       <w:hyperlink w:anchor="ref-moriarty2003">
         <w:r>
@@ -23234,7 +23234,7 @@
       <w:r>
         <w:drawing>
           <wp:inline>
-            <wp:extent cx="5334000" cy="3333750"/>
+            <wp:extent cx="5334000" cy="3556000"/>
             <wp:effectExtent b="0" l="0" r="0" t="0"/>
             <wp:docPr descr="" title="" id="51" name="Picture"/>
             <a:graphic>
@@ -23255,7 +23255,7 @@
                   <pic:spPr bwMode="auto">
                     <a:xfrm>
                       <a:off x="0" y="0"/>
-                      <a:ext cx="5334000" cy="3333750"/>
+                      <a:ext cx="5334000" cy="3556000"/>
                     </a:xfrm>
                     <a:prstGeom prst="rect">
                       <a:avLst/>
@@ -23529,7 +23529,7 @@
       <w:r>
         <w:drawing>
           <wp:inline>
-            <wp:extent cx="5334000" cy="2259105"/>
+            <wp:extent cx="5334000" cy="2418906"/>
             <wp:effectExtent b="0" l="0" r="0" t="0"/>
             <wp:docPr descr="" title="" id="66" name="Picture"/>
             <a:graphic>
@@ -23550,7 +23550,7 @@
                   <pic:spPr bwMode="auto">
                     <a:xfrm>
                       <a:off x="0" y="0"/>
-                      <a:ext cx="5334000" cy="2259105"/>
+                      <a:ext cx="5334000" cy="2418906"/>
                     </a:xfrm>
                     <a:prstGeom prst="rect">
                       <a:avLst/>
@@ -23688,7 +23688,10 @@
         <w:t xml:space="preserve"> </w:t>
       </w:r>
       <w:r>
-        <w:t xml:space="preserve">The caller delivered the selected script (Table S9). If asked for identifying details, the caller gave a standardized identity—</w:t>
+        <w:t xml:space="preserve">The caller delivered the selected script (Table S9). If asked for identifying details, the caller gave a standardized identity,</w:t>
+      </w:r>
+      <w:r>
+        <w:t xml:space="preserve"> </w:t>
       </w:r>
       <w:r>
         <w:t xml:space="preserve">“John”</w:t>
@@ -23741,7 +23744,7 @@
           <w:i/>
           <w:iCs/>
         </w:rPr>
-        <w:t xml:space="preserve">[Not specified in the script draft: the number and timing of call attempts before an office was recorded as unreachable—to confirm from the protocol.]</w:t>
+        <w:t xml:space="preserve">[Not specified in the script draft: the number and timing of call attempts before an office was recorded as unreachable, to confirm from the protocol.]</w:t>
       </w:r>
     </w:p>
     <w:p>

</xml_diff>

<commit_message>
Render supplementary tables in landscape (Word)
Wrap the Supplementary Tables section in a Word landscape section via raw
OpenXML section breaks (portrait break before, landscape break after), so the
wide multi-column tables (S8, S11, S12c, S13, S14b) no longer split headers and
numbers across lines. DOCX-only: pandoc drops the {=openxml} blocks for HTML,
which already scrolls tables horizontally. Figures and the call-script appendix
remain portrait.

Co-Authored-By: Claude Opus 4.8 (1M context) <noreply@anthropic.com>
</commit_message>
<xml_diff>
--- a/manuscript_output/manuscript_mystery_caller.docx
+++ b/manuscript_output/manuscript_mystery_caller.docx
@@ -13848,6 +13848,14 @@
         <w:t xml:space="preserve">Supplementary Material</w:t>
       </w:r>
     </w:p>
+    <w:p>
+      <w:pPr>
+        <w:sectPr>
+          <w:pgSz w:w="12240" w:h="15840"/>
+          <w:pgMar w:top="1440" w:bottom="1440" w:left="1440" w:right="1440" w:header="720" w:footer="720" w:gutter="0"/>
+        </w:sectPr>
+      </w:pPr>
+    </w:p>
     <w:bookmarkStart w:id="46" w:name="supplementary-tables"/>
     <w:p>
       <w:pPr>
@@ -13855,6 +13863,18 @@
       </w:pPr>
       <w:r>
         <w:t xml:space="preserve">Supplementary Tables</w:t>
+      </w:r>
+    </w:p>
+    <w:p>
+      <w:pPr>
+        <w:pStyle w:val="FirstParagraph"/>
+      </w:pPr>
+      <w:r>
+        <w:rPr>
+          <w:i/>
+          <w:iCs/>
+        </w:rPr>
+        <w:t xml:space="preserve">Supplementary tables are presented in landscape orientation for legibility.</w:t>
       </w:r>
     </w:p>
     <w:p>
@@ -28702,6 +28722,14 @@
         </w:tc>
       </w:tr>
     </w:tbl>
+    <w:p>
+      <w:pPr>
+        <w:sectPr>
+          <w:pgSz w:w="15840" w:h="12240" w:orient="landscape"/>
+          <w:pgMar w:top="1440" w:bottom="1440" w:left="1440" w:right="1440" w:header="720" w:footer="720" w:gutter="0"/>
+        </w:sectPr>
+      </w:pPr>
+    </w:p>
     <w:bookmarkEnd w:id="46"/>
     <w:bookmarkStart w:id="68" w:name="supplementary-figures"/>
     <w:p>

</xml_diff>